<commit_message>
Update TOC and List of Figures formatting to match official SRM university layout for SAM and Saraswathi
</commit_message>
<xml_diff>
--- a/Enterprise_IT_Service_Portal_Individual_Report_SAM.docx
+++ b/Enterprise_IT_Service_Portal_Individual_Report_SAM.docx
@@ -565,6 +565,14 @@
         <w:jc w:val="center"/>
         <w:tblLayout w:type="fixed"/>
         <w:tblLook w:firstColumn="1" w:firstRow="1" w:lastColumn="0" w:lastRow="0" w:noHBand="0" w:noVBand="1" w:val="04A0"/>
+        <w:tblBorders>
+          <w:top w:val="single" w:sz="8" w:space="0" w:color="000000"/>
+          <w:left w:val="single" w:sz="8" w:space="0" w:color="000000"/>
+          <w:bottom w:val="single" w:sz="8" w:space="0" w:color="000000"/>
+          <w:right w:val="single" w:sz="8" w:space="0" w:color="000000"/>
+          <w:insideH w:val="single" w:sz="4" w:space="0" w:color="000000"/>
+          <w:insideV w:val="single" w:sz="4" w:space="0" w:color="000000"/>
+        </w:tblBorders>
       </w:tblPr>
       <w:tblGrid>
         <w:gridCol w:w="3120"/>
@@ -574,24 +582,30 @@
       <w:tr>
         <w:tc>
           <w:tcPr>
-            <w:tcW w:type="dxa" w:w="3120"/>
-            <w:shd w:fill="E0E0E0"/>
+            <w:tcW w:type="dxa" w:w="1728"/>
           </w:tcPr>
           <w:p>
+            <w:pPr>
+              <w:jc w:val="center"/>
+            </w:pPr>
             <w:r>
               <w:rPr>
                 <w:b/>
               </w:rPr>
-              <w:t>CHAPTER NO.</w:t>
+              <w:t>CHAPTER</w:t>
+              <w:br/>
+              <w:t>NO.</w:t>
             </w:r>
           </w:p>
         </w:tc>
         <w:tc>
           <w:tcPr>
-            <w:tcW w:type="dxa" w:w="3120"/>
-            <w:shd w:fill="E0E0E0"/>
+            <w:tcW w:type="dxa" w:w="6192"/>
           </w:tcPr>
           <w:p>
+            <w:pPr>
+              <w:jc w:val="center"/>
+            </w:pPr>
             <w:r>
               <w:rPr>
                 <w:b/>
@@ -602,15 +616,19 @@
         </w:tc>
         <w:tc>
           <w:tcPr>
-            <w:tcW w:type="dxa" w:w="3120"/>
-            <w:shd w:fill="E0E0E0"/>
+            <w:tcW w:type="dxa" w:w="1440"/>
           </w:tcPr>
           <w:p>
+            <w:pPr>
+              <w:jc w:val="center"/>
+            </w:pPr>
             <w:r>
               <w:rPr>
                 <w:b/>
               </w:rPr>
-              <w:t>PAGE NO.</w:t>
+              <w:t>PAGE</w:t>
+              <w:br/>
+              <w:t>NO.</w:t>
             </w:r>
           </w:p>
         </w:tc>
@@ -618,24 +636,22 @@
       <w:tr>
         <w:tc>
           <w:tcPr>
-            <w:tcW w:type="dxa" w:w="3120"/>
+            <w:tcW w:type="dxa" w:w="1728"/>
+          </w:tcPr>
+          <w:p>
+            <w:r/>
+          </w:p>
+        </w:tc>
+        <w:tc>
+          <w:tcPr>
+            <w:tcW w:type="dxa" w:w="6192"/>
           </w:tcPr>
           <w:p>
             <w:r>
               <w:rPr>
-                <w:b w:val="0"/>
-              </w:rPr>
-            </w:r>
-          </w:p>
-        </w:tc>
-        <w:tc>
-          <w:tcPr>
-            <w:tcW w:type="dxa" w:w="3120"/>
-          </w:tcPr>
-          <w:p>
-            <w:r>
-              <w:rPr>
-                <w:b w:val="0"/>
+                <w:rFonts w:ascii="Times New Roman" w:hAnsi="Times New Roman"/>
+                <w:b/>
+                <w:sz w:val="22"/>
               </w:rPr>
               <w:t>ACKNOWLEDGEMENT</w:t>
             </w:r>
@@ -643,15 +659,16 @@
         </w:tc>
         <w:tc>
           <w:tcPr>
-            <w:tcW w:type="dxa" w:w="3120"/>
+            <w:tcW w:type="dxa" w:w="1440"/>
           </w:tcPr>
           <w:p>
             <w:pPr>
-              <w:jc w:val="right"/>
+              <w:jc w:val="center"/>
             </w:pPr>
             <w:r>
               <w:rPr>
-                <w:b w:val="0"/>
+                <w:rFonts w:ascii="Times New Roman" w:hAnsi="Times New Roman"/>
+                <w:sz w:val="22"/>
               </w:rPr>
               <w:t>iii</w:t>
             </w:r>
@@ -661,24 +678,22 @@
       <w:tr>
         <w:tc>
           <w:tcPr>
-            <w:tcW w:type="dxa" w:w="3120"/>
+            <w:tcW w:type="dxa" w:w="1728"/>
+          </w:tcPr>
+          <w:p>
+            <w:r/>
+          </w:p>
+        </w:tc>
+        <w:tc>
+          <w:tcPr>
+            <w:tcW w:type="dxa" w:w="6192"/>
           </w:tcPr>
           <w:p>
             <w:r>
               <w:rPr>
-                <w:b w:val="0"/>
-              </w:rPr>
-            </w:r>
-          </w:p>
-        </w:tc>
-        <w:tc>
-          <w:tcPr>
-            <w:tcW w:type="dxa" w:w="3120"/>
-          </w:tcPr>
-          <w:p>
-            <w:r>
-              <w:rPr>
-                <w:b w:val="0"/>
+                <w:rFonts w:ascii="Times New Roman" w:hAnsi="Times New Roman"/>
+                <w:b/>
+                <w:sz w:val="22"/>
               </w:rPr>
               <w:t>ABSTRACT</w:t>
             </w:r>
@@ -686,15 +701,16 @@
         </w:tc>
         <w:tc>
           <w:tcPr>
-            <w:tcW w:type="dxa" w:w="3120"/>
+            <w:tcW w:type="dxa" w:w="1440"/>
           </w:tcPr>
           <w:p>
             <w:pPr>
-              <w:jc w:val="right"/>
+              <w:jc w:val="center"/>
             </w:pPr>
             <w:r>
               <w:rPr>
-                <w:b w:val="0"/>
+                <w:rFonts w:ascii="Times New Roman" w:hAnsi="Times New Roman"/>
+                <w:sz w:val="22"/>
               </w:rPr>
               <w:t>iv</w:t>
             </w:r>
@@ -704,24 +720,22 @@
       <w:tr>
         <w:tc>
           <w:tcPr>
-            <w:tcW w:type="dxa" w:w="3120"/>
+            <w:tcW w:type="dxa" w:w="1728"/>
+          </w:tcPr>
+          <w:p>
+            <w:r/>
+          </w:p>
+        </w:tc>
+        <w:tc>
+          <w:tcPr>
+            <w:tcW w:type="dxa" w:w="6192"/>
           </w:tcPr>
           <w:p>
             <w:r>
               <w:rPr>
-                <w:b w:val="0"/>
-              </w:rPr>
-            </w:r>
-          </w:p>
-        </w:tc>
-        <w:tc>
-          <w:tcPr>
-            <w:tcW w:type="dxa" w:w="3120"/>
-          </w:tcPr>
-          <w:p>
-            <w:r>
-              <w:rPr>
-                <w:b w:val="0"/>
+                <w:rFonts w:ascii="Times New Roman" w:hAnsi="Times New Roman"/>
+                <w:b/>
+                <w:sz w:val="22"/>
               </w:rPr>
               <w:t>TABLE OF CONTENTS</w:t>
             </w:r>
@@ -729,15 +743,16 @@
         </w:tc>
         <w:tc>
           <w:tcPr>
-            <w:tcW w:type="dxa" w:w="3120"/>
+            <w:tcW w:type="dxa" w:w="1440"/>
           </w:tcPr>
           <w:p>
             <w:pPr>
-              <w:jc w:val="right"/>
+              <w:jc w:val="center"/>
             </w:pPr>
             <w:r>
               <w:rPr>
-                <w:b w:val="0"/>
+                <w:rFonts w:ascii="Times New Roman" w:hAnsi="Times New Roman"/>
+                <w:sz w:val="22"/>
               </w:rPr>
               <w:t>v</w:t>
             </w:r>
@@ -747,24 +762,22 @@
       <w:tr>
         <w:tc>
           <w:tcPr>
-            <w:tcW w:type="dxa" w:w="3120"/>
+            <w:tcW w:type="dxa" w:w="1728"/>
+          </w:tcPr>
+          <w:p>
+            <w:r/>
+          </w:p>
+        </w:tc>
+        <w:tc>
+          <w:tcPr>
+            <w:tcW w:type="dxa" w:w="6192"/>
           </w:tcPr>
           <w:p>
             <w:r>
               <w:rPr>
-                <w:b w:val="0"/>
-              </w:rPr>
-            </w:r>
-          </w:p>
-        </w:tc>
-        <w:tc>
-          <w:tcPr>
-            <w:tcW w:type="dxa" w:w="3120"/>
-          </w:tcPr>
-          <w:p>
-            <w:r>
-              <w:rPr>
-                <w:b w:val="0"/>
+                <w:rFonts w:ascii="Times New Roman" w:hAnsi="Times New Roman"/>
+                <w:b/>
+                <w:sz w:val="22"/>
               </w:rPr>
               <w:t>LIST OF FIGURES</w:t>
             </w:r>
@@ -772,15 +785,16 @@
         </w:tc>
         <w:tc>
           <w:tcPr>
-            <w:tcW w:type="dxa" w:w="3120"/>
+            <w:tcW w:type="dxa" w:w="1440"/>
           </w:tcPr>
           <w:p>
             <w:pPr>
-              <w:jc w:val="right"/>
+              <w:jc w:val="center"/>
             </w:pPr>
             <w:r>
               <w:rPr>
-                <w:b w:val="0"/>
+                <w:rFonts w:ascii="Times New Roman" w:hAnsi="Times New Roman"/>
+                <w:sz w:val="22"/>
               </w:rPr>
               <w:t>vi</w:t>
             </w:r>
@@ -790,12 +804,17 @@
       <w:tr>
         <w:tc>
           <w:tcPr>
-            <w:tcW w:type="dxa" w:w="3120"/>
+            <w:tcW w:type="dxa" w:w="1728"/>
           </w:tcPr>
           <w:p>
+            <w:pPr>
+              <w:jc w:val="center"/>
+            </w:pPr>
             <w:r>
               <w:rPr>
+                <w:rFonts w:ascii="Times New Roman" w:hAnsi="Times New Roman"/>
                 <w:b/>
+                <w:sz w:val="22"/>
               </w:rPr>
               <w:t>1</w:t>
             </w:r>
@@ -803,141 +822,56 @@
         </w:tc>
         <w:tc>
           <w:tcPr>
-            <w:tcW w:type="dxa" w:w="3120"/>
+            <w:tcW w:type="dxa" w:w="6192"/>
           </w:tcPr>
           <w:p>
+            <w:pPr>
+              <w:spacing w:after="40" w:before="40" w:line="252" w:lineRule="auto"/>
+            </w:pPr>
             <w:r>
               <w:rPr>
+                <w:rFonts w:ascii="Times New Roman" w:hAnsi="Times New Roman"/>
                 <w:b/>
+                <w:sz w:val="22"/>
               </w:rPr>
               <w:t>INTRODUCTION &amp; OVERVIEW</w:t>
             </w:r>
           </w:p>
-        </w:tc>
-        <w:tc>
-          <w:tcPr>
-            <w:tcW w:type="dxa" w:w="3120"/>
-          </w:tcPr>
           <w:p>
             <w:pPr>
-              <w:jc w:val="right"/>
+              <w:spacing w:after="40" w:before="40" w:line="252" w:lineRule="auto"/>
             </w:pPr>
             <w:r>
               <w:rPr>
-                <w:b/>
-              </w:rPr>
-              <w:t>1</w:t>
-            </w:r>
-          </w:p>
-        </w:tc>
-      </w:tr>
-      <w:tr>
-        <w:tc>
-          <w:tcPr>
-            <w:tcW w:type="dxa" w:w="3120"/>
-          </w:tcPr>
-          <w:p>
-            <w:r>
-              <w:rPr>
+                <w:rFonts w:ascii="Times New Roman" w:hAnsi="Times New Roman"/>
                 <w:b w:val="0"/>
-              </w:rPr>
-            </w:r>
-          </w:p>
-        </w:tc>
-        <w:tc>
-          <w:tcPr>
-            <w:tcW w:type="dxa" w:w="3120"/>
-          </w:tcPr>
-          <w:p>
-            <w:r>
-              <w:rPr>
-                <w:b w:val="0"/>
+                <w:sz w:val="22"/>
               </w:rPr>
               <w:t>1.1 ABOUT THE PROJECT</w:t>
             </w:r>
           </w:p>
-        </w:tc>
-        <w:tc>
-          <w:tcPr>
-            <w:tcW w:type="dxa" w:w="3120"/>
-          </w:tcPr>
           <w:p>
             <w:pPr>
-              <w:jc w:val="right"/>
+              <w:spacing w:after="40" w:before="40" w:line="252" w:lineRule="auto"/>
             </w:pPr>
             <w:r>
               <w:rPr>
+                <w:rFonts w:ascii="Times New Roman" w:hAnsi="Times New Roman"/>
                 <w:b w:val="0"/>
-              </w:rPr>
-              <w:t>1</w:t>
-            </w:r>
-          </w:p>
-        </w:tc>
-      </w:tr>
-      <w:tr>
-        <w:tc>
-          <w:tcPr>
-            <w:tcW w:type="dxa" w:w="3120"/>
-          </w:tcPr>
-          <w:p>
-            <w:r>
-              <w:rPr>
-                <w:b w:val="0"/>
-              </w:rPr>
-            </w:r>
-          </w:p>
-        </w:tc>
-        <w:tc>
-          <w:tcPr>
-            <w:tcW w:type="dxa" w:w="3120"/>
-          </w:tcPr>
-          <w:p>
-            <w:r>
-              <w:rPr>
-                <w:b w:val="0"/>
+                <w:sz w:val="22"/>
               </w:rPr>
               <w:t>1.2 PROBLEM STATEMENT</w:t>
             </w:r>
           </w:p>
-        </w:tc>
-        <w:tc>
-          <w:tcPr>
-            <w:tcW w:type="dxa" w:w="3120"/>
-          </w:tcPr>
           <w:p>
             <w:pPr>
-              <w:jc w:val="right"/>
+              <w:spacing w:after="40" w:before="40" w:line="252" w:lineRule="auto"/>
             </w:pPr>
             <w:r>
               <w:rPr>
+                <w:rFonts w:ascii="Times New Roman" w:hAnsi="Times New Roman"/>
                 <w:b w:val="0"/>
-              </w:rPr>
-              <w:t>1</w:t>
-            </w:r>
-          </w:p>
-        </w:tc>
-      </w:tr>
-      <w:tr>
-        <w:tc>
-          <w:tcPr>
-            <w:tcW w:type="dxa" w:w="3120"/>
-          </w:tcPr>
-          <w:p>
-            <w:r>
-              <w:rPr>
-                <w:b w:val="0"/>
-              </w:rPr>
-            </w:r>
-          </w:p>
-        </w:tc>
-        <w:tc>
-          <w:tcPr>
-            <w:tcW w:type="dxa" w:w="3120"/>
-          </w:tcPr>
-          <w:p>
-            <w:r>
-              <w:rPr>
-                <w:b w:val="0"/>
+                <w:sz w:val="22"/>
               </w:rPr>
               <w:t>1.3 ORGANIZATION OF INDIVIDUAL REPORT</w:t>
             </w:r>
@@ -945,15 +879,60 @@
         </w:tc>
         <w:tc>
           <w:tcPr>
-            <w:tcW w:type="dxa" w:w="3120"/>
+            <w:tcW w:type="dxa" w:w="1440"/>
           </w:tcPr>
           <w:p>
             <w:pPr>
-              <w:jc w:val="right"/>
+              <w:spacing w:after="40" w:before="40" w:line="252" w:lineRule="auto"/>
+              <w:jc w:val="center"/>
             </w:pPr>
             <w:r>
               <w:rPr>
+                <w:rFonts w:ascii="Times New Roman" w:hAnsi="Times New Roman"/>
+                <w:b/>
+                <w:sz w:val="22"/>
+              </w:rPr>
+              <w:t>1</w:t>
+            </w:r>
+          </w:p>
+          <w:p>
+            <w:pPr>
+              <w:spacing w:after="40" w:before="40" w:line="252" w:lineRule="auto"/>
+              <w:jc w:val="center"/>
+            </w:pPr>
+            <w:r>
+              <w:rPr>
+                <w:rFonts w:ascii="Times New Roman" w:hAnsi="Times New Roman"/>
                 <w:b w:val="0"/>
+                <w:sz w:val="22"/>
+              </w:rPr>
+              <w:t>1</w:t>
+            </w:r>
+          </w:p>
+          <w:p>
+            <w:pPr>
+              <w:spacing w:after="40" w:before="40" w:line="252" w:lineRule="auto"/>
+              <w:jc w:val="center"/>
+            </w:pPr>
+            <w:r>
+              <w:rPr>
+                <w:rFonts w:ascii="Times New Roman" w:hAnsi="Times New Roman"/>
+                <w:b w:val="0"/>
+                <w:sz w:val="22"/>
+              </w:rPr>
+              <w:t>1</w:t>
+            </w:r>
+          </w:p>
+          <w:p>
+            <w:pPr>
+              <w:spacing w:after="40" w:before="40" w:line="252" w:lineRule="auto"/>
+              <w:jc w:val="center"/>
+            </w:pPr>
+            <w:r>
+              <w:rPr>
+                <w:rFonts w:ascii="Times New Roman" w:hAnsi="Times New Roman"/>
+                <w:b w:val="0"/>
+                <w:sz w:val="22"/>
               </w:rPr>
               <w:t>2</w:t>
             </w:r>
@@ -963,12 +942,17 @@
       <w:tr>
         <w:tc>
           <w:tcPr>
-            <w:tcW w:type="dxa" w:w="3120"/>
+            <w:tcW w:type="dxa" w:w="1728"/>
           </w:tcPr>
           <w:p>
+            <w:pPr>
+              <w:jc w:val="center"/>
+            </w:pPr>
             <w:r>
               <w:rPr>
+                <w:rFonts w:ascii="Times New Roman" w:hAnsi="Times New Roman"/>
                 <w:b/>
+                <w:sz w:val="22"/>
               </w:rPr>
               <w:t>2</w:t>
             </w:r>
@@ -976,98 +960,43 @@
         </w:tc>
         <w:tc>
           <w:tcPr>
-            <w:tcW w:type="dxa" w:w="3120"/>
+            <w:tcW w:type="dxa" w:w="6192"/>
           </w:tcPr>
           <w:p>
+            <w:pPr>
+              <w:spacing w:after="40" w:before="40" w:line="252" w:lineRule="auto"/>
+            </w:pPr>
             <w:r>
               <w:rPr>
+                <w:rFonts w:ascii="Times New Roman" w:hAnsi="Times New Roman"/>
                 <w:b/>
+                <w:sz w:val="22"/>
               </w:rPr>
               <w:t>TEAM COMPOSITION &amp; INDIVIDUAL WORK DIVISION</w:t>
             </w:r>
           </w:p>
-        </w:tc>
-        <w:tc>
-          <w:tcPr>
-            <w:tcW w:type="dxa" w:w="3120"/>
-          </w:tcPr>
           <w:p>
             <w:pPr>
-              <w:jc w:val="right"/>
+              <w:spacing w:after="40" w:before="40" w:line="252" w:lineRule="auto"/>
             </w:pPr>
             <w:r>
               <w:rPr>
-                <w:b/>
-              </w:rPr>
-              <w:t>3</w:t>
-            </w:r>
-          </w:p>
-        </w:tc>
-      </w:tr>
-      <w:tr>
-        <w:tc>
-          <w:tcPr>
-            <w:tcW w:type="dxa" w:w="3120"/>
-          </w:tcPr>
-          <w:p>
-            <w:r>
-              <w:rPr>
+                <w:rFonts w:ascii="Times New Roman" w:hAnsi="Times New Roman"/>
                 <w:b w:val="0"/>
-              </w:rPr>
-            </w:r>
-          </w:p>
-        </w:tc>
-        <w:tc>
-          <w:tcPr>
-            <w:tcW w:type="dxa" w:w="3120"/>
-          </w:tcPr>
-          <w:p>
-            <w:r>
-              <w:rPr>
-                <w:b w:val="0"/>
+                <w:sz w:val="22"/>
               </w:rPr>
               <w:t>2.1 TEAM STRUCTURE &amp; ROLE ALLOCATION</w:t>
             </w:r>
           </w:p>
-        </w:tc>
-        <w:tc>
-          <w:tcPr>
-            <w:tcW w:type="dxa" w:w="3120"/>
-          </w:tcPr>
           <w:p>
             <w:pPr>
-              <w:jc w:val="right"/>
+              <w:spacing w:after="40" w:before="40" w:line="252" w:lineRule="auto"/>
             </w:pPr>
             <w:r>
               <w:rPr>
+                <w:rFonts w:ascii="Times New Roman" w:hAnsi="Times New Roman"/>
                 <w:b w:val="0"/>
-              </w:rPr>
-              <w:t>3</w:t>
-            </w:r>
-          </w:p>
-        </w:tc>
-      </w:tr>
-      <w:tr>
-        <w:tc>
-          <w:tcPr>
-            <w:tcW w:type="dxa" w:w="3120"/>
-          </w:tcPr>
-          <w:p>
-            <w:r>
-              <w:rPr>
-                <w:b w:val="0"/>
-              </w:rPr>
-            </w:r>
-          </w:p>
-        </w:tc>
-        <w:tc>
-          <w:tcPr>
-            <w:tcW w:type="dxa" w:w="3120"/>
-          </w:tcPr>
-          <w:p>
-            <w:r>
-              <w:rPr>
-                <w:b w:val="0"/>
+                <w:sz w:val="22"/>
               </w:rPr>
               <w:t>2.2 SAM ANTROSE A H'S INDIVIDUAL RESPONSIBILITIES</w:t>
             </w:r>
@@ -1075,15 +1004,46 @@
         </w:tc>
         <w:tc>
           <w:tcPr>
-            <w:tcW w:type="dxa" w:w="3120"/>
+            <w:tcW w:type="dxa" w:w="1440"/>
           </w:tcPr>
           <w:p>
             <w:pPr>
-              <w:jc w:val="right"/>
+              <w:spacing w:after="40" w:before="40" w:line="252" w:lineRule="auto"/>
+              <w:jc w:val="center"/>
             </w:pPr>
             <w:r>
               <w:rPr>
+                <w:rFonts w:ascii="Times New Roman" w:hAnsi="Times New Roman"/>
+                <w:b/>
+                <w:sz w:val="22"/>
+              </w:rPr>
+              <w:t>3</w:t>
+            </w:r>
+          </w:p>
+          <w:p>
+            <w:pPr>
+              <w:spacing w:after="40" w:before="40" w:line="252" w:lineRule="auto"/>
+              <w:jc w:val="center"/>
+            </w:pPr>
+            <w:r>
+              <w:rPr>
+                <w:rFonts w:ascii="Times New Roman" w:hAnsi="Times New Roman"/>
                 <w:b w:val="0"/>
+                <w:sz w:val="22"/>
+              </w:rPr>
+              <w:t>3</w:t>
+            </w:r>
+          </w:p>
+          <w:p>
+            <w:pPr>
+              <w:spacing w:after="40" w:before="40" w:line="252" w:lineRule="auto"/>
+              <w:jc w:val="center"/>
+            </w:pPr>
+            <w:r>
+              <w:rPr>
+                <w:rFonts w:ascii="Times New Roman" w:hAnsi="Times New Roman"/>
+                <w:b w:val="0"/>
+                <w:sz w:val="22"/>
               </w:rPr>
               <w:t>4</w:t>
             </w:r>
@@ -1093,12 +1053,17 @@
       <w:tr>
         <w:tc>
           <w:tcPr>
-            <w:tcW w:type="dxa" w:w="3120"/>
+            <w:tcW w:type="dxa" w:w="1728"/>
           </w:tcPr>
           <w:p>
+            <w:pPr>
+              <w:jc w:val="center"/>
+            </w:pPr>
             <w:r>
               <w:rPr>
+                <w:rFonts w:ascii="Times New Roman" w:hAnsi="Times New Roman"/>
                 <w:b/>
+                <w:sz w:val="22"/>
               </w:rPr>
               <w:t>3</w:t>
             </w:r>
@@ -1106,227 +1071,82 @@
         </w:tc>
         <w:tc>
           <w:tcPr>
-            <w:tcW w:type="dxa" w:w="3120"/>
+            <w:tcW w:type="dxa" w:w="6192"/>
           </w:tcPr>
           <w:p>
+            <w:pPr>
+              <w:spacing w:after="40" w:before="40" w:line="252" w:lineRule="auto"/>
+            </w:pPr>
             <w:r>
               <w:rPr>
+                <w:rFonts w:ascii="Times New Roman" w:hAnsi="Times New Roman"/>
                 <w:b/>
+                <w:sz w:val="22"/>
               </w:rPr>
               <w:t>INDIVIDUAL TECHNICAL MODULES &amp; IMPLEMENTATION</w:t>
             </w:r>
           </w:p>
-        </w:tc>
-        <w:tc>
-          <w:tcPr>
-            <w:tcW w:type="dxa" w:w="3120"/>
-          </w:tcPr>
           <w:p>
             <w:pPr>
-              <w:jc w:val="right"/>
+              <w:spacing w:after="40" w:before="40" w:line="252" w:lineRule="auto"/>
             </w:pPr>
             <w:r>
               <w:rPr>
-                <w:b/>
-              </w:rPr>
-              <w:t>5</w:t>
-            </w:r>
-          </w:p>
-        </w:tc>
-      </w:tr>
-      <w:tr>
-        <w:tc>
-          <w:tcPr>
-            <w:tcW w:type="dxa" w:w="3120"/>
-          </w:tcPr>
-          <w:p>
-            <w:r>
-              <w:rPr>
+                <w:rFonts w:ascii="Times New Roman" w:hAnsi="Times New Roman"/>
                 <w:b w:val="0"/>
-              </w:rPr>
-            </w:r>
-          </w:p>
-        </w:tc>
-        <w:tc>
-          <w:tcPr>
-            <w:tcW w:type="dxa" w:w="3120"/>
-          </w:tcPr>
-          <w:p>
-            <w:r>
-              <w:rPr>
-                <w:b w:val="0"/>
+                <w:sz w:val="22"/>
               </w:rPr>
               <w:t>3.1 SPRING BOOT 3 REST API &amp; DATABASE LAYER</w:t>
             </w:r>
           </w:p>
-        </w:tc>
-        <w:tc>
-          <w:tcPr>
-            <w:tcW w:type="dxa" w:w="3120"/>
-          </w:tcPr>
           <w:p>
             <w:pPr>
-              <w:jc w:val="right"/>
+              <w:spacing w:after="40" w:before="40" w:line="252" w:lineRule="auto"/>
             </w:pPr>
             <w:r>
               <w:rPr>
+                <w:rFonts w:ascii="Times New Roman" w:hAnsi="Times New Roman"/>
                 <w:b w:val="0"/>
-              </w:rPr>
-              <w:t>5</w:t>
-            </w:r>
-          </w:p>
-        </w:tc>
-      </w:tr>
-      <w:tr>
-        <w:tc>
-          <w:tcPr>
-            <w:tcW w:type="dxa" w:w="3120"/>
-          </w:tcPr>
-          <w:p>
-            <w:r>
-              <w:rPr>
-                <w:b w:val="0"/>
-              </w:rPr>
-            </w:r>
-          </w:p>
-        </w:tc>
-        <w:tc>
-          <w:tcPr>
-            <w:tcW w:type="dxa" w:w="3120"/>
-          </w:tcPr>
-          <w:p>
-            <w:r>
-              <w:rPr>
-                <w:b w:val="0"/>
+                <w:sz w:val="22"/>
               </w:rPr>
               <w:t>3.2 PYTHON FASTAPI AI MICROSERVICE (HUGGING FACE NLP)</w:t>
             </w:r>
           </w:p>
-        </w:tc>
-        <w:tc>
-          <w:tcPr>
-            <w:tcW w:type="dxa" w:w="3120"/>
-          </w:tcPr>
           <w:p>
             <w:pPr>
-              <w:jc w:val="right"/>
+              <w:spacing w:after="40" w:before="40" w:line="252" w:lineRule="auto"/>
             </w:pPr>
             <w:r>
               <w:rPr>
+                <w:rFonts w:ascii="Times New Roman" w:hAnsi="Times New Roman"/>
                 <w:b w:val="0"/>
-              </w:rPr>
-              <w:t>6</w:t>
-            </w:r>
-          </w:p>
-        </w:tc>
-      </w:tr>
-      <w:tr>
-        <w:tc>
-          <w:tcPr>
-            <w:tcW w:type="dxa" w:w="3120"/>
-          </w:tcPr>
-          <w:p>
-            <w:r>
-              <w:rPr>
-                <w:b w:val="0"/>
-              </w:rPr>
-            </w:r>
-          </w:p>
-        </w:tc>
-        <w:tc>
-          <w:tcPr>
-            <w:tcW w:type="dxa" w:w="3120"/>
-          </w:tcPr>
-          <w:p>
-            <w:r>
-              <w:rPr>
-                <w:b w:val="0"/>
+                <w:sz w:val="22"/>
               </w:rPr>
               <w:t>3.3 MULTI-ROLE AUTHENTICATION &amp; EMAIL 2FA OTP SECURITY</w:t>
             </w:r>
           </w:p>
-        </w:tc>
-        <w:tc>
-          <w:tcPr>
-            <w:tcW w:type="dxa" w:w="3120"/>
-          </w:tcPr>
           <w:p>
             <w:pPr>
-              <w:jc w:val="right"/>
+              <w:spacing w:after="40" w:before="40" w:line="252" w:lineRule="auto"/>
             </w:pPr>
             <w:r>
               <w:rPr>
+                <w:rFonts w:ascii="Times New Roman" w:hAnsi="Times New Roman"/>
                 <w:b w:val="0"/>
-              </w:rPr>
-              <w:t>7</w:t>
-            </w:r>
-          </w:p>
-        </w:tc>
-      </w:tr>
-      <w:tr>
-        <w:tc>
-          <w:tcPr>
-            <w:tcW w:type="dxa" w:w="3120"/>
-          </w:tcPr>
-          <w:p>
-            <w:r>
-              <w:rPr>
-                <w:b w:val="0"/>
-              </w:rPr>
-            </w:r>
-          </w:p>
-        </w:tc>
-        <w:tc>
-          <w:tcPr>
-            <w:tcW w:type="dxa" w:w="3120"/>
-          </w:tcPr>
-          <w:p>
-            <w:r>
-              <w:rPr>
-                <w:b w:val="0"/>
+                <w:sz w:val="22"/>
               </w:rPr>
               <w:t>3.4 EMERGENCY TELEPHONY &amp; CLOUD ALERT DISPATCH</w:t>
             </w:r>
           </w:p>
-        </w:tc>
-        <w:tc>
-          <w:tcPr>
-            <w:tcW w:type="dxa" w:w="3120"/>
-          </w:tcPr>
           <w:p>
             <w:pPr>
-              <w:jc w:val="right"/>
+              <w:spacing w:after="40" w:before="40" w:line="252" w:lineRule="auto"/>
             </w:pPr>
             <w:r>
               <w:rPr>
+                <w:rFonts w:ascii="Times New Roman" w:hAnsi="Times New Roman"/>
                 <w:b w:val="0"/>
-              </w:rPr>
-              <w:t>8</w:t>
-            </w:r>
-          </w:p>
-        </w:tc>
-      </w:tr>
-      <w:tr>
-        <w:tc>
-          <w:tcPr>
-            <w:tcW w:type="dxa" w:w="3120"/>
-          </w:tcPr>
-          <w:p>
-            <w:r>
-              <w:rPr>
-                <w:b w:val="0"/>
-              </w:rPr>
-            </w:r>
-          </w:p>
-        </w:tc>
-        <w:tc>
-          <w:tcPr>
-            <w:tcW w:type="dxa" w:w="3120"/>
-          </w:tcPr>
-          <w:p>
-            <w:r>
-              <w:rPr>
-                <w:b w:val="0"/>
+                <w:sz w:val="22"/>
               </w:rPr>
               <w:t>3.5 DOCKER CONTAINERIZATION &amp; CLOUD DEPLOYMENT</w:t>
             </w:r>
@@ -1334,15 +1154,88 @@
         </w:tc>
         <w:tc>
           <w:tcPr>
-            <w:tcW w:type="dxa" w:w="3120"/>
+            <w:tcW w:type="dxa" w:w="1440"/>
           </w:tcPr>
           <w:p>
             <w:pPr>
-              <w:jc w:val="right"/>
+              <w:spacing w:after="40" w:before="40" w:line="252" w:lineRule="auto"/>
+              <w:jc w:val="center"/>
             </w:pPr>
             <w:r>
               <w:rPr>
+                <w:rFonts w:ascii="Times New Roman" w:hAnsi="Times New Roman"/>
+                <w:b/>
+                <w:sz w:val="22"/>
+              </w:rPr>
+              <w:t>5</w:t>
+            </w:r>
+          </w:p>
+          <w:p>
+            <w:pPr>
+              <w:spacing w:after="40" w:before="40" w:line="252" w:lineRule="auto"/>
+              <w:jc w:val="center"/>
+            </w:pPr>
+            <w:r>
+              <w:rPr>
+                <w:rFonts w:ascii="Times New Roman" w:hAnsi="Times New Roman"/>
                 <w:b w:val="0"/>
+                <w:sz w:val="22"/>
+              </w:rPr>
+              <w:t>5</w:t>
+            </w:r>
+          </w:p>
+          <w:p>
+            <w:pPr>
+              <w:spacing w:after="40" w:before="40" w:line="252" w:lineRule="auto"/>
+              <w:jc w:val="center"/>
+            </w:pPr>
+            <w:r>
+              <w:rPr>
+                <w:rFonts w:ascii="Times New Roman" w:hAnsi="Times New Roman"/>
+                <w:b w:val="0"/>
+                <w:sz w:val="22"/>
+              </w:rPr>
+              <w:t>6</w:t>
+            </w:r>
+          </w:p>
+          <w:p>
+            <w:pPr>
+              <w:spacing w:after="40" w:before="40" w:line="252" w:lineRule="auto"/>
+              <w:jc w:val="center"/>
+            </w:pPr>
+            <w:r>
+              <w:rPr>
+                <w:rFonts w:ascii="Times New Roman" w:hAnsi="Times New Roman"/>
+                <w:b w:val="0"/>
+                <w:sz w:val="22"/>
+              </w:rPr>
+              <w:t>7</w:t>
+            </w:r>
+          </w:p>
+          <w:p>
+            <w:pPr>
+              <w:spacing w:after="40" w:before="40" w:line="252" w:lineRule="auto"/>
+              <w:jc w:val="center"/>
+            </w:pPr>
+            <w:r>
+              <w:rPr>
+                <w:rFonts w:ascii="Times New Roman" w:hAnsi="Times New Roman"/>
+                <w:b w:val="0"/>
+                <w:sz w:val="22"/>
+              </w:rPr>
+              <w:t>8</w:t>
+            </w:r>
+          </w:p>
+          <w:p>
+            <w:pPr>
+              <w:spacing w:after="40" w:before="40" w:line="252" w:lineRule="auto"/>
+              <w:jc w:val="center"/>
+            </w:pPr>
+            <w:r>
+              <w:rPr>
+                <w:rFonts w:ascii="Times New Roman" w:hAnsi="Times New Roman"/>
+                <w:b w:val="0"/>
+                <w:sz w:val="22"/>
               </w:rPr>
               <w:t>9</w:t>
             </w:r>
@@ -1352,12 +1245,17 @@
       <w:tr>
         <w:tc>
           <w:tcPr>
-            <w:tcW w:type="dxa" w:w="3120"/>
+            <w:tcW w:type="dxa" w:w="1728"/>
           </w:tcPr>
           <w:p>
+            <w:pPr>
+              <w:jc w:val="center"/>
+            </w:pPr>
             <w:r>
               <w:rPr>
+                <w:rFonts w:ascii="Times New Roman" w:hAnsi="Times New Roman"/>
                 <w:b/>
+                <w:sz w:val="22"/>
               </w:rPr>
               <w:t>4</w:t>
             </w:r>
@@ -1365,30 +1263,173 @@
         </w:tc>
         <w:tc>
           <w:tcPr>
-            <w:tcW w:type="dxa" w:w="3120"/>
+            <w:tcW w:type="dxa" w:w="6192"/>
           </w:tcPr>
           <w:p>
+            <w:pPr>
+              <w:spacing w:after="40" w:before="40" w:line="252" w:lineRule="auto"/>
+            </w:pPr>
             <w:r>
               <w:rPr>
+                <w:rFonts w:ascii="Times New Roman" w:hAnsi="Times New Roman"/>
                 <w:b/>
+                <w:sz w:val="22"/>
               </w:rPr>
               <w:t>SYSTEM DESIGN &amp; DATA FLOW DIAGRAMS</w:t>
+            </w:r>
+          </w:p>
+          <w:p>
+            <w:pPr>
+              <w:spacing w:after="40" w:before="40" w:line="252" w:lineRule="auto"/>
+            </w:pPr>
+            <w:r>
+              <w:rPr>
+                <w:rFonts w:ascii="Times New Roman" w:hAnsi="Times New Roman"/>
+                <w:b w:val="0"/>
+                <w:sz w:val="22"/>
+              </w:rPr>
+              <w:t>4.1 SYSTEM ARCHITECTURE DIAGRAM</w:t>
+            </w:r>
+          </w:p>
+          <w:p>
+            <w:pPr>
+              <w:spacing w:after="40" w:before="40" w:line="252" w:lineRule="auto"/>
+            </w:pPr>
+            <w:r>
+              <w:rPr>
+                <w:rFonts w:ascii="Times New Roman" w:hAnsi="Times New Roman"/>
+                <w:b w:val="0"/>
+                <w:sz w:val="22"/>
+              </w:rPr>
+              <w:t>4.2 DATA FLOW DIAGRAM</w:t>
+            </w:r>
+          </w:p>
+          <w:p>
+            <w:pPr>
+              <w:spacing w:after="40" w:before="40" w:line="252" w:lineRule="auto"/>
+            </w:pPr>
+            <w:r>
+              <w:rPr>
+                <w:rFonts w:ascii="Times New Roman" w:hAnsi="Times New Roman"/>
+                <w:b w:val="0"/>
+                <w:sz w:val="22"/>
+              </w:rPr>
+              <w:t xml:space="preserve">    4.2.1 DATA FLOW DIAGRAM LEVEL 0</w:t>
+            </w:r>
+          </w:p>
+          <w:p>
+            <w:pPr>
+              <w:spacing w:after="40" w:before="40" w:line="252" w:lineRule="auto"/>
+            </w:pPr>
+            <w:r>
+              <w:rPr>
+                <w:rFonts w:ascii="Times New Roman" w:hAnsi="Times New Roman"/>
+                <w:b w:val="0"/>
+                <w:sz w:val="22"/>
+              </w:rPr>
+              <w:t xml:space="preserve">    4.2.2 DATA FLOW DIAGRAM LEVEL 1</w:t>
+            </w:r>
+          </w:p>
+          <w:p>
+            <w:pPr>
+              <w:spacing w:after="40" w:before="40" w:line="252" w:lineRule="auto"/>
+            </w:pPr>
+            <w:r>
+              <w:rPr>
+                <w:rFonts w:ascii="Times New Roman" w:hAnsi="Times New Roman"/>
+                <w:b w:val="0"/>
+                <w:sz w:val="22"/>
+              </w:rPr>
+              <w:t xml:space="preserve">    4.2.3 DATA FLOW DIAGRAM LEVEL 2</w:t>
             </w:r>
           </w:p>
         </w:tc>
         <w:tc>
           <w:tcPr>
-            <w:tcW w:type="dxa" w:w="3120"/>
+            <w:tcW w:type="dxa" w:w="1440"/>
           </w:tcPr>
           <w:p>
             <w:pPr>
-              <w:jc w:val="right"/>
+              <w:spacing w:after="40" w:before="40" w:line="252" w:lineRule="auto"/>
+              <w:jc w:val="center"/>
             </w:pPr>
             <w:r>
               <w:rPr>
+                <w:rFonts w:ascii="Times New Roman" w:hAnsi="Times New Roman"/>
                 <w:b/>
+                <w:sz w:val="22"/>
               </w:rPr>
               <w:t>10</w:t>
+            </w:r>
+          </w:p>
+          <w:p>
+            <w:pPr>
+              <w:spacing w:after="40" w:before="40" w:line="252" w:lineRule="auto"/>
+              <w:jc w:val="center"/>
+            </w:pPr>
+            <w:r>
+              <w:rPr>
+                <w:rFonts w:ascii="Times New Roman" w:hAnsi="Times New Roman"/>
+                <w:b w:val="0"/>
+                <w:sz w:val="22"/>
+              </w:rPr>
+              <w:t>10</w:t>
+            </w:r>
+          </w:p>
+          <w:p>
+            <w:pPr>
+              <w:spacing w:after="40" w:before="40" w:line="252" w:lineRule="auto"/>
+              <w:jc w:val="center"/>
+            </w:pPr>
+            <w:r>
+              <w:rPr>
+                <w:rFonts w:ascii="Times New Roman" w:hAnsi="Times New Roman"/>
+                <w:b w:val="0"/>
+                <w:sz w:val="22"/>
+              </w:rPr>
+              <w:t>11</w:t>
+            </w:r>
+          </w:p>
+          <w:p>
+            <w:pPr>
+              <w:spacing w:after="40" w:before="40" w:line="252" w:lineRule="auto"/>
+              <w:jc w:val="center"/>
+            </w:pPr>
+            <w:r>
+              <w:rPr>
+                <w:rFonts w:ascii="Times New Roman" w:hAnsi="Times New Roman"/>
+                <w:b w:val="0"/>
+                <w:sz w:val="22"/>
+              </w:rPr>
+              <w:t>11</w:t>
+            </w:r>
+          </w:p>
+          <w:p>
+            <w:pPr>
+              <w:spacing w:after="40" w:before="40" w:line="252" w:lineRule="auto"/>
+              <w:jc w:val="center"/>
+            </w:pPr>
+            <w:r>
+              <w:rPr>
+                <w:rFonts w:ascii="Times New Roman" w:hAnsi="Times New Roman"/>
+                <w:b w:val="0"/>
+                <w:sz w:val="22"/>
+              </w:rPr>
+              <w:t>11</w:t>
+            </w:r>
+          </w:p>
+          <w:p>
+            <w:pPr>
+              <w:spacing w:after="40" w:before="40" w:line="252" w:lineRule="auto"/>
+              <w:jc w:val="center"/>
+            </w:pPr>
+            <w:r>
+              <w:rPr>
+                <w:rFonts w:ascii="Times New Roman" w:hAnsi="Times New Roman"/>
+                <w:b w:val="0"/>
+                <w:sz w:val="22"/>
+              </w:rPr>
+              <w:t>12</w:t>
             </w:r>
           </w:p>
         </w:tc>
@@ -1396,98 +1437,17 @@
       <w:tr>
         <w:tc>
           <w:tcPr>
-            <w:tcW w:type="dxa" w:w="3120"/>
-          </w:tcPr>
-          <w:p>
-            <w:r>
-              <w:rPr>
-                <w:b w:val="0"/>
-              </w:rPr>
-            </w:r>
-          </w:p>
-        </w:tc>
-        <w:tc>
-          <w:tcPr>
-            <w:tcW w:type="dxa" w:w="3120"/>
-          </w:tcPr>
-          <w:p>
-            <w:r>
-              <w:rPr>
-                <w:b w:val="0"/>
-              </w:rPr>
-              <w:t>4.1 SYSTEM ARCHITECTURE DIAGRAM</w:t>
-            </w:r>
-          </w:p>
-        </w:tc>
-        <w:tc>
-          <w:tcPr>
-            <w:tcW w:type="dxa" w:w="3120"/>
+            <w:tcW w:type="dxa" w:w="1728"/>
           </w:tcPr>
           <w:p>
             <w:pPr>
-              <w:jc w:val="right"/>
+              <w:jc w:val="center"/>
             </w:pPr>
             <w:r>
               <w:rPr>
-                <w:b w:val="0"/>
-              </w:rPr>
-              <w:t>10</w:t>
-            </w:r>
-          </w:p>
-        </w:tc>
-      </w:tr>
-      <w:tr>
-        <w:tc>
-          <w:tcPr>
-            <w:tcW w:type="dxa" w:w="3120"/>
-          </w:tcPr>
-          <w:p>
-            <w:r>
-              <w:rPr>
-                <w:b w:val="0"/>
-              </w:rPr>
-            </w:r>
-          </w:p>
-        </w:tc>
-        <w:tc>
-          <w:tcPr>
-            <w:tcW w:type="dxa" w:w="3120"/>
-          </w:tcPr>
-          <w:p>
-            <w:r>
-              <w:rPr>
-                <w:b w:val="0"/>
-              </w:rPr>
-              <w:t>4.2 DATA FLOW DIAGRAM (LEVELS 0, 1, 2)</w:t>
-            </w:r>
-          </w:p>
-        </w:tc>
-        <w:tc>
-          <w:tcPr>
-            <w:tcW w:type="dxa" w:w="3120"/>
-          </w:tcPr>
-          <w:p>
-            <w:pPr>
-              <w:jc w:val="right"/>
-            </w:pPr>
-            <w:r>
-              <w:rPr>
-                <w:b w:val="0"/>
-              </w:rPr>
-              <w:t>11</w:t>
-            </w:r>
-          </w:p>
-        </w:tc>
-      </w:tr>
-      <w:tr>
-        <w:tc>
-          <w:tcPr>
-            <w:tcW w:type="dxa" w:w="3120"/>
-          </w:tcPr>
-          <w:p>
-            <w:r>
-              <w:rPr>
+                <w:rFonts w:ascii="Times New Roman" w:hAnsi="Times New Roman"/>
                 <w:b/>
+                <w:sz w:val="22"/>
               </w:rPr>
               <w:t>5</w:t>
             </w:r>
@@ -1495,28 +1455,117 @@
         </w:tc>
         <w:tc>
           <w:tcPr>
-            <w:tcW w:type="dxa" w:w="3120"/>
+            <w:tcW w:type="dxa" w:w="6192"/>
           </w:tcPr>
           <w:p>
+            <w:pPr>
+              <w:spacing w:after="40" w:before="40" w:line="252" w:lineRule="auto"/>
+            </w:pPr>
             <w:r>
               <w:rPr>
+                <w:rFonts w:ascii="Times New Roman" w:hAnsi="Times New Roman"/>
                 <w:b/>
+                <w:sz w:val="22"/>
               </w:rPr>
               <w:t>INPUT/OUTPUT SCREENS &amp; VERIFICATION</w:t>
+            </w:r>
+          </w:p>
+          <w:p>
+            <w:pPr>
+              <w:spacing w:after="40" w:before="40" w:line="252" w:lineRule="auto"/>
+            </w:pPr>
+            <w:r>
+              <w:rPr>
+                <w:rFonts w:ascii="Times New Roman" w:hAnsi="Times New Roman"/>
+                <w:b w:val="0"/>
+                <w:sz w:val="22"/>
+              </w:rPr>
+              <w:t>5.1 AUTHENTICATION &amp; 2FA VERIFICATION SCREEN</w:t>
+            </w:r>
+          </w:p>
+          <w:p>
+            <w:pPr>
+              <w:spacing w:after="40" w:before="40" w:line="252" w:lineRule="auto"/>
+            </w:pPr>
+            <w:r>
+              <w:rPr>
+                <w:rFonts w:ascii="Times New Roman" w:hAnsi="Times New Roman"/>
+                <w:b w:val="0"/>
+                <w:sz w:val="22"/>
+              </w:rPr>
+              <w:t>5.2 TICKET SUBMISSION &amp; LIVE AI PREVIEW SCREEN</w:t>
+            </w:r>
+          </w:p>
+          <w:p>
+            <w:pPr>
+              <w:spacing w:after="40" w:before="40" w:line="252" w:lineRule="auto"/>
+            </w:pPr>
+            <w:r>
+              <w:rPr>
+                <w:rFonts w:ascii="Times New Roman" w:hAnsi="Times New Roman"/>
+                <w:b w:val="0"/>
+                <w:sz w:val="22"/>
+              </w:rPr>
+              <w:t>5.3 TECHNICIAN WORK QUEUE &amp; SLA TIMERS SCREEN</w:t>
             </w:r>
           </w:p>
         </w:tc>
         <w:tc>
           <w:tcPr>
-            <w:tcW w:type="dxa" w:w="3120"/>
+            <w:tcW w:type="dxa" w:w="1440"/>
           </w:tcPr>
           <w:p>
             <w:pPr>
-              <w:jc w:val="right"/>
+              <w:spacing w:after="40" w:before="40" w:line="252" w:lineRule="auto"/>
+              <w:jc w:val="center"/>
             </w:pPr>
             <w:r>
               <w:rPr>
+                <w:rFonts w:ascii="Times New Roman" w:hAnsi="Times New Roman"/>
                 <w:b/>
+                <w:sz w:val="22"/>
+              </w:rPr>
+              <w:t>13</w:t>
+            </w:r>
+          </w:p>
+          <w:p>
+            <w:pPr>
+              <w:spacing w:after="40" w:before="40" w:line="252" w:lineRule="auto"/>
+              <w:jc w:val="center"/>
+            </w:pPr>
+            <w:r>
+              <w:rPr>
+                <w:rFonts w:ascii="Times New Roman" w:hAnsi="Times New Roman"/>
+                <w:b w:val="0"/>
+                <w:sz w:val="22"/>
+              </w:rPr>
+              <w:t>13</w:t>
+            </w:r>
+          </w:p>
+          <w:p>
+            <w:pPr>
+              <w:spacing w:after="40" w:before="40" w:line="252" w:lineRule="auto"/>
+              <w:jc w:val="center"/>
+            </w:pPr>
+            <w:r>
+              <w:rPr>
+                <w:rFonts w:ascii="Times New Roman" w:hAnsi="Times New Roman"/>
+                <w:b w:val="0"/>
+                <w:sz w:val="22"/>
+              </w:rPr>
+              <w:t>13</w:t>
+            </w:r>
+          </w:p>
+          <w:p>
+            <w:pPr>
+              <w:spacing w:after="40" w:before="40" w:line="252" w:lineRule="auto"/>
+              <w:jc w:val="center"/>
+            </w:pPr>
+            <w:r>
+              <w:rPr>
+                <w:rFonts w:ascii="Times New Roman" w:hAnsi="Times New Roman"/>
+                <w:b w:val="0"/>
+                <w:sz w:val="22"/>
               </w:rPr>
               <w:t>13</w:t>
             </w:r>
@@ -1526,12 +1575,17 @@
       <w:tr>
         <w:tc>
           <w:tcPr>
-            <w:tcW w:type="dxa" w:w="3120"/>
+            <w:tcW w:type="dxa" w:w="1728"/>
           </w:tcPr>
           <w:p>
+            <w:pPr>
+              <w:jc w:val="center"/>
+            </w:pPr>
             <w:r>
               <w:rPr>
+                <w:rFonts w:ascii="Times New Roman" w:hAnsi="Times New Roman"/>
                 <w:b/>
+                <w:sz w:val="22"/>
               </w:rPr>
               <w:t>6</w:t>
             </w:r>
@@ -1539,28 +1593,117 @@
         </w:tc>
         <w:tc>
           <w:tcPr>
-            <w:tcW w:type="dxa" w:w="3120"/>
+            <w:tcW w:type="dxa" w:w="6192"/>
           </w:tcPr>
           <w:p>
+            <w:pPr>
+              <w:spacing w:after="40" w:before="40" w:line="252" w:lineRule="auto"/>
+            </w:pPr>
             <w:r>
               <w:rPr>
+                <w:rFonts w:ascii="Times New Roman" w:hAnsi="Times New Roman"/>
                 <w:b/>
+                <w:sz w:val="22"/>
               </w:rPr>
               <w:t>TESTING &amp; INDIVIDUAL MODULE VALIDATION</w:t>
+            </w:r>
+          </w:p>
+          <w:p>
+            <w:pPr>
+              <w:spacing w:after="40" w:before="40" w:line="252" w:lineRule="auto"/>
+            </w:pPr>
+            <w:r>
+              <w:rPr>
+                <w:rFonts w:ascii="Times New Roman" w:hAnsi="Times New Roman"/>
+                <w:b w:val="0"/>
+                <w:sz w:val="22"/>
+              </w:rPr>
+              <w:t>6.1 UNIT TESTING</w:t>
+            </w:r>
+          </w:p>
+          <w:p>
+            <w:pPr>
+              <w:spacing w:after="40" w:before="40" w:line="252" w:lineRule="auto"/>
+            </w:pPr>
+            <w:r>
+              <w:rPr>
+                <w:rFonts w:ascii="Times New Roman" w:hAnsi="Times New Roman"/>
+                <w:b w:val="0"/>
+                <w:sz w:val="22"/>
+              </w:rPr>
+              <w:t>6.2 INTEGRATION TESTING</w:t>
+            </w:r>
+          </w:p>
+          <w:p>
+            <w:pPr>
+              <w:spacing w:after="40" w:before="40" w:line="252" w:lineRule="auto"/>
+            </w:pPr>
+            <w:r>
+              <w:rPr>
+                <w:rFonts w:ascii="Times New Roman" w:hAnsi="Times New Roman"/>
+                <w:b w:val="0"/>
+                <w:sz w:val="22"/>
+              </w:rPr>
+              <w:t>6.3 SECURITY &amp; FALLBACK TESTING</w:t>
             </w:r>
           </w:p>
         </w:tc>
         <w:tc>
           <w:tcPr>
-            <w:tcW w:type="dxa" w:w="3120"/>
+            <w:tcW w:type="dxa" w:w="1440"/>
           </w:tcPr>
           <w:p>
             <w:pPr>
-              <w:jc w:val="right"/>
+              <w:spacing w:after="40" w:before="40" w:line="252" w:lineRule="auto"/>
+              <w:jc w:val="center"/>
             </w:pPr>
             <w:r>
               <w:rPr>
+                <w:rFonts w:ascii="Times New Roman" w:hAnsi="Times New Roman"/>
                 <w:b/>
+                <w:sz w:val="22"/>
+              </w:rPr>
+              <w:t>14</w:t>
+            </w:r>
+          </w:p>
+          <w:p>
+            <w:pPr>
+              <w:spacing w:after="40" w:before="40" w:line="252" w:lineRule="auto"/>
+              <w:jc w:val="center"/>
+            </w:pPr>
+            <w:r>
+              <w:rPr>
+                <w:rFonts w:ascii="Times New Roman" w:hAnsi="Times New Roman"/>
+                <w:b w:val="0"/>
+                <w:sz w:val="22"/>
+              </w:rPr>
+              <w:t>14</w:t>
+            </w:r>
+          </w:p>
+          <w:p>
+            <w:pPr>
+              <w:spacing w:after="40" w:before="40" w:line="252" w:lineRule="auto"/>
+              <w:jc w:val="center"/>
+            </w:pPr>
+            <w:r>
+              <w:rPr>
+                <w:rFonts w:ascii="Times New Roman" w:hAnsi="Times New Roman"/>
+                <w:b w:val="0"/>
+                <w:sz w:val="22"/>
+              </w:rPr>
+              <w:t>14</w:t>
+            </w:r>
+          </w:p>
+          <w:p>
+            <w:pPr>
+              <w:spacing w:after="40" w:before="40" w:line="252" w:lineRule="auto"/>
+              <w:jc w:val="center"/>
+            </w:pPr>
+            <w:r>
+              <w:rPr>
+                <w:rFonts w:ascii="Times New Roman" w:hAnsi="Times New Roman"/>
+                <w:b w:val="0"/>
+                <w:sz w:val="22"/>
               </w:rPr>
               <w:t>14</w:t>
             </w:r>
@@ -1570,12 +1713,17 @@
       <w:tr>
         <w:tc>
           <w:tcPr>
-            <w:tcW w:type="dxa" w:w="3120"/>
+            <w:tcW w:type="dxa" w:w="1728"/>
           </w:tcPr>
           <w:p>
+            <w:pPr>
+              <w:jc w:val="center"/>
+            </w:pPr>
             <w:r>
               <w:rPr>
+                <w:rFonts w:ascii="Times New Roman" w:hAnsi="Times New Roman"/>
                 <w:b/>
+                <w:sz w:val="22"/>
               </w:rPr>
               <w:t>7</w:t>
             </w:r>
@@ -1583,12 +1731,17 @@
         </w:tc>
         <w:tc>
           <w:tcPr>
-            <w:tcW w:type="dxa" w:w="3120"/>
+            <w:tcW w:type="dxa" w:w="6192"/>
           </w:tcPr>
           <w:p>
+            <w:pPr>
+              <w:spacing w:after="40" w:before="40" w:line="252" w:lineRule="auto"/>
+            </w:pPr>
             <w:r>
               <w:rPr>
+                <w:rFonts w:ascii="Times New Roman" w:hAnsi="Times New Roman"/>
                 <w:b/>
+                <w:sz w:val="22"/>
               </w:rPr>
               <w:t>CONCLUSION &amp; LEARNING OUTCOMES</w:t>
             </w:r>
@@ -1596,108 +1749,69 @@
         </w:tc>
         <w:tc>
           <w:tcPr>
-            <w:tcW w:type="dxa" w:w="3120"/>
+            <w:tcW w:type="dxa" w:w="1440"/>
           </w:tcPr>
           <w:p>
             <w:pPr>
-              <w:jc w:val="right"/>
+              <w:spacing w:after="40" w:before="40" w:line="252" w:lineRule="auto"/>
+              <w:jc w:val="center"/>
             </w:pPr>
             <w:r>
               <w:rPr>
+                <w:rFonts w:ascii="Times New Roman" w:hAnsi="Times New Roman"/>
                 <w:b/>
+                <w:sz w:val="22"/>
               </w:rPr>
               <w:t>15</w:t>
             </w:r>
           </w:p>
         </w:tc>
       </w:tr>
-      <w:tr>
-        <w:tc>
-          <w:tcPr>
-            <w:tcW w:type="dxa" w:w="3120"/>
-          </w:tcPr>
-          <w:p>
-            <w:r>
-              <w:rPr>
-                <w:b w:val="0"/>
-              </w:rPr>
-            </w:r>
-          </w:p>
-        </w:tc>
-        <w:tc>
-          <w:tcPr>
-            <w:tcW w:type="dxa" w:w="3120"/>
-          </w:tcPr>
-          <w:p>
-            <w:r>
-              <w:rPr>
-                <w:b w:val="0"/>
-              </w:rPr>
-              <w:t>APPENDIX</w:t>
-            </w:r>
-          </w:p>
-        </w:tc>
-        <w:tc>
-          <w:tcPr>
-            <w:tcW w:type="dxa" w:w="3120"/>
-          </w:tcPr>
-          <w:p>
-            <w:pPr>
-              <w:jc w:val="right"/>
-            </w:pPr>
-            <w:r>
-              <w:rPr>
-                <w:b w:val="0"/>
-              </w:rPr>
-              <w:t>16</w:t>
-            </w:r>
-          </w:p>
-        </w:tc>
-      </w:tr>
-      <w:tr>
-        <w:tc>
-          <w:tcPr>
-            <w:tcW w:type="dxa" w:w="3120"/>
-          </w:tcPr>
-          <w:p>
-            <w:r>
-              <w:rPr>
-                <w:b w:val="0"/>
-              </w:rPr>
-            </w:r>
-          </w:p>
-        </w:tc>
-        <w:tc>
-          <w:tcPr>
-            <w:tcW w:type="dxa" w:w="3120"/>
-          </w:tcPr>
-          <w:p>
-            <w:r>
-              <w:rPr>
-                <w:b w:val="0"/>
-              </w:rPr>
-              <w:t>REFERENCES</w:t>
-            </w:r>
-          </w:p>
-        </w:tc>
-        <w:tc>
-          <w:tcPr>
-            <w:tcW w:type="dxa" w:w="3120"/>
-          </w:tcPr>
-          <w:p>
-            <w:pPr>
-              <w:jc w:val="right"/>
-            </w:pPr>
-            <w:r>
-              <w:rPr>
-                <w:b w:val="0"/>
-              </w:rPr>
-              <w:t>20</w:t>
-            </w:r>
-          </w:p>
-        </w:tc>
-      </w:tr>
     </w:tbl>
+    <w:p>
+      <w:pPr>
+        <w:spacing w:before="360" w:after="120"/>
+        <w:jc w:val="center"/>
+      </w:pPr>
+      <w:r>
+        <w:rPr>
+          <w:rFonts w:ascii="Times New Roman" w:hAnsi="Times New Roman"/>
+          <w:b/>
+        </w:rPr>
+        <w:t>APPENDIX</w:t>
+        <w:tab/>
+        <w:tab/>
+        <w:tab/>
+        <w:tab/>
+        <w:tab/>
+        <w:tab/>
+        <w:tab/>
+        <w:tab/>
+        <w:t>16</w:t>
+      </w:r>
+    </w:p>
+    <w:p>
+      <w:pPr>
+        <w:spacing w:after="360"/>
+        <w:jc w:val="center"/>
+      </w:pPr>
+      <w:r>
+        <w:rPr>
+          <w:rFonts w:ascii="Times New Roman" w:hAnsi="Times New Roman"/>
+          <w:b/>
+        </w:rPr>
+        <w:t>REFERENCES</w:t>
+        <w:tab/>
+        <w:tab/>
+        <w:tab/>
+        <w:tab/>
+        <w:tab/>
+        <w:tab/>
+        <w:tab/>
+        <w:tab/>
+        <w:t>20</w:t>
+      </w:r>
+    </w:p>
     <w:p>
       <w:r>
         <w:br w:type="page"/>
@@ -1735,6 +1849,14 @@
         <w:jc w:val="center"/>
         <w:tblLayout w:type="fixed"/>
         <w:tblLook w:firstColumn="1" w:firstRow="1" w:lastColumn="0" w:lastRow="0" w:noHBand="0" w:noVBand="1" w:val="04A0"/>
+        <w:tblBorders>
+          <w:top w:val="single" w:sz="8" w:space="0" w:color="000000"/>
+          <w:left w:val="single" w:sz="8" w:space="0" w:color="000000"/>
+          <w:bottom w:val="single" w:sz="8" w:space="0" w:color="000000"/>
+          <w:right w:val="single" w:sz="8" w:space="0" w:color="000000"/>
+          <w:insideH w:val="single" w:sz="4" w:space="0" w:color="000000"/>
+          <w:insideV w:val="single" w:sz="4" w:space="0" w:color="000000"/>
+        </w:tblBorders>
       </w:tblPr>
       <w:tblGrid>
         <w:gridCol w:w="2340"/>
@@ -1745,13 +1867,17 @@
       <w:tr>
         <w:tc>
           <w:tcPr>
-            <w:tcW w:type="dxa" w:w="2340"/>
-            <w:shd w:fill="E0E0E0"/>
+            <w:tcW w:type="dxa" w:w="1296"/>
           </w:tcPr>
           <w:p>
+            <w:pPr>
+              <w:jc w:val="center"/>
+            </w:pPr>
             <w:r>
               <w:rPr>
+                <w:rFonts w:ascii="Times New Roman" w:hAnsi="Times New Roman"/>
                 <w:b/>
+                <w:sz w:val="22"/>
               </w:rPr>
               <w:t>S.NO</w:t>
             </w:r>
@@ -1759,13 +1885,17 @@
         </w:tc>
         <w:tc>
           <w:tcPr>
-            <w:tcW w:type="dxa" w:w="2340"/>
-            <w:shd w:fill="E0E0E0"/>
+            <w:tcW w:type="dxa" w:w="1872"/>
           </w:tcPr>
           <w:p>
+            <w:pPr>
+              <w:jc w:val="center"/>
+            </w:pPr>
             <w:r>
               <w:rPr>
+                <w:rFonts w:ascii="Times New Roman" w:hAnsi="Times New Roman"/>
                 <w:b/>
+                <w:sz w:val="22"/>
               </w:rPr>
               <w:t>FIGURE NO.</w:t>
             </w:r>
@@ -1773,13 +1903,17 @@
         </w:tc>
         <w:tc>
           <w:tcPr>
-            <w:tcW w:type="dxa" w:w="2340"/>
-            <w:shd w:fill="E0E0E0"/>
+            <w:tcW w:type="dxa" w:w="4752"/>
           </w:tcPr>
           <w:p>
+            <w:pPr>
+              <w:jc w:val="center"/>
+            </w:pPr>
             <w:r>
               <w:rPr>
+                <w:rFonts w:ascii="Times New Roman" w:hAnsi="Times New Roman"/>
                 <w:b/>
+                <w:sz w:val="22"/>
               </w:rPr>
               <w:t>FIGURE NAME</w:t>
             </w:r>
@@ -1787,13 +1921,17 @@
         </w:tc>
         <w:tc>
           <w:tcPr>
-            <w:tcW w:type="dxa" w:w="2340"/>
-            <w:shd w:fill="E0E0E0"/>
+            <w:tcW w:type="dxa" w:w="1440"/>
           </w:tcPr>
           <w:p>
+            <w:pPr>
+              <w:jc w:val="center"/>
+            </w:pPr>
             <w:r>
               <w:rPr>
+                <w:rFonts w:ascii="Times New Roman" w:hAnsi="Times New Roman"/>
                 <w:b/>
+                <w:sz w:val="22"/>
               </w:rPr>
               <w:t>PAGE NO.</w:t>
             </w:r>
@@ -1803,43 +1941,66 @@
       <w:tr>
         <w:tc>
           <w:tcPr>
-            <w:tcW w:type="dxa" w:w="2340"/>
+            <w:tcW w:type="dxa" w:w="1296"/>
           </w:tcPr>
           <w:p>
+            <w:pPr>
+              <w:jc w:val="center"/>
+            </w:pPr>
             <w:r>
+              <w:rPr>
+                <w:rFonts w:ascii="Times New Roman" w:hAnsi="Times New Roman"/>
+              </w:rPr>
               <w:t>1</w:t>
             </w:r>
           </w:p>
         </w:tc>
         <w:tc>
           <w:tcPr>
-            <w:tcW w:type="dxa" w:w="2340"/>
+            <w:tcW w:type="dxa" w:w="1872"/>
           </w:tcPr>
           <w:p>
+            <w:pPr>
+              <w:jc w:val="center"/>
+            </w:pPr>
             <w:r>
+              <w:rPr>
+                <w:rFonts w:ascii="Times New Roman" w:hAnsi="Times New Roman"/>
+                <w:b/>
+              </w:rPr>
               <w:t>2.1</w:t>
             </w:r>
           </w:p>
         </w:tc>
         <w:tc>
           <w:tcPr>
-            <w:tcW w:type="dxa" w:w="2340"/>
+            <w:tcW w:type="dxa" w:w="4752"/>
           </w:tcPr>
           <w:p>
+            <w:pPr>
+              <w:jc w:val="center"/>
+            </w:pPr>
             <w:r>
+              <w:rPr>
+                <w:rFonts w:ascii="Times New Roman" w:hAnsi="Times New Roman"/>
+                <w:b/>
+              </w:rPr>
               <w:t>INDIVIDUAL WORK DIVISION MATRIX</w:t>
             </w:r>
           </w:p>
         </w:tc>
         <w:tc>
           <w:tcPr>
-            <w:tcW w:type="dxa" w:w="2340"/>
+            <w:tcW w:type="dxa" w:w="1440"/>
           </w:tcPr>
           <w:p>
             <w:pPr>
-              <w:jc w:val="right"/>
+              <w:jc w:val="center"/>
             </w:pPr>
             <w:r>
+              <w:rPr>
+                <w:rFonts w:ascii="Times New Roman" w:hAnsi="Times New Roman"/>
+              </w:rPr>
               <w:t>4</w:t>
             </w:r>
           </w:p>
@@ -1848,43 +2009,66 @@
       <w:tr>
         <w:tc>
           <w:tcPr>
-            <w:tcW w:type="dxa" w:w="2340"/>
+            <w:tcW w:type="dxa" w:w="1296"/>
           </w:tcPr>
           <w:p>
+            <w:pPr>
+              <w:jc w:val="center"/>
+            </w:pPr>
             <w:r>
+              <w:rPr>
+                <w:rFonts w:ascii="Times New Roman" w:hAnsi="Times New Roman"/>
+              </w:rPr>
               <w:t>2</w:t>
             </w:r>
           </w:p>
         </w:tc>
         <w:tc>
           <w:tcPr>
-            <w:tcW w:type="dxa" w:w="2340"/>
+            <w:tcW w:type="dxa" w:w="1872"/>
           </w:tcPr>
           <w:p>
+            <w:pPr>
+              <w:jc w:val="center"/>
+            </w:pPr>
             <w:r>
+              <w:rPr>
+                <w:rFonts w:ascii="Times New Roman" w:hAnsi="Times New Roman"/>
+                <w:b/>
+              </w:rPr>
               <w:t>3.1</w:t>
             </w:r>
           </w:p>
         </w:tc>
         <w:tc>
           <w:tcPr>
-            <w:tcW w:type="dxa" w:w="2340"/>
+            <w:tcW w:type="dxa" w:w="4752"/>
           </w:tcPr>
           <w:p>
+            <w:pPr>
+              <w:jc w:val="center"/>
+            </w:pPr>
             <w:r>
+              <w:rPr>
+                <w:rFonts w:ascii="Times New Roman" w:hAnsi="Times New Roman"/>
+                <w:b/>
+              </w:rPr>
               <w:t>SPRING BOOT BACKEND &amp; DATABASE LAYER</w:t>
             </w:r>
           </w:p>
         </w:tc>
         <w:tc>
           <w:tcPr>
-            <w:tcW w:type="dxa" w:w="2340"/>
+            <w:tcW w:type="dxa" w:w="1440"/>
           </w:tcPr>
           <w:p>
             <w:pPr>
-              <w:jc w:val="right"/>
+              <w:jc w:val="center"/>
             </w:pPr>
             <w:r>
+              <w:rPr>
+                <w:rFonts w:ascii="Times New Roman" w:hAnsi="Times New Roman"/>
+              </w:rPr>
               <w:t>5</w:t>
             </w:r>
           </w:p>
@@ -1893,43 +2077,66 @@
       <w:tr>
         <w:tc>
           <w:tcPr>
-            <w:tcW w:type="dxa" w:w="2340"/>
+            <w:tcW w:type="dxa" w:w="1296"/>
           </w:tcPr>
           <w:p>
+            <w:pPr>
+              <w:jc w:val="center"/>
+            </w:pPr>
             <w:r>
+              <w:rPr>
+                <w:rFonts w:ascii="Times New Roman" w:hAnsi="Times New Roman"/>
+              </w:rPr>
               <w:t>3</w:t>
             </w:r>
           </w:p>
         </w:tc>
         <w:tc>
           <w:tcPr>
-            <w:tcW w:type="dxa" w:w="2340"/>
+            <w:tcW w:type="dxa" w:w="1872"/>
           </w:tcPr>
           <w:p>
+            <w:pPr>
+              <w:jc w:val="center"/>
+            </w:pPr>
             <w:r>
+              <w:rPr>
+                <w:rFonts w:ascii="Times New Roman" w:hAnsi="Times New Roman"/>
+                <w:b/>
+              </w:rPr>
               <w:t>3.2</w:t>
             </w:r>
           </w:p>
         </w:tc>
         <w:tc>
           <w:tcPr>
-            <w:tcW w:type="dxa" w:w="2340"/>
+            <w:tcW w:type="dxa" w:w="4752"/>
           </w:tcPr>
           <w:p>
+            <w:pPr>
+              <w:jc w:val="center"/>
+            </w:pPr>
             <w:r>
+              <w:rPr>
+                <w:rFonts w:ascii="Times New Roman" w:hAnsi="Times New Roman"/>
+                <w:b/>
+              </w:rPr>
               <w:t>FASTAPI HUGGING FACE NLP TRIAGE ARCHITECTURE</w:t>
             </w:r>
           </w:p>
         </w:tc>
         <w:tc>
           <w:tcPr>
-            <w:tcW w:type="dxa" w:w="2340"/>
+            <w:tcW w:type="dxa" w:w="1440"/>
           </w:tcPr>
           <w:p>
             <w:pPr>
-              <w:jc w:val="right"/>
+              <w:jc w:val="center"/>
             </w:pPr>
             <w:r>
+              <w:rPr>
+                <w:rFonts w:ascii="Times New Roman" w:hAnsi="Times New Roman"/>
+              </w:rPr>
               <w:t>6</w:t>
             </w:r>
           </w:p>
@@ -1938,43 +2145,66 @@
       <w:tr>
         <w:tc>
           <w:tcPr>
-            <w:tcW w:type="dxa" w:w="2340"/>
+            <w:tcW w:type="dxa" w:w="1296"/>
           </w:tcPr>
           <w:p>
+            <w:pPr>
+              <w:jc w:val="center"/>
+            </w:pPr>
             <w:r>
+              <w:rPr>
+                <w:rFonts w:ascii="Times New Roman" w:hAnsi="Times New Roman"/>
+              </w:rPr>
               <w:t>4</w:t>
             </w:r>
           </w:p>
         </w:tc>
         <w:tc>
           <w:tcPr>
-            <w:tcW w:type="dxa" w:w="2340"/>
+            <w:tcW w:type="dxa" w:w="1872"/>
           </w:tcPr>
           <w:p>
+            <w:pPr>
+              <w:jc w:val="center"/>
+            </w:pPr>
             <w:r>
+              <w:rPr>
+                <w:rFonts w:ascii="Times New Roman" w:hAnsi="Times New Roman"/>
+                <w:b/>
+              </w:rPr>
               <w:t>3.3</w:t>
             </w:r>
           </w:p>
         </w:tc>
         <w:tc>
           <w:tcPr>
-            <w:tcW w:type="dxa" w:w="2340"/>
+            <w:tcW w:type="dxa" w:w="4752"/>
           </w:tcPr>
           <w:p>
+            <w:pPr>
+              <w:jc w:val="center"/>
+            </w:pPr>
             <w:r>
+              <w:rPr>
+                <w:rFonts w:ascii="Times New Roman" w:hAnsi="Times New Roman"/>
+                <w:b/>
+              </w:rPr>
               <w:t>REAL EMAIL 2FA OTP SECURITY FLOW</w:t>
             </w:r>
           </w:p>
         </w:tc>
         <w:tc>
           <w:tcPr>
-            <w:tcW w:type="dxa" w:w="2340"/>
+            <w:tcW w:type="dxa" w:w="1440"/>
           </w:tcPr>
           <w:p>
             <w:pPr>
-              <w:jc w:val="right"/>
+              <w:jc w:val="center"/>
             </w:pPr>
             <w:r>
+              <w:rPr>
+                <w:rFonts w:ascii="Times New Roman" w:hAnsi="Times New Roman"/>
+              </w:rPr>
               <w:t>7</w:t>
             </w:r>
           </w:p>
@@ -1983,43 +2213,66 @@
       <w:tr>
         <w:tc>
           <w:tcPr>
-            <w:tcW w:type="dxa" w:w="2340"/>
+            <w:tcW w:type="dxa" w:w="1296"/>
           </w:tcPr>
           <w:p>
+            <w:pPr>
+              <w:jc w:val="center"/>
+            </w:pPr>
             <w:r>
+              <w:rPr>
+                <w:rFonts w:ascii="Times New Roman" w:hAnsi="Times New Roman"/>
+              </w:rPr>
               <w:t>5</w:t>
             </w:r>
           </w:p>
         </w:tc>
         <w:tc>
           <w:tcPr>
-            <w:tcW w:type="dxa" w:w="2340"/>
+            <w:tcW w:type="dxa" w:w="1872"/>
           </w:tcPr>
           <w:p>
+            <w:pPr>
+              <w:jc w:val="center"/>
+            </w:pPr>
             <w:r>
+              <w:rPr>
+                <w:rFonts w:ascii="Times New Roman" w:hAnsi="Times New Roman"/>
+                <w:b/>
+              </w:rPr>
               <w:t>3.4</w:t>
             </w:r>
           </w:p>
         </w:tc>
         <w:tc>
           <w:tcPr>
-            <w:tcW w:type="dxa" w:w="2340"/>
+            <w:tcW w:type="dxa" w:w="4752"/>
           </w:tcPr>
           <w:p>
+            <w:pPr>
+              <w:jc w:val="center"/>
+            </w:pPr>
             <w:r>
+              <w:rPr>
+                <w:rFonts w:ascii="Times New Roman" w:hAnsi="Times New Roman"/>
+                <w:b/>
+              </w:rPr>
               <w:t>CLOUD TELEPHONY &amp; EMERGENCY SOS DISPATCH</w:t>
             </w:r>
           </w:p>
         </w:tc>
         <w:tc>
           <w:tcPr>
-            <w:tcW w:type="dxa" w:w="2340"/>
+            <w:tcW w:type="dxa" w:w="1440"/>
           </w:tcPr>
           <w:p>
             <w:pPr>
-              <w:jc w:val="right"/>
+              <w:jc w:val="center"/>
             </w:pPr>
             <w:r>
+              <w:rPr>
+                <w:rFonts w:ascii="Times New Roman" w:hAnsi="Times New Roman"/>
+              </w:rPr>
               <w:t>8</w:t>
             </w:r>
           </w:p>
@@ -2028,43 +2281,66 @@
       <w:tr>
         <w:tc>
           <w:tcPr>
-            <w:tcW w:type="dxa" w:w="2340"/>
+            <w:tcW w:type="dxa" w:w="1296"/>
           </w:tcPr>
           <w:p>
+            <w:pPr>
+              <w:jc w:val="center"/>
+            </w:pPr>
             <w:r>
+              <w:rPr>
+                <w:rFonts w:ascii="Times New Roman" w:hAnsi="Times New Roman"/>
+              </w:rPr>
               <w:t>6</w:t>
             </w:r>
           </w:p>
         </w:tc>
         <w:tc>
           <w:tcPr>
-            <w:tcW w:type="dxa" w:w="2340"/>
+            <w:tcW w:type="dxa" w:w="1872"/>
           </w:tcPr>
           <w:p>
+            <w:pPr>
+              <w:jc w:val="center"/>
+            </w:pPr>
             <w:r>
+              <w:rPr>
+                <w:rFonts w:ascii="Times New Roman" w:hAnsi="Times New Roman"/>
+                <w:b/>
+              </w:rPr>
               <w:t>4.1</w:t>
             </w:r>
           </w:p>
         </w:tc>
         <w:tc>
           <w:tcPr>
-            <w:tcW w:type="dxa" w:w="2340"/>
+            <w:tcW w:type="dxa" w:w="4752"/>
           </w:tcPr>
           <w:p>
+            <w:pPr>
+              <w:jc w:val="center"/>
+            </w:pPr>
             <w:r>
+              <w:rPr>
+                <w:rFonts w:ascii="Times New Roman" w:hAnsi="Times New Roman"/>
+                <w:b/>
+              </w:rPr>
               <w:t>OVERALL SYSTEM ARCHITECTURE DIAGRAM</w:t>
             </w:r>
           </w:p>
         </w:tc>
         <w:tc>
           <w:tcPr>
-            <w:tcW w:type="dxa" w:w="2340"/>
+            <w:tcW w:type="dxa" w:w="1440"/>
           </w:tcPr>
           <w:p>
             <w:pPr>
-              <w:jc w:val="right"/>
+              <w:jc w:val="center"/>
             </w:pPr>
             <w:r>
+              <w:rPr>
+                <w:rFonts w:ascii="Times New Roman" w:hAnsi="Times New Roman"/>
+              </w:rPr>
               <w:t>10</w:t>
             </w:r>
           </w:p>
@@ -2073,43 +2349,66 @@
       <w:tr>
         <w:tc>
           <w:tcPr>
-            <w:tcW w:type="dxa" w:w="2340"/>
+            <w:tcW w:type="dxa" w:w="1296"/>
           </w:tcPr>
           <w:p>
+            <w:pPr>
+              <w:jc w:val="center"/>
+            </w:pPr>
             <w:r>
+              <w:rPr>
+                <w:rFonts w:ascii="Times New Roman" w:hAnsi="Times New Roman"/>
+              </w:rPr>
               <w:t>7</w:t>
             </w:r>
           </w:p>
         </w:tc>
         <w:tc>
           <w:tcPr>
-            <w:tcW w:type="dxa" w:w="2340"/>
+            <w:tcW w:type="dxa" w:w="1872"/>
           </w:tcPr>
           <w:p>
+            <w:pPr>
+              <w:jc w:val="center"/>
+            </w:pPr>
             <w:r>
+              <w:rPr>
+                <w:rFonts w:ascii="Times New Roman" w:hAnsi="Times New Roman"/>
+                <w:b/>
+              </w:rPr>
               <w:t>4.2</w:t>
             </w:r>
           </w:p>
         </w:tc>
         <w:tc>
           <w:tcPr>
-            <w:tcW w:type="dxa" w:w="2340"/>
+            <w:tcW w:type="dxa" w:w="4752"/>
           </w:tcPr>
           <w:p>
+            <w:pPr>
+              <w:jc w:val="center"/>
+            </w:pPr>
             <w:r>
+              <w:rPr>
+                <w:rFonts w:ascii="Times New Roman" w:hAnsi="Times New Roman"/>
+                <w:b/>
+              </w:rPr>
               <w:t>DFD LEVEL 0 (CONTEXT DIAGRAM)</w:t>
             </w:r>
           </w:p>
         </w:tc>
         <w:tc>
           <w:tcPr>
-            <w:tcW w:type="dxa" w:w="2340"/>
+            <w:tcW w:type="dxa" w:w="1440"/>
           </w:tcPr>
           <w:p>
             <w:pPr>
-              <w:jc w:val="right"/>
+              <w:jc w:val="center"/>
             </w:pPr>
             <w:r>
+              <w:rPr>
+                <w:rFonts w:ascii="Times New Roman" w:hAnsi="Times New Roman"/>
+              </w:rPr>
               <w:t>11</w:t>
             </w:r>
           </w:p>
@@ -2118,43 +2417,66 @@
       <w:tr>
         <w:tc>
           <w:tcPr>
-            <w:tcW w:type="dxa" w:w="2340"/>
+            <w:tcW w:type="dxa" w:w="1296"/>
           </w:tcPr>
           <w:p>
+            <w:pPr>
+              <w:jc w:val="center"/>
+            </w:pPr>
             <w:r>
+              <w:rPr>
+                <w:rFonts w:ascii="Times New Roman" w:hAnsi="Times New Roman"/>
+              </w:rPr>
               <w:t>8</w:t>
             </w:r>
           </w:p>
         </w:tc>
         <w:tc>
           <w:tcPr>
-            <w:tcW w:type="dxa" w:w="2340"/>
+            <w:tcW w:type="dxa" w:w="1872"/>
           </w:tcPr>
           <w:p>
+            <w:pPr>
+              <w:jc w:val="center"/>
+            </w:pPr>
             <w:r>
+              <w:rPr>
+                <w:rFonts w:ascii="Times New Roman" w:hAnsi="Times New Roman"/>
+                <w:b/>
+              </w:rPr>
               <w:t>4.3</w:t>
             </w:r>
           </w:p>
         </w:tc>
         <w:tc>
           <w:tcPr>
-            <w:tcW w:type="dxa" w:w="2340"/>
+            <w:tcW w:type="dxa" w:w="4752"/>
           </w:tcPr>
           <w:p>
+            <w:pPr>
+              <w:jc w:val="center"/>
+            </w:pPr>
             <w:r>
+              <w:rPr>
+                <w:rFonts w:ascii="Times New Roman" w:hAnsi="Times New Roman"/>
+                <w:b/>
+              </w:rPr>
               <w:t>DFD LEVEL 1 (SERVICE DESK PROCESSES)</w:t>
             </w:r>
           </w:p>
         </w:tc>
         <w:tc>
           <w:tcPr>
-            <w:tcW w:type="dxa" w:w="2340"/>
+            <w:tcW w:type="dxa" w:w="1440"/>
           </w:tcPr>
           <w:p>
             <w:pPr>
-              <w:jc w:val="right"/>
+              <w:jc w:val="center"/>
             </w:pPr>
             <w:r>
+              <w:rPr>
+                <w:rFonts w:ascii="Times New Roman" w:hAnsi="Times New Roman"/>
+              </w:rPr>
               <w:t>11</w:t>
             </w:r>
           </w:p>
@@ -2163,43 +2485,66 @@
       <w:tr>
         <w:tc>
           <w:tcPr>
-            <w:tcW w:type="dxa" w:w="2340"/>
+            <w:tcW w:type="dxa" w:w="1296"/>
           </w:tcPr>
           <w:p>
+            <w:pPr>
+              <w:jc w:val="center"/>
+            </w:pPr>
             <w:r>
+              <w:rPr>
+                <w:rFonts w:ascii="Times New Roman" w:hAnsi="Times New Roman"/>
+              </w:rPr>
               <w:t>9</w:t>
             </w:r>
           </w:p>
         </w:tc>
         <w:tc>
           <w:tcPr>
-            <w:tcW w:type="dxa" w:w="2340"/>
+            <w:tcW w:type="dxa" w:w="1872"/>
           </w:tcPr>
           <w:p>
+            <w:pPr>
+              <w:jc w:val="center"/>
+            </w:pPr>
             <w:r>
+              <w:rPr>
+                <w:rFonts w:ascii="Times New Roman" w:hAnsi="Times New Roman"/>
+                <w:b/>
+              </w:rPr>
               <w:t>4.4</w:t>
             </w:r>
           </w:p>
         </w:tc>
         <w:tc>
           <w:tcPr>
-            <w:tcW w:type="dxa" w:w="2340"/>
+            <w:tcW w:type="dxa" w:w="4752"/>
           </w:tcPr>
           <w:p>
+            <w:pPr>
+              <w:jc w:val="center"/>
+            </w:pPr>
             <w:r>
+              <w:rPr>
+                <w:rFonts w:ascii="Times New Roman" w:hAnsi="Times New Roman"/>
+                <w:b/>
+              </w:rPr>
               <w:t>DFD LEVEL 2 (AI TRIAGE &amp; SLA ENGINE)</w:t>
             </w:r>
           </w:p>
         </w:tc>
         <w:tc>
           <w:tcPr>
-            <w:tcW w:type="dxa" w:w="2340"/>
+            <w:tcW w:type="dxa" w:w="1440"/>
           </w:tcPr>
           <w:p>
             <w:pPr>
-              <w:jc w:val="right"/>
+              <w:jc w:val="center"/>
             </w:pPr>
             <w:r>
+              <w:rPr>
+                <w:rFonts w:ascii="Times New Roman" w:hAnsi="Times New Roman"/>
+              </w:rPr>
               <w:t>12</w:t>
             </w:r>
           </w:p>
@@ -2208,43 +2553,66 @@
       <w:tr>
         <w:tc>
           <w:tcPr>
-            <w:tcW w:type="dxa" w:w="2340"/>
+            <w:tcW w:type="dxa" w:w="1296"/>
           </w:tcPr>
           <w:p>
+            <w:pPr>
+              <w:jc w:val="center"/>
+            </w:pPr>
             <w:r>
+              <w:rPr>
+                <w:rFonts w:ascii="Times New Roman" w:hAnsi="Times New Roman"/>
+              </w:rPr>
               <w:t>10</w:t>
             </w:r>
           </w:p>
         </w:tc>
         <w:tc>
           <w:tcPr>
-            <w:tcW w:type="dxa" w:w="2340"/>
+            <w:tcW w:type="dxa" w:w="1872"/>
           </w:tcPr>
           <w:p>
+            <w:pPr>
+              <w:jc w:val="center"/>
+            </w:pPr>
             <w:r>
+              <w:rPr>
+                <w:rFonts w:ascii="Times New Roman" w:hAnsi="Times New Roman"/>
+                <w:b/>
+              </w:rPr>
               <w:t>5.1</w:t>
             </w:r>
           </w:p>
         </w:tc>
         <w:tc>
           <w:tcPr>
-            <w:tcW w:type="dxa" w:w="2340"/>
+            <w:tcW w:type="dxa" w:w="4752"/>
           </w:tcPr>
           <w:p>
+            <w:pPr>
+              <w:jc w:val="center"/>
+            </w:pPr>
             <w:r>
+              <w:rPr>
+                <w:rFonts w:ascii="Times New Roman" w:hAnsi="Times New Roman"/>
+                <w:b/>
+              </w:rPr>
               <w:t>AUTHENTICATION &amp; 2FA VERIFICATION SCREEN</w:t>
             </w:r>
           </w:p>
         </w:tc>
         <w:tc>
           <w:tcPr>
-            <w:tcW w:type="dxa" w:w="2340"/>
+            <w:tcW w:type="dxa" w:w="1440"/>
           </w:tcPr>
           <w:p>
             <w:pPr>
-              <w:jc w:val="right"/>
+              <w:jc w:val="center"/>
             </w:pPr>
             <w:r>
+              <w:rPr>
+                <w:rFonts w:ascii="Times New Roman" w:hAnsi="Times New Roman"/>
+              </w:rPr>
               <w:t>13</w:t>
             </w:r>
           </w:p>
@@ -2253,43 +2621,66 @@
       <w:tr>
         <w:tc>
           <w:tcPr>
-            <w:tcW w:type="dxa" w:w="2340"/>
+            <w:tcW w:type="dxa" w:w="1296"/>
           </w:tcPr>
           <w:p>
+            <w:pPr>
+              <w:jc w:val="center"/>
+            </w:pPr>
             <w:r>
+              <w:rPr>
+                <w:rFonts w:ascii="Times New Roman" w:hAnsi="Times New Roman"/>
+              </w:rPr>
               <w:t>11</w:t>
             </w:r>
           </w:p>
         </w:tc>
         <w:tc>
           <w:tcPr>
-            <w:tcW w:type="dxa" w:w="2340"/>
+            <w:tcW w:type="dxa" w:w="1872"/>
           </w:tcPr>
           <w:p>
+            <w:pPr>
+              <w:jc w:val="center"/>
+            </w:pPr>
             <w:r>
+              <w:rPr>
+                <w:rFonts w:ascii="Times New Roman" w:hAnsi="Times New Roman"/>
+                <w:b/>
+              </w:rPr>
               <w:t>5.2</w:t>
             </w:r>
           </w:p>
         </w:tc>
         <w:tc>
           <w:tcPr>
-            <w:tcW w:type="dxa" w:w="2340"/>
+            <w:tcW w:type="dxa" w:w="4752"/>
           </w:tcPr>
           <w:p>
+            <w:pPr>
+              <w:jc w:val="center"/>
+            </w:pPr>
             <w:r>
+              <w:rPr>
+                <w:rFonts w:ascii="Times New Roman" w:hAnsi="Times New Roman"/>
+                <w:b/>
+              </w:rPr>
               <w:t>LIVE AI TRIAGE PREVIEW &amp; WORK QUEUE SCREEN</w:t>
             </w:r>
           </w:p>
         </w:tc>
         <w:tc>
           <w:tcPr>
-            <w:tcW w:type="dxa" w:w="2340"/>
+            <w:tcW w:type="dxa" w:w="1440"/>
           </w:tcPr>
           <w:p>
             <w:pPr>
-              <w:jc w:val="right"/>
+              <w:jc w:val="center"/>
             </w:pPr>
             <w:r>
+              <w:rPr>
+                <w:rFonts w:ascii="Times New Roman" w:hAnsi="Times New Roman"/>
+              </w:rPr>
               <w:t>13</w:t>
             </w:r>
           </w:p>
@@ -2657,6 +3048,14 @@
         <w:jc w:val="center"/>
         <w:tblLayout w:type="fixed"/>
         <w:tblLook w:firstColumn="1" w:firstRow="1" w:lastColumn="0" w:lastRow="0" w:noHBand="0" w:noVBand="1" w:val="04A0"/>
+        <w:tblBorders>
+          <w:top w:val="single" w:sz="8" w:space="0" w:color="000000"/>
+          <w:left w:val="single" w:sz="8" w:space="0" w:color="000000"/>
+          <w:bottom w:val="single" w:sz="8" w:space="0" w:color="000000"/>
+          <w:right w:val="single" w:sz="8" w:space="0" w:color="000000"/>
+          <w:insideH w:val="single" w:sz="4" w:space="0" w:color="000000"/>
+          <w:insideV w:val="single" w:sz="4" w:space="0" w:color="000000"/>
+        </w:tblBorders>
       </w:tblPr>
       <w:tblGrid>
         <w:gridCol w:w="3120"/>
@@ -2766,7 +3165,7 @@
               </w:rPr>
               <w:t>Saraswathi S</w:t>
               <w:br/>
-              <w:t>Reg. No: RA2532241040034</w:t>
+              <w:t>Reg. No: RA2532241040036</w:t>
               <w:br/>
               <w:t>(Teammate)</w:t>
             </w:r>

</xml_diff>

<commit_message>
Apply thick crisp 1.5pt black table grid borders to TOC and List of Figures for SAM and Saraswathi reports
</commit_message>
<xml_diff>
--- a/Enterprise_IT_Service_Portal_Individual_Report_SAM.docx
+++ b/Enterprise_IT_Service_Portal_Individual_Report_SAM.docx
@@ -561,17 +561,18 @@
     </w:p>
     <w:tbl>
       <w:tblPr>
+        <w:tblStyle w:val="TableGrid"/>
         <w:tblW w:type="auto" w:w="0"/>
         <w:jc w:val="center"/>
         <w:tblLayout w:type="fixed"/>
         <w:tblLook w:firstColumn="1" w:firstRow="1" w:lastColumn="0" w:lastRow="0" w:noHBand="0" w:noVBand="1" w:val="04A0"/>
         <w:tblBorders>
-          <w:top w:val="single" w:sz="8" w:space="0" w:color="000000"/>
-          <w:left w:val="single" w:sz="8" w:space="0" w:color="000000"/>
-          <w:bottom w:val="single" w:sz="8" w:space="0" w:color="000000"/>
-          <w:right w:val="single" w:sz="8" w:space="0" w:color="000000"/>
-          <w:insideH w:val="single" w:sz="4" w:space="0" w:color="000000"/>
-          <w:insideV w:val="single" w:sz="4" w:space="0" w:color="000000"/>
+          <w:top w:val="single" w:sz="12" w:space="0" w:color="000000"/>
+          <w:left w:val="single" w:sz="12" w:space="0" w:color="000000"/>
+          <w:bottom w:val="single" w:sz="12" w:space="0" w:color="000000"/>
+          <w:right w:val="single" w:sz="12" w:space="0" w:color="000000"/>
+          <w:insideH w:val="single" w:sz="12" w:space="0" w:color="000000"/>
+          <w:insideV w:val="single" w:sz="12" w:space="0" w:color="000000"/>
         </w:tblBorders>
       </w:tblPr>
       <w:tblGrid>
@@ -582,7 +583,19 @@
       <w:tr>
         <w:tc>
           <w:tcPr>
-            <w:tcW w:type="dxa" w:w="1728"/>
+            <w:tcW w:type="dxa" w:w="3120"/>
+            <w:tcBorders>
+              <w:top w:val="single" w:sz="12" w:space="0" w:color="000000"/>
+              <w:left w:val="single" w:sz="12" w:space="0" w:color="000000"/>
+              <w:bottom w:val="single" w:sz="12" w:space="0" w:color="000000"/>
+              <w:right w:val="single" w:sz="12" w:space="0" w:color="000000"/>
+            </w:tcBorders>
+            <w:tcMar>
+              <w:top w:w="100" w:type="dxa"/>
+              <w:bottom w:w="100" w:type="dxa"/>
+              <w:left w:w="150" w:type="dxa"/>
+              <w:right w:w="150" w:type="dxa"/>
+            </w:tcMar>
           </w:tcPr>
           <w:p>
             <w:pPr>
@@ -600,7 +613,19 @@
         </w:tc>
         <w:tc>
           <w:tcPr>
-            <w:tcW w:type="dxa" w:w="6192"/>
+            <w:tcW w:type="dxa" w:w="3120"/>
+            <w:tcBorders>
+              <w:top w:val="single" w:sz="12" w:space="0" w:color="000000"/>
+              <w:left w:val="single" w:sz="12" w:space="0" w:color="000000"/>
+              <w:bottom w:val="single" w:sz="12" w:space="0" w:color="000000"/>
+              <w:right w:val="single" w:sz="12" w:space="0" w:color="000000"/>
+            </w:tcBorders>
+            <w:tcMar>
+              <w:top w:w="100" w:type="dxa"/>
+              <w:bottom w:w="100" w:type="dxa"/>
+              <w:left w:w="150" w:type="dxa"/>
+              <w:right w:w="150" w:type="dxa"/>
+            </w:tcMar>
           </w:tcPr>
           <w:p>
             <w:pPr>
@@ -616,7 +641,19 @@
         </w:tc>
         <w:tc>
           <w:tcPr>
-            <w:tcW w:type="dxa" w:w="1440"/>
+            <w:tcW w:type="dxa" w:w="3120"/>
+            <w:tcBorders>
+              <w:top w:val="single" w:sz="12" w:space="0" w:color="000000"/>
+              <w:left w:val="single" w:sz="12" w:space="0" w:color="000000"/>
+              <w:bottom w:val="single" w:sz="12" w:space="0" w:color="000000"/>
+              <w:right w:val="single" w:sz="12" w:space="0" w:color="000000"/>
+            </w:tcBorders>
+            <w:tcMar>
+              <w:top w:w="100" w:type="dxa"/>
+              <w:bottom w:w="100" w:type="dxa"/>
+              <w:left w:w="150" w:type="dxa"/>
+              <w:right w:w="150" w:type="dxa"/>
+            </w:tcMar>
           </w:tcPr>
           <w:p>
             <w:pPr>
@@ -636,7 +673,19 @@
       <w:tr>
         <w:tc>
           <w:tcPr>
-            <w:tcW w:type="dxa" w:w="1728"/>
+            <w:tcW w:type="dxa" w:w="3120"/>
+            <w:tcBorders>
+              <w:top w:val="single" w:sz="12" w:space="0" w:color="000000"/>
+              <w:left w:val="single" w:sz="12" w:space="0" w:color="000000"/>
+              <w:bottom w:val="single" w:sz="12" w:space="0" w:color="000000"/>
+              <w:right w:val="single" w:sz="12" w:space="0" w:color="000000"/>
+            </w:tcBorders>
+            <w:tcMar>
+              <w:top w:w="100" w:type="dxa"/>
+              <w:bottom w:w="100" w:type="dxa"/>
+              <w:left w:w="150" w:type="dxa"/>
+              <w:right w:w="150" w:type="dxa"/>
+            </w:tcMar>
           </w:tcPr>
           <w:p>
             <w:r/>
@@ -644,7 +693,19 @@
         </w:tc>
         <w:tc>
           <w:tcPr>
-            <w:tcW w:type="dxa" w:w="6192"/>
+            <w:tcW w:type="dxa" w:w="3120"/>
+            <w:tcBorders>
+              <w:top w:val="single" w:sz="12" w:space="0" w:color="000000"/>
+              <w:left w:val="single" w:sz="12" w:space="0" w:color="000000"/>
+              <w:bottom w:val="single" w:sz="12" w:space="0" w:color="000000"/>
+              <w:right w:val="single" w:sz="12" w:space="0" w:color="000000"/>
+            </w:tcBorders>
+            <w:tcMar>
+              <w:top w:w="100" w:type="dxa"/>
+              <w:bottom w:w="100" w:type="dxa"/>
+              <w:left w:w="150" w:type="dxa"/>
+              <w:right w:w="150" w:type="dxa"/>
+            </w:tcMar>
           </w:tcPr>
           <w:p>
             <w:r>
@@ -659,7 +720,19 @@
         </w:tc>
         <w:tc>
           <w:tcPr>
-            <w:tcW w:type="dxa" w:w="1440"/>
+            <w:tcW w:type="dxa" w:w="3120"/>
+            <w:tcBorders>
+              <w:top w:val="single" w:sz="12" w:space="0" w:color="000000"/>
+              <w:left w:val="single" w:sz="12" w:space="0" w:color="000000"/>
+              <w:bottom w:val="single" w:sz="12" w:space="0" w:color="000000"/>
+              <w:right w:val="single" w:sz="12" w:space="0" w:color="000000"/>
+            </w:tcBorders>
+            <w:tcMar>
+              <w:top w:w="100" w:type="dxa"/>
+              <w:bottom w:w="100" w:type="dxa"/>
+              <w:left w:w="150" w:type="dxa"/>
+              <w:right w:w="150" w:type="dxa"/>
+            </w:tcMar>
           </w:tcPr>
           <w:p>
             <w:pPr>
@@ -678,7 +751,19 @@
       <w:tr>
         <w:tc>
           <w:tcPr>
-            <w:tcW w:type="dxa" w:w="1728"/>
+            <w:tcW w:type="dxa" w:w="3120"/>
+            <w:tcBorders>
+              <w:top w:val="single" w:sz="12" w:space="0" w:color="000000"/>
+              <w:left w:val="single" w:sz="12" w:space="0" w:color="000000"/>
+              <w:bottom w:val="single" w:sz="12" w:space="0" w:color="000000"/>
+              <w:right w:val="single" w:sz="12" w:space="0" w:color="000000"/>
+            </w:tcBorders>
+            <w:tcMar>
+              <w:top w:w="100" w:type="dxa"/>
+              <w:bottom w:w="100" w:type="dxa"/>
+              <w:left w:w="150" w:type="dxa"/>
+              <w:right w:w="150" w:type="dxa"/>
+            </w:tcMar>
           </w:tcPr>
           <w:p>
             <w:r/>
@@ -686,7 +771,19 @@
         </w:tc>
         <w:tc>
           <w:tcPr>
-            <w:tcW w:type="dxa" w:w="6192"/>
+            <w:tcW w:type="dxa" w:w="3120"/>
+            <w:tcBorders>
+              <w:top w:val="single" w:sz="12" w:space="0" w:color="000000"/>
+              <w:left w:val="single" w:sz="12" w:space="0" w:color="000000"/>
+              <w:bottom w:val="single" w:sz="12" w:space="0" w:color="000000"/>
+              <w:right w:val="single" w:sz="12" w:space="0" w:color="000000"/>
+            </w:tcBorders>
+            <w:tcMar>
+              <w:top w:w="100" w:type="dxa"/>
+              <w:bottom w:w="100" w:type="dxa"/>
+              <w:left w:w="150" w:type="dxa"/>
+              <w:right w:w="150" w:type="dxa"/>
+            </w:tcMar>
           </w:tcPr>
           <w:p>
             <w:r>
@@ -701,7 +798,19 @@
         </w:tc>
         <w:tc>
           <w:tcPr>
-            <w:tcW w:type="dxa" w:w="1440"/>
+            <w:tcW w:type="dxa" w:w="3120"/>
+            <w:tcBorders>
+              <w:top w:val="single" w:sz="12" w:space="0" w:color="000000"/>
+              <w:left w:val="single" w:sz="12" w:space="0" w:color="000000"/>
+              <w:bottom w:val="single" w:sz="12" w:space="0" w:color="000000"/>
+              <w:right w:val="single" w:sz="12" w:space="0" w:color="000000"/>
+            </w:tcBorders>
+            <w:tcMar>
+              <w:top w:w="100" w:type="dxa"/>
+              <w:bottom w:w="100" w:type="dxa"/>
+              <w:left w:w="150" w:type="dxa"/>
+              <w:right w:w="150" w:type="dxa"/>
+            </w:tcMar>
           </w:tcPr>
           <w:p>
             <w:pPr>
@@ -720,7 +829,19 @@
       <w:tr>
         <w:tc>
           <w:tcPr>
-            <w:tcW w:type="dxa" w:w="1728"/>
+            <w:tcW w:type="dxa" w:w="3120"/>
+            <w:tcBorders>
+              <w:top w:val="single" w:sz="12" w:space="0" w:color="000000"/>
+              <w:left w:val="single" w:sz="12" w:space="0" w:color="000000"/>
+              <w:bottom w:val="single" w:sz="12" w:space="0" w:color="000000"/>
+              <w:right w:val="single" w:sz="12" w:space="0" w:color="000000"/>
+            </w:tcBorders>
+            <w:tcMar>
+              <w:top w:w="100" w:type="dxa"/>
+              <w:bottom w:w="100" w:type="dxa"/>
+              <w:left w:w="150" w:type="dxa"/>
+              <w:right w:w="150" w:type="dxa"/>
+            </w:tcMar>
           </w:tcPr>
           <w:p>
             <w:r/>
@@ -728,7 +849,19 @@
         </w:tc>
         <w:tc>
           <w:tcPr>
-            <w:tcW w:type="dxa" w:w="6192"/>
+            <w:tcW w:type="dxa" w:w="3120"/>
+            <w:tcBorders>
+              <w:top w:val="single" w:sz="12" w:space="0" w:color="000000"/>
+              <w:left w:val="single" w:sz="12" w:space="0" w:color="000000"/>
+              <w:bottom w:val="single" w:sz="12" w:space="0" w:color="000000"/>
+              <w:right w:val="single" w:sz="12" w:space="0" w:color="000000"/>
+            </w:tcBorders>
+            <w:tcMar>
+              <w:top w:w="100" w:type="dxa"/>
+              <w:bottom w:w="100" w:type="dxa"/>
+              <w:left w:w="150" w:type="dxa"/>
+              <w:right w:w="150" w:type="dxa"/>
+            </w:tcMar>
           </w:tcPr>
           <w:p>
             <w:r>
@@ -743,7 +876,19 @@
         </w:tc>
         <w:tc>
           <w:tcPr>
-            <w:tcW w:type="dxa" w:w="1440"/>
+            <w:tcW w:type="dxa" w:w="3120"/>
+            <w:tcBorders>
+              <w:top w:val="single" w:sz="12" w:space="0" w:color="000000"/>
+              <w:left w:val="single" w:sz="12" w:space="0" w:color="000000"/>
+              <w:bottom w:val="single" w:sz="12" w:space="0" w:color="000000"/>
+              <w:right w:val="single" w:sz="12" w:space="0" w:color="000000"/>
+            </w:tcBorders>
+            <w:tcMar>
+              <w:top w:w="100" w:type="dxa"/>
+              <w:bottom w:w="100" w:type="dxa"/>
+              <w:left w:w="150" w:type="dxa"/>
+              <w:right w:w="150" w:type="dxa"/>
+            </w:tcMar>
           </w:tcPr>
           <w:p>
             <w:pPr>
@@ -762,7 +907,19 @@
       <w:tr>
         <w:tc>
           <w:tcPr>
-            <w:tcW w:type="dxa" w:w="1728"/>
+            <w:tcW w:type="dxa" w:w="3120"/>
+            <w:tcBorders>
+              <w:top w:val="single" w:sz="12" w:space="0" w:color="000000"/>
+              <w:left w:val="single" w:sz="12" w:space="0" w:color="000000"/>
+              <w:bottom w:val="single" w:sz="12" w:space="0" w:color="000000"/>
+              <w:right w:val="single" w:sz="12" w:space="0" w:color="000000"/>
+            </w:tcBorders>
+            <w:tcMar>
+              <w:top w:w="100" w:type="dxa"/>
+              <w:bottom w:w="100" w:type="dxa"/>
+              <w:left w:w="150" w:type="dxa"/>
+              <w:right w:w="150" w:type="dxa"/>
+            </w:tcMar>
           </w:tcPr>
           <w:p>
             <w:r/>
@@ -770,7 +927,19 @@
         </w:tc>
         <w:tc>
           <w:tcPr>
-            <w:tcW w:type="dxa" w:w="6192"/>
+            <w:tcW w:type="dxa" w:w="3120"/>
+            <w:tcBorders>
+              <w:top w:val="single" w:sz="12" w:space="0" w:color="000000"/>
+              <w:left w:val="single" w:sz="12" w:space="0" w:color="000000"/>
+              <w:bottom w:val="single" w:sz="12" w:space="0" w:color="000000"/>
+              <w:right w:val="single" w:sz="12" w:space="0" w:color="000000"/>
+            </w:tcBorders>
+            <w:tcMar>
+              <w:top w:w="100" w:type="dxa"/>
+              <w:bottom w:w="100" w:type="dxa"/>
+              <w:left w:w="150" w:type="dxa"/>
+              <w:right w:w="150" w:type="dxa"/>
+            </w:tcMar>
           </w:tcPr>
           <w:p>
             <w:r>
@@ -785,7 +954,19 @@
         </w:tc>
         <w:tc>
           <w:tcPr>
-            <w:tcW w:type="dxa" w:w="1440"/>
+            <w:tcW w:type="dxa" w:w="3120"/>
+            <w:tcBorders>
+              <w:top w:val="single" w:sz="12" w:space="0" w:color="000000"/>
+              <w:left w:val="single" w:sz="12" w:space="0" w:color="000000"/>
+              <w:bottom w:val="single" w:sz="12" w:space="0" w:color="000000"/>
+              <w:right w:val="single" w:sz="12" w:space="0" w:color="000000"/>
+            </w:tcBorders>
+            <w:tcMar>
+              <w:top w:w="100" w:type="dxa"/>
+              <w:bottom w:w="100" w:type="dxa"/>
+              <w:left w:w="150" w:type="dxa"/>
+              <w:right w:w="150" w:type="dxa"/>
+            </w:tcMar>
           </w:tcPr>
           <w:p>
             <w:pPr>
@@ -804,7 +985,19 @@
       <w:tr>
         <w:tc>
           <w:tcPr>
-            <w:tcW w:type="dxa" w:w="1728"/>
+            <w:tcW w:type="dxa" w:w="3120"/>
+            <w:tcBorders>
+              <w:top w:val="single" w:sz="12" w:space="0" w:color="000000"/>
+              <w:left w:val="single" w:sz="12" w:space="0" w:color="000000"/>
+              <w:bottom w:val="single" w:sz="12" w:space="0" w:color="000000"/>
+              <w:right w:val="single" w:sz="12" w:space="0" w:color="000000"/>
+            </w:tcBorders>
+            <w:tcMar>
+              <w:top w:w="100" w:type="dxa"/>
+              <w:bottom w:w="100" w:type="dxa"/>
+              <w:left w:w="150" w:type="dxa"/>
+              <w:right w:w="150" w:type="dxa"/>
+            </w:tcMar>
           </w:tcPr>
           <w:p>
             <w:pPr>
@@ -822,7 +1015,19 @@
         </w:tc>
         <w:tc>
           <w:tcPr>
-            <w:tcW w:type="dxa" w:w="6192"/>
+            <w:tcW w:type="dxa" w:w="3120"/>
+            <w:tcBorders>
+              <w:top w:val="single" w:sz="12" w:space="0" w:color="000000"/>
+              <w:left w:val="single" w:sz="12" w:space="0" w:color="000000"/>
+              <w:bottom w:val="single" w:sz="12" w:space="0" w:color="000000"/>
+              <w:right w:val="single" w:sz="12" w:space="0" w:color="000000"/>
+            </w:tcBorders>
+            <w:tcMar>
+              <w:top w:w="100" w:type="dxa"/>
+              <w:bottom w:w="100" w:type="dxa"/>
+              <w:left w:w="150" w:type="dxa"/>
+              <w:right w:w="150" w:type="dxa"/>
+            </w:tcMar>
           </w:tcPr>
           <w:p>
             <w:pPr>
@@ -879,7 +1084,19 @@
         </w:tc>
         <w:tc>
           <w:tcPr>
-            <w:tcW w:type="dxa" w:w="1440"/>
+            <w:tcW w:type="dxa" w:w="3120"/>
+            <w:tcBorders>
+              <w:top w:val="single" w:sz="12" w:space="0" w:color="000000"/>
+              <w:left w:val="single" w:sz="12" w:space="0" w:color="000000"/>
+              <w:bottom w:val="single" w:sz="12" w:space="0" w:color="000000"/>
+              <w:right w:val="single" w:sz="12" w:space="0" w:color="000000"/>
+            </w:tcBorders>
+            <w:tcMar>
+              <w:top w:w="100" w:type="dxa"/>
+              <w:bottom w:w="100" w:type="dxa"/>
+              <w:left w:w="150" w:type="dxa"/>
+              <w:right w:w="150" w:type="dxa"/>
+            </w:tcMar>
           </w:tcPr>
           <w:p>
             <w:pPr>
@@ -942,7 +1159,19 @@
       <w:tr>
         <w:tc>
           <w:tcPr>
-            <w:tcW w:type="dxa" w:w="1728"/>
+            <w:tcW w:type="dxa" w:w="3120"/>
+            <w:tcBorders>
+              <w:top w:val="single" w:sz="12" w:space="0" w:color="000000"/>
+              <w:left w:val="single" w:sz="12" w:space="0" w:color="000000"/>
+              <w:bottom w:val="single" w:sz="12" w:space="0" w:color="000000"/>
+              <w:right w:val="single" w:sz="12" w:space="0" w:color="000000"/>
+            </w:tcBorders>
+            <w:tcMar>
+              <w:top w:w="100" w:type="dxa"/>
+              <w:bottom w:w="100" w:type="dxa"/>
+              <w:left w:w="150" w:type="dxa"/>
+              <w:right w:w="150" w:type="dxa"/>
+            </w:tcMar>
           </w:tcPr>
           <w:p>
             <w:pPr>
@@ -960,7 +1189,19 @@
         </w:tc>
         <w:tc>
           <w:tcPr>
-            <w:tcW w:type="dxa" w:w="6192"/>
+            <w:tcW w:type="dxa" w:w="3120"/>
+            <w:tcBorders>
+              <w:top w:val="single" w:sz="12" w:space="0" w:color="000000"/>
+              <w:left w:val="single" w:sz="12" w:space="0" w:color="000000"/>
+              <w:bottom w:val="single" w:sz="12" w:space="0" w:color="000000"/>
+              <w:right w:val="single" w:sz="12" w:space="0" w:color="000000"/>
+            </w:tcBorders>
+            <w:tcMar>
+              <w:top w:w="100" w:type="dxa"/>
+              <w:bottom w:w="100" w:type="dxa"/>
+              <w:left w:w="150" w:type="dxa"/>
+              <w:right w:w="150" w:type="dxa"/>
+            </w:tcMar>
           </w:tcPr>
           <w:p>
             <w:pPr>
@@ -1004,7 +1245,19 @@
         </w:tc>
         <w:tc>
           <w:tcPr>
-            <w:tcW w:type="dxa" w:w="1440"/>
+            <w:tcW w:type="dxa" w:w="3120"/>
+            <w:tcBorders>
+              <w:top w:val="single" w:sz="12" w:space="0" w:color="000000"/>
+              <w:left w:val="single" w:sz="12" w:space="0" w:color="000000"/>
+              <w:bottom w:val="single" w:sz="12" w:space="0" w:color="000000"/>
+              <w:right w:val="single" w:sz="12" w:space="0" w:color="000000"/>
+            </w:tcBorders>
+            <w:tcMar>
+              <w:top w:w="100" w:type="dxa"/>
+              <w:bottom w:w="100" w:type="dxa"/>
+              <w:left w:w="150" w:type="dxa"/>
+              <w:right w:w="150" w:type="dxa"/>
+            </w:tcMar>
           </w:tcPr>
           <w:p>
             <w:pPr>
@@ -1053,7 +1306,19 @@
       <w:tr>
         <w:tc>
           <w:tcPr>
-            <w:tcW w:type="dxa" w:w="1728"/>
+            <w:tcW w:type="dxa" w:w="3120"/>
+            <w:tcBorders>
+              <w:top w:val="single" w:sz="12" w:space="0" w:color="000000"/>
+              <w:left w:val="single" w:sz="12" w:space="0" w:color="000000"/>
+              <w:bottom w:val="single" w:sz="12" w:space="0" w:color="000000"/>
+              <w:right w:val="single" w:sz="12" w:space="0" w:color="000000"/>
+            </w:tcBorders>
+            <w:tcMar>
+              <w:top w:w="100" w:type="dxa"/>
+              <w:bottom w:w="100" w:type="dxa"/>
+              <w:left w:w="150" w:type="dxa"/>
+              <w:right w:w="150" w:type="dxa"/>
+            </w:tcMar>
           </w:tcPr>
           <w:p>
             <w:pPr>
@@ -1071,7 +1336,19 @@
         </w:tc>
         <w:tc>
           <w:tcPr>
-            <w:tcW w:type="dxa" w:w="6192"/>
+            <w:tcW w:type="dxa" w:w="3120"/>
+            <w:tcBorders>
+              <w:top w:val="single" w:sz="12" w:space="0" w:color="000000"/>
+              <w:left w:val="single" w:sz="12" w:space="0" w:color="000000"/>
+              <w:bottom w:val="single" w:sz="12" w:space="0" w:color="000000"/>
+              <w:right w:val="single" w:sz="12" w:space="0" w:color="000000"/>
+            </w:tcBorders>
+            <w:tcMar>
+              <w:top w:w="100" w:type="dxa"/>
+              <w:bottom w:w="100" w:type="dxa"/>
+              <w:left w:w="150" w:type="dxa"/>
+              <w:right w:w="150" w:type="dxa"/>
+            </w:tcMar>
           </w:tcPr>
           <w:p>
             <w:pPr>
@@ -1154,7 +1431,19 @@
         </w:tc>
         <w:tc>
           <w:tcPr>
-            <w:tcW w:type="dxa" w:w="1440"/>
+            <w:tcW w:type="dxa" w:w="3120"/>
+            <w:tcBorders>
+              <w:top w:val="single" w:sz="12" w:space="0" w:color="000000"/>
+              <w:left w:val="single" w:sz="12" w:space="0" w:color="000000"/>
+              <w:bottom w:val="single" w:sz="12" w:space="0" w:color="000000"/>
+              <w:right w:val="single" w:sz="12" w:space="0" w:color="000000"/>
+            </w:tcBorders>
+            <w:tcMar>
+              <w:top w:w="100" w:type="dxa"/>
+              <w:bottom w:w="100" w:type="dxa"/>
+              <w:left w:w="150" w:type="dxa"/>
+              <w:right w:w="150" w:type="dxa"/>
+            </w:tcMar>
           </w:tcPr>
           <w:p>
             <w:pPr>
@@ -1245,7 +1534,19 @@
       <w:tr>
         <w:tc>
           <w:tcPr>
-            <w:tcW w:type="dxa" w:w="1728"/>
+            <w:tcW w:type="dxa" w:w="3120"/>
+            <w:tcBorders>
+              <w:top w:val="single" w:sz="12" w:space="0" w:color="000000"/>
+              <w:left w:val="single" w:sz="12" w:space="0" w:color="000000"/>
+              <w:bottom w:val="single" w:sz="12" w:space="0" w:color="000000"/>
+              <w:right w:val="single" w:sz="12" w:space="0" w:color="000000"/>
+            </w:tcBorders>
+            <w:tcMar>
+              <w:top w:w="100" w:type="dxa"/>
+              <w:bottom w:w="100" w:type="dxa"/>
+              <w:left w:w="150" w:type="dxa"/>
+              <w:right w:w="150" w:type="dxa"/>
+            </w:tcMar>
           </w:tcPr>
           <w:p>
             <w:pPr>
@@ -1263,7 +1564,19 @@
         </w:tc>
         <w:tc>
           <w:tcPr>
-            <w:tcW w:type="dxa" w:w="6192"/>
+            <w:tcW w:type="dxa" w:w="3120"/>
+            <w:tcBorders>
+              <w:top w:val="single" w:sz="12" w:space="0" w:color="000000"/>
+              <w:left w:val="single" w:sz="12" w:space="0" w:color="000000"/>
+              <w:bottom w:val="single" w:sz="12" w:space="0" w:color="000000"/>
+              <w:right w:val="single" w:sz="12" w:space="0" w:color="000000"/>
+            </w:tcBorders>
+            <w:tcMar>
+              <w:top w:w="100" w:type="dxa"/>
+              <w:bottom w:w="100" w:type="dxa"/>
+              <w:left w:w="150" w:type="dxa"/>
+              <w:right w:w="150" w:type="dxa"/>
+            </w:tcMar>
           </w:tcPr>
           <w:p>
             <w:pPr>
@@ -1346,7 +1659,19 @@
         </w:tc>
         <w:tc>
           <w:tcPr>
-            <w:tcW w:type="dxa" w:w="1440"/>
+            <w:tcW w:type="dxa" w:w="3120"/>
+            <w:tcBorders>
+              <w:top w:val="single" w:sz="12" w:space="0" w:color="000000"/>
+              <w:left w:val="single" w:sz="12" w:space="0" w:color="000000"/>
+              <w:bottom w:val="single" w:sz="12" w:space="0" w:color="000000"/>
+              <w:right w:val="single" w:sz="12" w:space="0" w:color="000000"/>
+            </w:tcBorders>
+            <w:tcMar>
+              <w:top w:w="100" w:type="dxa"/>
+              <w:bottom w:w="100" w:type="dxa"/>
+              <w:left w:w="150" w:type="dxa"/>
+              <w:right w:w="150" w:type="dxa"/>
+            </w:tcMar>
           </w:tcPr>
           <w:p>
             <w:pPr>
@@ -1437,7 +1762,19 @@
       <w:tr>
         <w:tc>
           <w:tcPr>
-            <w:tcW w:type="dxa" w:w="1728"/>
+            <w:tcW w:type="dxa" w:w="3120"/>
+            <w:tcBorders>
+              <w:top w:val="single" w:sz="12" w:space="0" w:color="000000"/>
+              <w:left w:val="single" w:sz="12" w:space="0" w:color="000000"/>
+              <w:bottom w:val="single" w:sz="12" w:space="0" w:color="000000"/>
+              <w:right w:val="single" w:sz="12" w:space="0" w:color="000000"/>
+            </w:tcBorders>
+            <w:tcMar>
+              <w:top w:w="100" w:type="dxa"/>
+              <w:bottom w:w="100" w:type="dxa"/>
+              <w:left w:w="150" w:type="dxa"/>
+              <w:right w:w="150" w:type="dxa"/>
+            </w:tcMar>
           </w:tcPr>
           <w:p>
             <w:pPr>
@@ -1455,7 +1792,19 @@
         </w:tc>
         <w:tc>
           <w:tcPr>
-            <w:tcW w:type="dxa" w:w="6192"/>
+            <w:tcW w:type="dxa" w:w="3120"/>
+            <w:tcBorders>
+              <w:top w:val="single" w:sz="12" w:space="0" w:color="000000"/>
+              <w:left w:val="single" w:sz="12" w:space="0" w:color="000000"/>
+              <w:bottom w:val="single" w:sz="12" w:space="0" w:color="000000"/>
+              <w:right w:val="single" w:sz="12" w:space="0" w:color="000000"/>
+            </w:tcBorders>
+            <w:tcMar>
+              <w:top w:w="100" w:type="dxa"/>
+              <w:bottom w:w="100" w:type="dxa"/>
+              <w:left w:w="150" w:type="dxa"/>
+              <w:right w:w="150" w:type="dxa"/>
+            </w:tcMar>
           </w:tcPr>
           <w:p>
             <w:pPr>
@@ -1512,7 +1861,19 @@
         </w:tc>
         <w:tc>
           <w:tcPr>
-            <w:tcW w:type="dxa" w:w="1440"/>
+            <w:tcW w:type="dxa" w:w="3120"/>
+            <w:tcBorders>
+              <w:top w:val="single" w:sz="12" w:space="0" w:color="000000"/>
+              <w:left w:val="single" w:sz="12" w:space="0" w:color="000000"/>
+              <w:bottom w:val="single" w:sz="12" w:space="0" w:color="000000"/>
+              <w:right w:val="single" w:sz="12" w:space="0" w:color="000000"/>
+            </w:tcBorders>
+            <w:tcMar>
+              <w:top w:w="100" w:type="dxa"/>
+              <w:bottom w:w="100" w:type="dxa"/>
+              <w:left w:w="150" w:type="dxa"/>
+              <w:right w:w="150" w:type="dxa"/>
+            </w:tcMar>
           </w:tcPr>
           <w:p>
             <w:pPr>
@@ -1575,7 +1936,19 @@
       <w:tr>
         <w:tc>
           <w:tcPr>
-            <w:tcW w:type="dxa" w:w="1728"/>
+            <w:tcW w:type="dxa" w:w="3120"/>
+            <w:tcBorders>
+              <w:top w:val="single" w:sz="12" w:space="0" w:color="000000"/>
+              <w:left w:val="single" w:sz="12" w:space="0" w:color="000000"/>
+              <w:bottom w:val="single" w:sz="12" w:space="0" w:color="000000"/>
+              <w:right w:val="single" w:sz="12" w:space="0" w:color="000000"/>
+            </w:tcBorders>
+            <w:tcMar>
+              <w:top w:w="100" w:type="dxa"/>
+              <w:bottom w:w="100" w:type="dxa"/>
+              <w:left w:w="150" w:type="dxa"/>
+              <w:right w:w="150" w:type="dxa"/>
+            </w:tcMar>
           </w:tcPr>
           <w:p>
             <w:pPr>
@@ -1593,7 +1966,19 @@
         </w:tc>
         <w:tc>
           <w:tcPr>
-            <w:tcW w:type="dxa" w:w="6192"/>
+            <w:tcW w:type="dxa" w:w="3120"/>
+            <w:tcBorders>
+              <w:top w:val="single" w:sz="12" w:space="0" w:color="000000"/>
+              <w:left w:val="single" w:sz="12" w:space="0" w:color="000000"/>
+              <w:bottom w:val="single" w:sz="12" w:space="0" w:color="000000"/>
+              <w:right w:val="single" w:sz="12" w:space="0" w:color="000000"/>
+            </w:tcBorders>
+            <w:tcMar>
+              <w:top w:w="100" w:type="dxa"/>
+              <w:bottom w:w="100" w:type="dxa"/>
+              <w:left w:w="150" w:type="dxa"/>
+              <w:right w:w="150" w:type="dxa"/>
+            </w:tcMar>
           </w:tcPr>
           <w:p>
             <w:pPr>
@@ -1650,7 +2035,19 @@
         </w:tc>
         <w:tc>
           <w:tcPr>
-            <w:tcW w:type="dxa" w:w="1440"/>
+            <w:tcW w:type="dxa" w:w="3120"/>
+            <w:tcBorders>
+              <w:top w:val="single" w:sz="12" w:space="0" w:color="000000"/>
+              <w:left w:val="single" w:sz="12" w:space="0" w:color="000000"/>
+              <w:bottom w:val="single" w:sz="12" w:space="0" w:color="000000"/>
+              <w:right w:val="single" w:sz="12" w:space="0" w:color="000000"/>
+            </w:tcBorders>
+            <w:tcMar>
+              <w:top w:w="100" w:type="dxa"/>
+              <w:bottom w:w="100" w:type="dxa"/>
+              <w:left w:w="150" w:type="dxa"/>
+              <w:right w:w="150" w:type="dxa"/>
+            </w:tcMar>
           </w:tcPr>
           <w:p>
             <w:pPr>
@@ -1713,7 +2110,19 @@
       <w:tr>
         <w:tc>
           <w:tcPr>
-            <w:tcW w:type="dxa" w:w="1728"/>
+            <w:tcW w:type="dxa" w:w="3120"/>
+            <w:tcBorders>
+              <w:top w:val="single" w:sz="12" w:space="0" w:color="000000"/>
+              <w:left w:val="single" w:sz="12" w:space="0" w:color="000000"/>
+              <w:bottom w:val="single" w:sz="12" w:space="0" w:color="000000"/>
+              <w:right w:val="single" w:sz="12" w:space="0" w:color="000000"/>
+            </w:tcBorders>
+            <w:tcMar>
+              <w:top w:w="100" w:type="dxa"/>
+              <w:bottom w:w="100" w:type="dxa"/>
+              <w:left w:w="150" w:type="dxa"/>
+              <w:right w:w="150" w:type="dxa"/>
+            </w:tcMar>
           </w:tcPr>
           <w:p>
             <w:pPr>
@@ -1731,7 +2140,19 @@
         </w:tc>
         <w:tc>
           <w:tcPr>
-            <w:tcW w:type="dxa" w:w="6192"/>
+            <w:tcW w:type="dxa" w:w="3120"/>
+            <w:tcBorders>
+              <w:top w:val="single" w:sz="12" w:space="0" w:color="000000"/>
+              <w:left w:val="single" w:sz="12" w:space="0" w:color="000000"/>
+              <w:bottom w:val="single" w:sz="12" w:space="0" w:color="000000"/>
+              <w:right w:val="single" w:sz="12" w:space="0" w:color="000000"/>
+            </w:tcBorders>
+            <w:tcMar>
+              <w:top w:w="100" w:type="dxa"/>
+              <w:bottom w:w="100" w:type="dxa"/>
+              <w:left w:w="150" w:type="dxa"/>
+              <w:right w:w="150" w:type="dxa"/>
+            </w:tcMar>
           </w:tcPr>
           <w:p>
             <w:pPr>
@@ -1749,7 +2170,19 @@
         </w:tc>
         <w:tc>
           <w:tcPr>
-            <w:tcW w:type="dxa" w:w="1440"/>
+            <w:tcW w:type="dxa" w:w="3120"/>
+            <w:tcBorders>
+              <w:top w:val="single" w:sz="12" w:space="0" w:color="000000"/>
+              <w:left w:val="single" w:sz="12" w:space="0" w:color="000000"/>
+              <w:bottom w:val="single" w:sz="12" w:space="0" w:color="000000"/>
+              <w:right w:val="single" w:sz="12" w:space="0" w:color="000000"/>
+            </w:tcBorders>
+            <w:tcMar>
+              <w:top w:w="100" w:type="dxa"/>
+              <w:bottom w:w="100" w:type="dxa"/>
+              <w:left w:w="150" w:type="dxa"/>
+              <w:right w:w="150" w:type="dxa"/>
+            </w:tcMar>
           </w:tcPr>
           <w:p>
             <w:pPr>
@@ -1767,51 +2200,161 @@
           </w:p>
         </w:tc>
       </w:tr>
+      <w:tr>
+        <w:tc>
+          <w:tcPr>
+            <w:tcW w:type="dxa" w:w="3120"/>
+            <w:tcBorders>
+              <w:top w:val="single" w:sz="12" w:space="0" w:color="000000"/>
+              <w:left w:val="single" w:sz="12" w:space="0" w:color="000000"/>
+              <w:bottom w:val="single" w:sz="12" w:space="0" w:color="000000"/>
+              <w:right w:val="single" w:sz="12" w:space="0" w:color="000000"/>
+            </w:tcBorders>
+            <w:tcMar>
+              <w:top w:w="100" w:type="dxa"/>
+              <w:bottom w:w="100" w:type="dxa"/>
+              <w:left w:w="150" w:type="dxa"/>
+              <w:right w:w="150" w:type="dxa"/>
+            </w:tcMar>
+          </w:tcPr>
+          <w:p>
+            <w:r/>
+          </w:p>
+        </w:tc>
+        <w:tc>
+          <w:tcPr>
+            <w:tcW w:type="dxa" w:w="3120"/>
+            <w:tcBorders>
+              <w:top w:val="single" w:sz="12" w:space="0" w:color="000000"/>
+              <w:left w:val="single" w:sz="12" w:space="0" w:color="000000"/>
+              <w:bottom w:val="single" w:sz="12" w:space="0" w:color="000000"/>
+              <w:right w:val="single" w:sz="12" w:space="0" w:color="000000"/>
+            </w:tcBorders>
+            <w:tcMar>
+              <w:top w:w="100" w:type="dxa"/>
+              <w:bottom w:w="100" w:type="dxa"/>
+              <w:left w:w="150" w:type="dxa"/>
+              <w:right w:w="150" w:type="dxa"/>
+            </w:tcMar>
+          </w:tcPr>
+          <w:p>
+            <w:r>
+              <w:rPr>
+                <w:rFonts w:ascii="Times New Roman" w:hAnsi="Times New Roman"/>
+                <w:b/>
+              </w:rPr>
+              <w:t>APPENDIX</w:t>
+            </w:r>
+          </w:p>
+        </w:tc>
+        <w:tc>
+          <w:tcPr>
+            <w:tcW w:type="dxa" w:w="3120"/>
+            <w:tcBorders>
+              <w:top w:val="single" w:sz="12" w:space="0" w:color="000000"/>
+              <w:left w:val="single" w:sz="12" w:space="0" w:color="000000"/>
+              <w:bottom w:val="single" w:sz="12" w:space="0" w:color="000000"/>
+              <w:right w:val="single" w:sz="12" w:space="0" w:color="000000"/>
+            </w:tcBorders>
+            <w:tcMar>
+              <w:top w:w="100" w:type="dxa"/>
+              <w:bottom w:w="100" w:type="dxa"/>
+              <w:left w:w="150" w:type="dxa"/>
+              <w:right w:w="150" w:type="dxa"/>
+            </w:tcMar>
+          </w:tcPr>
+          <w:p>
+            <w:pPr>
+              <w:jc w:val="center"/>
+            </w:pPr>
+            <w:r>
+              <w:rPr>
+                <w:rFonts w:ascii="Times New Roman" w:hAnsi="Times New Roman"/>
+                <w:b/>
+              </w:rPr>
+              <w:t>16</w:t>
+            </w:r>
+          </w:p>
+        </w:tc>
+      </w:tr>
+      <w:tr>
+        <w:tc>
+          <w:tcPr>
+            <w:tcW w:type="dxa" w:w="3120"/>
+            <w:tcBorders>
+              <w:top w:val="single" w:sz="12" w:space="0" w:color="000000"/>
+              <w:left w:val="single" w:sz="12" w:space="0" w:color="000000"/>
+              <w:bottom w:val="single" w:sz="12" w:space="0" w:color="000000"/>
+              <w:right w:val="single" w:sz="12" w:space="0" w:color="000000"/>
+            </w:tcBorders>
+            <w:tcMar>
+              <w:top w:w="100" w:type="dxa"/>
+              <w:bottom w:w="100" w:type="dxa"/>
+              <w:left w:w="150" w:type="dxa"/>
+              <w:right w:w="150" w:type="dxa"/>
+            </w:tcMar>
+          </w:tcPr>
+          <w:p>
+            <w:r/>
+          </w:p>
+        </w:tc>
+        <w:tc>
+          <w:tcPr>
+            <w:tcW w:type="dxa" w:w="3120"/>
+            <w:tcBorders>
+              <w:top w:val="single" w:sz="12" w:space="0" w:color="000000"/>
+              <w:left w:val="single" w:sz="12" w:space="0" w:color="000000"/>
+              <w:bottom w:val="single" w:sz="12" w:space="0" w:color="000000"/>
+              <w:right w:val="single" w:sz="12" w:space="0" w:color="000000"/>
+            </w:tcBorders>
+            <w:tcMar>
+              <w:top w:w="100" w:type="dxa"/>
+              <w:bottom w:w="100" w:type="dxa"/>
+              <w:left w:w="150" w:type="dxa"/>
+              <w:right w:w="150" w:type="dxa"/>
+            </w:tcMar>
+          </w:tcPr>
+          <w:p>
+            <w:r>
+              <w:rPr>
+                <w:rFonts w:ascii="Times New Roman" w:hAnsi="Times New Roman"/>
+                <w:b/>
+              </w:rPr>
+              <w:t>REFERENCES</w:t>
+            </w:r>
+          </w:p>
+        </w:tc>
+        <w:tc>
+          <w:tcPr>
+            <w:tcW w:type="dxa" w:w="3120"/>
+            <w:tcBorders>
+              <w:top w:val="single" w:sz="12" w:space="0" w:color="000000"/>
+              <w:left w:val="single" w:sz="12" w:space="0" w:color="000000"/>
+              <w:bottom w:val="single" w:sz="12" w:space="0" w:color="000000"/>
+              <w:right w:val="single" w:sz="12" w:space="0" w:color="000000"/>
+            </w:tcBorders>
+            <w:tcMar>
+              <w:top w:w="100" w:type="dxa"/>
+              <w:bottom w:w="100" w:type="dxa"/>
+              <w:left w:w="150" w:type="dxa"/>
+              <w:right w:w="150" w:type="dxa"/>
+            </w:tcMar>
+          </w:tcPr>
+          <w:p>
+            <w:pPr>
+              <w:jc w:val="center"/>
+            </w:pPr>
+            <w:r>
+              <w:rPr>
+                <w:rFonts w:ascii="Times New Roman" w:hAnsi="Times New Roman"/>
+                <w:b/>
+              </w:rPr>
+              <w:t>20</w:t>
+            </w:r>
+          </w:p>
+        </w:tc>
+      </w:tr>
     </w:tbl>
-    <w:p>
-      <w:pPr>
-        <w:spacing w:before="360" w:after="120"/>
-        <w:jc w:val="center"/>
-      </w:pPr>
-      <w:r>
-        <w:rPr>
-          <w:rFonts w:ascii="Times New Roman" w:hAnsi="Times New Roman"/>
-          <w:b/>
-        </w:rPr>
-        <w:t>APPENDIX</w:t>
-        <w:tab/>
-        <w:tab/>
-        <w:tab/>
-        <w:tab/>
-        <w:tab/>
-        <w:tab/>
-        <w:tab/>
-        <w:tab/>
-        <w:t>16</w:t>
-      </w:r>
-    </w:p>
-    <w:p>
-      <w:pPr>
-        <w:spacing w:after="360"/>
-        <w:jc w:val="center"/>
-      </w:pPr>
-      <w:r>
-        <w:rPr>
-          <w:rFonts w:ascii="Times New Roman" w:hAnsi="Times New Roman"/>
-          <w:b/>
-        </w:rPr>
-        <w:t>REFERENCES</w:t>
-        <w:tab/>
-        <w:tab/>
-        <w:tab/>
-        <w:tab/>
-        <w:tab/>
-        <w:tab/>
-        <w:tab/>
-        <w:tab/>
-        <w:t>20</w:t>
-      </w:r>
-    </w:p>
     <w:p>
       <w:r>
         <w:br w:type="page"/>
@@ -1845,17 +2388,18 @@
     </w:p>
     <w:tbl>
       <w:tblPr>
+        <w:tblStyle w:val="TableGrid"/>
         <w:tblW w:type="auto" w:w="0"/>
         <w:jc w:val="center"/>
         <w:tblLayout w:type="fixed"/>
         <w:tblLook w:firstColumn="1" w:firstRow="1" w:lastColumn="0" w:lastRow="0" w:noHBand="0" w:noVBand="1" w:val="04A0"/>
         <w:tblBorders>
-          <w:top w:val="single" w:sz="8" w:space="0" w:color="000000"/>
-          <w:left w:val="single" w:sz="8" w:space="0" w:color="000000"/>
-          <w:bottom w:val="single" w:sz="8" w:space="0" w:color="000000"/>
-          <w:right w:val="single" w:sz="8" w:space="0" w:color="000000"/>
-          <w:insideH w:val="single" w:sz="4" w:space="0" w:color="000000"/>
-          <w:insideV w:val="single" w:sz="4" w:space="0" w:color="000000"/>
+          <w:top w:val="single" w:sz="12" w:space="0" w:color="000000"/>
+          <w:left w:val="single" w:sz="12" w:space="0" w:color="000000"/>
+          <w:bottom w:val="single" w:sz="12" w:space="0" w:color="000000"/>
+          <w:right w:val="single" w:sz="12" w:space="0" w:color="000000"/>
+          <w:insideH w:val="single" w:sz="12" w:space="0" w:color="000000"/>
+          <w:insideV w:val="single" w:sz="12" w:space="0" w:color="000000"/>
         </w:tblBorders>
       </w:tblPr>
       <w:tblGrid>
@@ -1868,6 +2412,18 @@
         <w:tc>
           <w:tcPr>
             <w:tcW w:type="dxa" w:w="1296"/>
+            <w:tcBorders>
+              <w:top w:val="single" w:sz="12" w:space="0" w:color="000000"/>
+              <w:left w:val="single" w:sz="12" w:space="0" w:color="000000"/>
+              <w:bottom w:val="single" w:sz="12" w:space="0" w:color="000000"/>
+              <w:right w:val="single" w:sz="12" w:space="0" w:color="000000"/>
+            </w:tcBorders>
+            <w:tcMar>
+              <w:top w:w="100" w:type="dxa"/>
+              <w:bottom w:w="100" w:type="dxa"/>
+              <w:left w:w="150" w:type="dxa"/>
+              <w:right w:w="150" w:type="dxa"/>
+            </w:tcMar>
           </w:tcPr>
           <w:p>
             <w:pPr>
@@ -1886,6 +2442,18 @@
         <w:tc>
           <w:tcPr>
             <w:tcW w:type="dxa" w:w="1872"/>
+            <w:tcBorders>
+              <w:top w:val="single" w:sz="12" w:space="0" w:color="000000"/>
+              <w:left w:val="single" w:sz="12" w:space="0" w:color="000000"/>
+              <w:bottom w:val="single" w:sz="12" w:space="0" w:color="000000"/>
+              <w:right w:val="single" w:sz="12" w:space="0" w:color="000000"/>
+            </w:tcBorders>
+            <w:tcMar>
+              <w:top w:w="100" w:type="dxa"/>
+              <w:bottom w:w="100" w:type="dxa"/>
+              <w:left w:w="150" w:type="dxa"/>
+              <w:right w:w="150" w:type="dxa"/>
+            </w:tcMar>
           </w:tcPr>
           <w:p>
             <w:pPr>
@@ -1904,6 +2472,18 @@
         <w:tc>
           <w:tcPr>
             <w:tcW w:type="dxa" w:w="4752"/>
+            <w:tcBorders>
+              <w:top w:val="single" w:sz="12" w:space="0" w:color="000000"/>
+              <w:left w:val="single" w:sz="12" w:space="0" w:color="000000"/>
+              <w:bottom w:val="single" w:sz="12" w:space="0" w:color="000000"/>
+              <w:right w:val="single" w:sz="12" w:space="0" w:color="000000"/>
+            </w:tcBorders>
+            <w:tcMar>
+              <w:top w:w="100" w:type="dxa"/>
+              <w:bottom w:w="100" w:type="dxa"/>
+              <w:left w:w="150" w:type="dxa"/>
+              <w:right w:w="150" w:type="dxa"/>
+            </w:tcMar>
           </w:tcPr>
           <w:p>
             <w:pPr>
@@ -1922,6 +2502,18 @@
         <w:tc>
           <w:tcPr>
             <w:tcW w:type="dxa" w:w="1440"/>
+            <w:tcBorders>
+              <w:top w:val="single" w:sz="12" w:space="0" w:color="000000"/>
+              <w:left w:val="single" w:sz="12" w:space="0" w:color="000000"/>
+              <w:bottom w:val="single" w:sz="12" w:space="0" w:color="000000"/>
+              <w:right w:val="single" w:sz="12" w:space="0" w:color="000000"/>
+            </w:tcBorders>
+            <w:tcMar>
+              <w:top w:w="100" w:type="dxa"/>
+              <w:bottom w:w="100" w:type="dxa"/>
+              <w:left w:w="150" w:type="dxa"/>
+              <w:right w:w="150" w:type="dxa"/>
+            </w:tcMar>
           </w:tcPr>
           <w:p>
             <w:pPr>
@@ -1942,6 +2534,18 @@
         <w:tc>
           <w:tcPr>
             <w:tcW w:type="dxa" w:w="1296"/>
+            <w:tcBorders>
+              <w:top w:val="single" w:sz="12" w:space="0" w:color="000000"/>
+              <w:left w:val="single" w:sz="12" w:space="0" w:color="000000"/>
+              <w:bottom w:val="single" w:sz="12" w:space="0" w:color="000000"/>
+              <w:right w:val="single" w:sz="12" w:space="0" w:color="000000"/>
+            </w:tcBorders>
+            <w:tcMar>
+              <w:top w:w="100" w:type="dxa"/>
+              <w:bottom w:w="100" w:type="dxa"/>
+              <w:left w:w="150" w:type="dxa"/>
+              <w:right w:w="150" w:type="dxa"/>
+            </w:tcMar>
           </w:tcPr>
           <w:p>
             <w:pPr>
@@ -1958,6 +2562,18 @@
         <w:tc>
           <w:tcPr>
             <w:tcW w:type="dxa" w:w="1872"/>
+            <w:tcBorders>
+              <w:top w:val="single" w:sz="12" w:space="0" w:color="000000"/>
+              <w:left w:val="single" w:sz="12" w:space="0" w:color="000000"/>
+              <w:bottom w:val="single" w:sz="12" w:space="0" w:color="000000"/>
+              <w:right w:val="single" w:sz="12" w:space="0" w:color="000000"/>
+            </w:tcBorders>
+            <w:tcMar>
+              <w:top w:w="100" w:type="dxa"/>
+              <w:bottom w:w="100" w:type="dxa"/>
+              <w:left w:w="150" w:type="dxa"/>
+              <w:right w:w="150" w:type="dxa"/>
+            </w:tcMar>
           </w:tcPr>
           <w:p>
             <w:pPr>
@@ -1975,6 +2591,18 @@
         <w:tc>
           <w:tcPr>
             <w:tcW w:type="dxa" w:w="4752"/>
+            <w:tcBorders>
+              <w:top w:val="single" w:sz="12" w:space="0" w:color="000000"/>
+              <w:left w:val="single" w:sz="12" w:space="0" w:color="000000"/>
+              <w:bottom w:val="single" w:sz="12" w:space="0" w:color="000000"/>
+              <w:right w:val="single" w:sz="12" w:space="0" w:color="000000"/>
+            </w:tcBorders>
+            <w:tcMar>
+              <w:top w:w="100" w:type="dxa"/>
+              <w:bottom w:w="100" w:type="dxa"/>
+              <w:left w:w="150" w:type="dxa"/>
+              <w:right w:w="150" w:type="dxa"/>
+            </w:tcMar>
           </w:tcPr>
           <w:p>
             <w:pPr>
@@ -1992,6 +2620,18 @@
         <w:tc>
           <w:tcPr>
             <w:tcW w:type="dxa" w:w="1440"/>
+            <w:tcBorders>
+              <w:top w:val="single" w:sz="12" w:space="0" w:color="000000"/>
+              <w:left w:val="single" w:sz="12" w:space="0" w:color="000000"/>
+              <w:bottom w:val="single" w:sz="12" w:space="0" w:color="000000"/>
+              <w:right w:val="single" w:sz="12" w:space="0" w:color="000000"/>
+            </w:tcBorders>
+            <w:tcMar>
+              <w:top w:w="100" w:type="dxa"/>
+              <w:bottom w:w="100" w:type="dxa"/>
+              <w:left w:w="150" w:type="dxa"/>
+              <w:right w:w="150" w:type="dxa"/>
+            </w:tcMar>
           </w:tcPr>
           <w:p>
             <w:pPr>
@@ -2010,6 +2650,18 @@
         <w:tc>
           <w:tcPr>
             <w:tcW w:type="dxa" w:w="1296"/>
+            <w:tcBorders>
+              <w:top w:val="single" w:sz="12" w:space="0" w:color="000000"/>
+              <w:left w:val="single" w:sz="12" w:space="0" w:color="000000"/>
+              <w:bottom w:val="single" w:sz="12" w:space="0" w:color="000000"/>
+              <w:right w:val="single" w:sz="12" w:space="0" w:color="000000"/>
+            </w:tcBorders>
+            <w:tcMar>
+              <w:top w:w="100" w:type="dxa"/>
+              <w:bottom w:w="100" w:type="dxa"/>
+              <w:left w:w="150" w:type="dxa"/>
+              <w:right w:w="150" w:type="dxa"/>
+            </w:tcMar>
           </w:tcPr>
           <w:p>
             <w:pPr>
@@ -2026,6 +2678,18 @@
         <w:tc>
           <w:tcPr>
             <w:tcW w:type="dxa" w:w="1872"/>
+            <w:tcBorders>
+              <w:top w:val="single" w:sz="12" w:space="0" w:color="000000"/>
+              <w:left w:val="single" w:sz="12" w:space="0" w:color="000000"/>
+              <w:bottom w:val="single" w:sz="12" w:space="0" w:color="000000"/>
+              <w:right w:val="single" w:sz="12" w:space="0" w:color="000000"/>
+            </w:tcBorders>
+            <w:tcMar>
+              <w:top w:w="100" w:type="dxa"/>
+              <w:bottom w:w="100" w:type="dxa"/>
+              <w:left w:w="150" w:type="dxa"/>
+              <w:right w:w="150" w:type="dxa"/>
+            </w:tcMar>
           </w:tcPr>
           <w:p>
             <w:pPr>
@@ -2043,6 +2707,18 @@
         <w:tc>
           <w:tcPr>
             <w:tcW w:type="dxa" w:w="4752"/>
+            <w:tcBorders>
+              <w:top w:val="single" w:sz="12" w:space="0" w:color="000000"/>
+              <w:left w:val="single" w:sz="12" w:space="0" w:color="000000"/>
+              <w:bottom w:val="single" w:sz="12" w:space="0" w:color="000000"/>
+              <w:right w:val="single" w:sz="12" w:space="0" w:color="000000"/>
+            </w:tcBorders>
+            <w:tcMar>
+              <w:top w:w="100" w:type="dxa"/>
+              <w:bottom w:w="100" w:type="dxa"/>
+              <w:left w:w="150" w:type="dxa"/>
+              <w:right w:w="150" w:type="dxa"/>
+            </w:tcMar>
           </w:tcPr>
           <w:p>
             <w:pPr>
@@ -2060,6 +2736,18 @@
         <w:tc>
           <w:tcPr>
             <w:tcW w:type="dxa" w:w="1440"/>
+            <w:tcBorders>
+              <w:top w:val="single" w:sz="12" w:space="0" w:color="000000"/>
+              <w:left w:val="single" w:sz="12" w:space="0" w:color="000000"/>
+              <w:bottom w:val="single" w:sz="12" w:space="0" w:color="000000"/>
+              <w:right w:val="single" w:sz="12" w:space="0" w:color="000000"/>
+            </w:tcBorders>
+            <w:tcMar>
+              <w:top w:w="100" w:type="dxa"/>
+              <w:bottom w:w="100" w:type="dxa"/>
+              <w:left w:w="150" w:type="dxa"/>
+              <w:right w:w="150" w:type="dxa"/>
+            </w:tcMar>
           </w:tcPr>
           <w:p>
             <w:pPr>
@@ -2078,6 +2766,18 @@
         <w:tc>
           <w:tcPr>
             <w:tcW w:type="dxa" w:w="1296"/>
+            <w:tcBorders>
+              <w:top w:val="single" w:sz="12" w:space="0" w:color="000000"/>
+              <w:left w:val="single" w:sz="12" w:space="0" w:color="000000"/>
+              <w:bottom w:val="single" w:sz="12" w:space="0" w:color="000000"/>
+              <w:right w:val="single" w:sz="12" w:space="0" w:color="000000"/>
+            </w:tcBorders>
+            <w:tcMar>
+              <w:top w:w="100" w:type="dxa"/>
+              <w:bottom w:w="100" w:type="dxa"/>
+              <w:left w:w="150" w:type="dxa"/>
+              <w:right w:w="150" w:type="dxa"/>
+            </w:tcMar>
           </w:tcPr>
           <w:p>
             <w:pPr>
@@ -2094,6 +2794,18 @@
         <w:tc>
           <w:tcPr>
             <w:tcW w:type="dxa" w:w="1872"/>
+            <w:tcBorders>
+              <w:top w:val="single" w:sz="12" w:space="0" w:color="000000"/>
+              <w:left w:val="single" w:sz="12" w:space="0" w:color="000000"/>
+              <w:bottom w:val="single" w:sz="12" w:space="0" w:color="000000"/>
+              <w:right w:val="single" w:sz="12" w:space="0" w:color="000000"/>
+            </w:tcBorders>
+            <w:tcMar>
+              <w:top w:w="100" w:type="dxa"/>
+              <w:bottom w:w="100" w:type="dxa"/>
+              <w:left w:w="150" w:type="dxa"/>
+              <w:right w:w="150" w:type="dxa"/>
+            </w:tcMar>
           </w:tcPr>
           <w:p>
             <w:pPr>
@@ -2111,6 +2823,18 @@
         <w:tc>
           <w:tcPr>
             <w:tcW w:type="dxa" w:w="4752"/>
+            <w:tcBorders>
+              <w:top w:val="single" w:sz="12" w:space="0" w:color="000000"/>
+              <w:left w:val="single" w:sz="12" w:space="0" w:color="000000"/>
+              <w:bottom w:val="single" w:sz="12" w:space="0" w:color="000000"/>
+              <w:right w:val="single" w:sz="12" w:space="0" w:color="000000"/>
+            </w:tcBorders>
+            <w:tcMar>
+              <w:top w:w="100" w:type="dxa"/>
+              <w:bottom w:w="100" w:type="dxa"/>
+              <w:left w:w="150" w:type="dxa"/>
+              <w:right w:w="150" w:type="dxa"/>
+            </w:tcMar>
           </w:tcPr>
           <w:p>
             <w:pPr>
@@ -2128,6 +2852,18 @@
         <w:tc>
           <w:tcPr>
             <w:tcW w:type="dxa" w:w="1440"/>
+            <w:tcBorders>
+              <w:top w:val="single" w:sz="12" w:space="0" w:color="000000"/>
+              <w:left w:val="single" w:sz="12" w:space="0" w:color="000000"/>
+              <w:bottom w:val="single" w:sz="12" w:space="0" w:color="000000"/>
+              <w:right w:val="single" w:sz="12" w:space="0" w:color="000000"/>
+            </w:tcBorders>
+            <w:tcMar>
+              <w:top w:w="100" w:type="dxa"/>
+              <w:bottom w:w="100" w:type="dxa"/>
+              <w:left w:w="150" w:type="dxa"/>
+              <w:right w:w="150" w:type="dxa"/>
+            </w:tcMar>
           </w:tcPr>
           <w:p>
             <w:pPr>
@@ -2146,6 +2882,18 @@
         <w:tc>
           <w:tcPr>
             <w:tcW w:type="dxa" w:w="1296"/>
+            <w:tcBorders>
+              <w:top w:val="single" w:sz="12" w:space="0" w:color="000000"/>
+              <w:left w:val="single" w:sz="12" w:space="0" w:color="000000"/>
+              <w:bottom w:val="single" w:sz="12" w:space="0" w:color="000000"/>
+              <w:right w:val="single" w:sz="12" w:space="0" w:color="000000"/>
+            </w:tcBorders>
+            <w:tcMar>
+              <w:top w:w="100" w:type="dxa"/>
+              <w:bottom w:w="100" w:type="dxa"/>
+              <w:left w:w="150" w:type="dxa"/>
+              <w:right w:w="150" w:type="dxa"/>
+            </w:tcMar>
           </w:tcPr>
           <w:p>
             <w:pPr>
@@ -2162,6 +2910,18 @@
         <w:tc>
           <w:tcPr>
             <w:tcW w:type="dxa" w:w="1872"/>
+            <w:tcBorders>
+              <w:top w:val="single" w:sz="12" w:space="0" w:color="000000"/>
+              <w:left w:val="single" w:sz="12" w:space="0" w:color="000000"/>
+              <w:bottom w:val="single" w:sz="12" w:space="0" w:color="000000"/>
+              <w:right w:val="single" w:sz="12" w:space="0" w:color="000000"/>
+            </w:tcBorders>
+            <w:tcMar>
+              <w:top w:w="100" w:type="dxa"/>
+              <w:bottom w:w="100" w:type="dxa"/>
+              <w:left w:w="150" w:type="dxa"/>
+              <w:right w:w="150" w:type="dxa"/>
+            </w:tcMar>
           </w:tcPr>
           <w:p>
             <w:pPr>
@@ -2179,6 +2939,18 @@
         <w:tc>
           <w:tcPr>
             <w:tcW w:type="dxa" w:w="4752"/>
+            <w:tcBorders>
+              <w:top w:val="single" w:sz="12" w:space="0" w:color="000000"/>
+              <w:left w:val="single" w:sz="12" w:space="0" w:color="000000"/>
+              <w:bottom w:val="single" w:sz="12" w:space="0" w:color="000000"/>
+              <w:right w:val="single" w:sz="12" w:space="0" w:color="000000"/>
+            </w:tcBorders>
+            <w:tcMar>
+              <w:top w:w="100" w:type="dxa"/>
+              <w:bottom w:w="100" w:type="dxa"/>
+              <w:left w:w="150" w:type="dxa"/>
+              <w:right w:w="150" w:type="dxa"/>
+            </w:tcMar>
           </w:tcPr>
           <w:p>
             <w:pPr>
@@ -2196,6 +2968,18 @@
         <w:tc>
           <w:tcPr>
             <w:tcW w:type="dxa" w:w="1440"/>
+            <w:tcBorders>
+              <w:top w:val="single" w:sz="12" w:space="0" w:color="000000"/>
+              <w:left w:val="single" w:sz="12" w:space="0" w:color="000000"/>
+              <w:bottom w:val="single" w:sz="12" w:space="0" w:color="000000"/>
+              <w:right w:val="single" w:sz="12" w:space="0" w:color="000000"/>
+            </w:tcBorders>
+            <w:tcMar>
+              <w:top w:w="100" w:type="dxa"/>
+              <w:bottom w:w="100" w:type="dxa"/>
+              <w:left w:w="150" w:type="dxa"/>
+              <w:right w:w="150" w:type="dxa"/>
+            </w:tcMar>
           </w:tcPr>
           <w:p>
             <w:pPr>
@@ -2214,6 +2998,18 @@
         <w:tc>
           <w:tcPr>
             <w:tcW w:type="dxa" w:w="1296"/>
+            <w:tcBorders>
+              <w:top w:val="single" w:sz="12" w:space="0" w:color="000000"/>
+              <w:left w:val="single" w:sz="12" w:space="0" w:color="000000"/>
+              <w:bottom w:val="single" w:sz="12" w:space="0" w:color="000000"/>
+              <w:right w:val="single" w:sz="12" w:space="0" w:color="000000"/>
+            </w:tcBorders>
+            <w:tcMar>
+              <w:top w:w="100" w:type="dxa"/>
+              <w:bottom w:w="100" w:type="dxa"/>
+              <w:left w:w="150" w:type="dxa"/>
+              <w:right w:w="150" w:type="dxa"/>
+            </w:tcMar>
           </w:tcPr>
           <w:p>
             <w:pPr>
@@ -2230,6 +3026,18 @@
         <w:tc>
           <w:tcPr>
             <w:tcW w:type="dxa" w:w="1872"/>
+            <w:tcBorders>
+              <w:top w:val="single" w:sz="12" w:space="0" w:color="000000"/>
+              <w:left w:val="single" w:sz="12" w:space="0" w:color="000000"/>
+              <w:bottom w:val="single" w:sz="12" w:space="0" w:color="000000"/>
+              <w:right w:val="single" w:sz="12" w:space="0" w:color="000000"/>
+            </w:tcBorders>
+            <w:tcMar>
+              <w:top w:w="100" w:type="dxa"/>
+              <w:bottom w:w="100" w:type="dxa"/>
+              <w:left w:w="150" w:type="dxa"/>
+              <w:right w:w="150" w:type="dxa"/>
+            </w:tcMar>
           </w:tcPr>
           <w:p>
             <w:pPr>
@@ -2247,6 +3055,18 @@
         <w:tc>
           <w:tcPr>
             <w:tcW w:type="dxa" w:w="4752"/>
+            <w:tcBorders>
+              <w:top w:val="single" w:sz="12" w:space="0" w:color="000000"/>
+              <w:left w:val="single" w:sz="12" w:space="0" w:color="000000"/>
+              <w:bottom w:val="single" w:sz="12" w:space="0" w:color="000000"/>
+              <w:right w:val="single" w:sz="12" w:space="0" w:color="000000"/>
+            </w:tcBorders>
+            <w:tcMar>
+              <w:top w:w="100" w:type="dxa"/>
+              <w:bottom w:w="100" w:type="dxa"/>
+              <w:left w:w="150" w:type="dxa"/>
+              <w:right w:w="150" w:type="dxa"/>
+            </w:tcMar>
           </w:tcPr>
           <w:p>
             <w:pPr>
@@ -2264,6 +3084,18 @@
         <w:tc>
           <w:tcPr>
             <w:tcW w:type="dxa" w:w="1440"/>
+            <w:tcBorders>
+              <w:top w:val="single" w:sz="12" w:space="0" w:color="000000"/>
+              <w:left w:val="single" w:sz="12" w:space="0" w:color="000000"/>
+              <w:bottom w:val="single" w:sz="12" w:space="0" w:color="000000"/>
+              <w:right w:val="single" w:sz="12" w:space="0" w:color="000000"/>
+            </w:tcBorders>
+            <w:tcMar>
+              <w:top w:w="100" w:type="dxa"/>
+              <w:bottom w:w="100" w:type="dxa"/>
+              <w:left w:w="150" w:type="dxa"/>
+              <w:right w:w="150" w:type="dxa"/>
+            </w:tcMar>
           </w:tcPr>
           <w:p>
             <w:pPr>
@@ -2282,6 +3114,18 @@
         <w:tc>
           <w:tcPr>
             <w:tcW w:type="dxa" w:w="1296"/>
+            <w:tcBorders>
+              <w:top w:val="single" w:sz="12" w:space="0" w:color="000000"/>
+              <w:left w:val="single" w:sz="12" w:space="0" w:color="000000"/>
+              <w:bottom w:val="single" w:sz="12" w:space="0" w:color="000000"/>
+              <w:right w:val="single" w:sz="12" w:space="0" w:color="000000"/>
+            </w:tcBorders>
+            <w:tcMar>
+              <w:top w:w="100" w:type="dxa"/>
+              <w:bottom w:w="100" w:type="dxa"/>
+              <w:left w:w="150" w:type="dxa"/>
+              <w:right w:w="150" w:type="dxa"/>
+            </w:tcMar>
           </w:tcPr>
           <w:p>
             <w:pPr>
@@ -2298,6 +3142,18 @@
         <w:tc>
           <w:tcPr>
             <w:tcW w:type="dxa" w:w="1872"/>
+            <w:tcBorders>
+              <w:top w:val="single" w:sz="12" w:space="0" w:color="000000"/>
+              <w:left w:val="single" w:sz="12" w:space="0" w:color="000000"/>
+              <w:bottom w:val="single" w:sz="12" w:space="0" w:color="000000"/>
+              <w:right w:val="single" w:sz="12" w:space="0" w:color="000000"/>
+            </w:tcBorders>
+            <w:tcMar>
+              <w:top w:w="100" w:type="dxa"/>
+              <w:bottom w:w="100" w:type="dxa"/>
+              <w:left w:w="150" w:type="dxa"/>
+              <w:right w:w="150" w:type="dxa"/>
+            </w:tcMar>
           </w:tcPr>
           <w:p>
             <w:pPr>
@@ -2315,6 +3171,18 @@
         <w:tc>
           <w:tcPr>
             <w:tcW w:type="dxa" w:w="4752"/>
+            <w:tcBorders>
+              <w:top w:val="single" w:sz="12" w:space="0" w:color="000000"/>
+              <w:left w:val="single" w:sz="12" w:space="0" w:color="000000"/>
+              <w:bottom w:val="single" w:sz="12" w:space="0" w:color="000000"/>
+              <w:right w:val="single" w:sz="12" w:space="0" w:color="000000"/>
+            </w:tcBorders>
+            <w:tcMar>
+              <w:top w:w="100" w:type="dxa"/>
+              <w:bottom w:w="100" w:type="dxa"/>
+              <w:left w:w="150" w:type="dxa"/>
+              <w:right w:w="150" w:type="dxa"/>
+            </w:tcMar>
           </w:tcPr>
           <w:p>
             <w:pPr>
@@ -2332,6 +3200,18 @@
         <w:tc>
           <w:tcPr>
             <w:tcW w:type="dxa" w:w="1440"/>
+            <w:tcBorders>
+              <w:top w:val="single" w:sz="12" w:space="0" w:color="000000"/>
+              <w:left w:val="single" w:sz="12" w:space="0" w:color="000000"/>
+              <w:bottom w:val="single" w:sz="12" w:space="0" w:color="000000"/>
+              <w:right w:val="single" w:sz="12" w:space="0" w:color="000000"/>
+            </w:tcBorders>
+            <w:tcMar>
+              <w:top w:w="100" w:type="dxa"/>
+              <w:bottom w:w="100" w:type="dxa"/>
+              <w:left w:w="150" w:type="dxa"/>
+              <w:right w:w="150" w:type="dxa"/>
+            </w:tcMar>
           </w:tcPr>
           <w:p>
             <w:pPr>
@@ -2350,6 +3230,18 @@
         <w:tc>
           <w:tcPr>
             <w:tcW w:type="dxa" w:w="1296"/>
+            <w:tcBorders>
+              <w:top w:val="single" w:sz="12" w:space="0" w:color="000000"/>
+              <w:left w:val="single" w:sz="12" w:space="0" w:color="000000"/>
+              <w:bottom w:val="single" w:sz="12" w:space="0" w:color="000000"/>
+              <w:right w:val="single" w:sz="12" w:space="0" w:color="000000"/>
+            </w:tcBorders>
+            <w:tcMar>
+              <w:top w:w="100" w:type="dxa"/>
+              <w:bottom w:w="100" w:type="dxa"/>
+              <w:left w:w="150" w:type="dxa"/>
+              <w:right w:w="150" w:type="dxa"/>
+            </w:tcMar>
           </w:tcPr>
           <w:p>
             <w:pPr>
@@ -2366,6 +3258,18 @@
         <w:tc>
           <w:tcPr>
             <w:tcW w:type="dxa" w:w="1872"/>
+            <w:tcBorders>
+              <w:top w:val="single" w:sz="12" w:space="0" w:color="000000"/>
+              <w:left w:val="single" w:sz="12" w:space="0" w:color="000000"/>
+              <w:bottom w:val="single" w:sz="12" w:space="0" w:color="000000"/>
+              <w:right w:val="single" w:sz="12" w:space="0" w:color="000000"/>
+            </w:tcBorders>
+            <w:tcMar>
+              <w:top w:w="100" w:type="dxa"/>
+              <w:bottom w:w="100" w:type="dxa"/>
+              <w:left w:w="150" w:type="dxa"/>
+              <w:right w:w="150" w:type="dxa"/>
+            </w:tcMar>
           </w:tcPr>
           <w:p>
             <w:pPr>
@@ -2383,6 +3287,18 @@
         <w:tc>
           <w:tcPr>
             <w:tcW w:type="dxa" w:w="4752"/>
+            <w:tcBorders>
+              <w:top w:val="single" w:sz="12" w:space="0" w:color="000000"/>
+              <w:left w:val="single" w:sz="12" w:space="0" w:color="000000"/>
+              <w:bottom w:val="single" w:sz="12" w:space="0" w:color="000000"/>
+              <w:right w:val="single" w:sz="12" w:space="0" w:color="000000"/>
+            </w:tcBorders>
+            <w:tcMar>
+              <w:top w:w="100" w:type="dxa"/>
+              <w:bottom w:w="100" w:type="dxa"/>
+              <w:left w:w="150" w:type="dxa"/>
+              <w:right w:w="150" w:type="dxa"/>
+            </w:tcMar>
           </w:tcPr>
           <w:p>
             <w:pPr>
@@ -2400,6 +3316,18 @@
         <w:tc>
           <w:tcPr>
             <w:tcW w:type="dxa" w:w="1440"/>
+            <w:tcBorders>
+              <w:top w:val="single" w:sz="12" w:space="0" w:color="000000"/>
+              <w:left w:val="single" w:sz="12" w:space="0" w:color="000000"/>
+              <w:bottom w:val="single" w:sz="12" w:space="0" w:color="000000"/>
+              <w:right w:val="single" w:sz="12" w:space="0" w:color="000000"/>
+            </w:tcBorders>
+            <w:tcMar>
+              <w:top w:w="100" w:type="dxa"/>
+              <w:bottom w:w="100" w:type="dxa"/>
+              <w:left w:w="150" w:type="dxa"/>
+              <w:right w:w="150" w:type="dxa"/>
+            </w:tcMar>
           </w:tcPr>
           <w:p>
             <w:pPr>
@@ -2418,6 +3346,18 @@
         <w:tc>
           <w:tcPr>
             <w:tcW w:type="dxa" w:w="1296"/>
+            <w:tcBorders>
+              <w:top w:val="single" w:sz="12" w:space="0" w:color="000000"/>
+              <w:left w:val="single" w:sz="12" w:space="0" w:color="000000"/>
+              <w:bottom w:val="single" w:sz="12" w:space="0" w:color="000000"/>
+              <w:right w:val="single" w:sz="12" w:space="0" w:color="000000"/>
+            </w:tcBorders>
+            <w:tcMar>
+              <w:top w:w="100" w:type="dxa"/>
+              <w:bottom w:w="100" w:type="dxa"/>
+              <w:left w:w="150" w:type="dxa"/>
+              <w:right w:w="150" w:type="dxa"/>
+            </w:tcMar>
           </w:tcPr>
           <w:p>
             <w:pPr>
@@ -2434,6 +3374,18 @@
         <w:tc>
           <w:tcPr>
             <w:tcW w:type="dxa" w:w="1872"/>
+            <w:tcBorders>
+              <w:top w:val="single" w:sz="12" w:space="0" w:color="000000"/>
+              <w:left w:val="single" w:sz="12" w:space="0" w:color="000000"/>
+              <w:bottom w:val="single" w:sz="12" w:space="0" w:color="000000"/>
+              <w:right w:val="single" w:sz="12" w:space="0" w:color="000000"/>
+            </w:tcBorders>
+            <w:tcMar>
+              <w:top w:w="100" w:type="dxa"/>
+              <w:bottom w:w="100" w:type="dxa"/>
+              <w:left w:w="150" w:type="dxa"/>
+              <w:right w:w="150" w:type="dxa"/>
+            </w:tcMar>
           </w:tcPr>
           <w:p>
             <w:pPr>
@@ -2451,6 +3403,18 @@
         <w:tc>
           <w:tcPr>
             <w:tcW w:type="dxa" w:w="4752"/>
+            <w:tcBorders>
+              <w:top w:val="single" w:sz="12" w:space="0" w:color="000000"/>
+              <w:left w:val="single" w:sz="12" w:space="0" w:color="000000"/>
+              <w:bottom w:val="single" w:sz="12" w:space="0" w:color="000000"/>
+              <w:right w:val="single" w:sz="12" w:space="0" w:color="000000"/>
+            </w:tcBorders>
+            <w:tcMar>
+              <w:top w:w="100" w:type="dxa"/>
+              <w:bottom w:w="100" w:type="dxa"/>
+              <w:left w:w="150" w:type="dxa"/>
+              <w:right w:w="150" w:type="dxa"/>
+            </w:tcMar>
           </w:tcPr>
           <w:p>
             <w:pPr>
@@ -2468,6 +3432,18 @@
         <w:tc>
           <w:tcPr>
             <w:tcW w:type="dxa" w:w="1440"/>
+            <w:tcBorders>
+              <w:top w:val="single" w:sz="12" w:space="0" w:color="000000"/>
+              <w:left w:val="single" w:sz="12" w:space="0" w:color="000000"/>
+              <w:bottom w:val="single" w:sz="12" w:space="0" w:color="000000"/>
+              <w:right w:val="single" w:sz="12" w:space="0" w:color="000000"/>
+            </w:tcBorders>
+            <w:tcMar>
+              <w:top w:w="100" w:type="dxa"/>
+              <w:bottom w:w="100" w:type="dxa"/>
+              <w:left w:w="150" w:type="dxa"/>
+              <w:right w:w="150" w:type="dxa"/>
+            </w:tcMar>
           </w:tcPr>
           <w:p>
             <w:pPr>
@@ -2486,6 +3462,18 @@
         <w:tc>
           <w:tcPr>
             <w:tcW w:type="dxa" w:w="1296"/>
+            <w:tcBorders>
+              <w:top w:val="single" w:sz="12" w:space="0" w:color="000000"/>
+              <w:left w:val="single" w:sz="12" w:space="0" w:color="000000"/>
+              <w:bottom w:val="single" w:sz="12" w:space="0" w:color="000000"/>
+              <w:right w:val="single" w:sz="12" w:space="0" w:color="000000"/>
+            </w:tcBorders>
+            <w:tcMar>
+              <w:top w:w="100" w:type="dxa"/>
+              <w:bottom w:w="100" w:type="dxa"/>
+              <w:left w:w="150" w:type="dxa"/>
+              <w:right w:w="150" w:type="dxa"/>
+            </w:tcMar>
           </w:tcPr>
           <w:p>
             <w:pPr>
@@ -2502,6 +3490,18 @@
         <w:tc>
           <w:tcPr>
             <w:tcW w:type="dxa" w:w="1872"/>
+            <w:tcBorders>
+              <w:top w:val="single" w:sz="12" w:space="0" w:color="000000"/>
+              <w:left w:val="single" w:sz="12" w:space="0" w:color="000000"/>
+              <w:bottom w:val="single" w:sz="12" w:space="0" w:color="000000"/>
+              <w:right w:val="single" w:sz="12" w:space="0" w:color="000000"/>
+            </w:tcBorders>
+            <w:tcMar>
+              <w:top w:w="100" w:type="dxa"/>
+              <w:bottom w:w="100" w:type="dxa"/>
+              <w:left w:w="150" w:type="dxa"/>
+              <w:right w:w="150" w:type="dxa"/>
+            </w:tcMar>
           </w:tcPr>
           <w:p>
             <w:pPr>
@@ -2519,6 +3519,18 @@
         <w:tc>
           <w:tcPr>
             <w:tcW w:type="dxa" w:w="4752"/>
+            <w:tcBorders>
+              <w:top w:val="single" w:sz="12" w:space="0" w:color="000000"/>
+              <w:left w:val="single" w:sz="12" w:space="0" w:color="000000"/>
+              <w:bottom w:val="single" w:sz="12" w:space="0" w:color="000000"/>
+              <w:right w:val="single" w:sz="12" w:space="0" w:color="000000"/>
+            </w:tcBorders>
+            <w:tcMar>
+              <w:top w:w="100" w:type="dxa"/>
+              <w:bottom w:w="100" w:type="dxa"/>
+              <w:left w:w="150" w:type="dxa"/>
+              <w:right w:w="150" w:type="dxa"/>
+            </w:tcMar>
           </w:tcPr>
           <w:p>
             <w:pPr>
@@ -2536,6 +3548,18 @@
         <w:tc>
           <w:tcPr>
             <w:tcW w:type="dxa" w:w="1440"/>
+            <w:tcBorders>
+              <w:top w:val="single" w:sz="12" w:space="0" w:color="000000"/>
+              <w:left w:val="single" w:sz="12" w:space="0" w:color="000000"/>
+              <w:bottom w:val="single" w:sz="12" w:space="0" w:color="000000"/>
+              <w:right w:val="single" w:sz="12" w:space="0" w:color="000000"/>
+            </w:tcBorders>
+            <w:tcMar>
+              <w:top w:w="100" w:type="dxa"/>
+              <w:bottom w:w="100" w:type="dxa"/>
+              <w:left w:w="150" w:type="dxa"/>
+              <w:right w:w="150" w:type="dxa"/>
+            </w:tcMar>
           </w:tcPr>
           <w:p>
             <w:pPr>
@@ -2554,6 +3578,18 @@
         <w:tc>
           <w:tcPr>
             <w:tcW w:type="dxa" w:w="1296"/>
+            <w:tcBorders>
+              <w:top w:val="single" w:sz="12" w:space="0" w:color="000000"/>
+              <w:left w:val="single" w:sz="12" w:space="0" w:color="000000"/>
+              <w:bottom w:val="single" w:sz="12" w:space="0" w:color="000000"/>
+              <w:right w:val="single" w:sz="12" w:space="0" w:color="000000"/>
+            </w:tcBorders>
+            <w:tcMar>
+              <w:top w:w="100" w:type="dxa"/>
+              <w:bottom w:w="100" w:type="dxa"/>
+              <w:left w:w="150" w:type="dxa"/>
+              <w:right w:w="150" w:type="dxa"/>
+            </w:tcMar>
           </w:tcPr>
           <w:p>
             <w:pPr>
@@ -2570,6 +3606,18 @@
         <w:tc>
           <w:tcPr>
             <w:tcW w:type="dxa" w:w="1872"/>
+            <w:tcBorders>
+              <w:top w:val="single" w:sz="12" w:space="0" w:color="000000"/>
+              <w:left w:val="single" w:sz="12" w:space="0" w:color="000000"/>
+              <w:bottom w:val="single" w:sz="12" w:space="0" w:color="000000"/>
+              <w:right w:val="single" w:sz="12" w:space="0" w:color="000000"/>
+            </w:tcBorders>
+            <w:tcMar>
+              <w:top w:w="100" w:type="dxa"/>
+              <w:bottom w:w="100" w:type="dxa"/>
+              <w:left w:w="150" w:type="dxa"/>
+              <w:right w:w="150" w:type="dxa"/>
+            </w:tcMar>
           </w:tcPr>
           <w:p>
             <w:pPr>
@@ -2587,6 +3635,18 @@
         <w:tc>
           <w:tcPr>
             <w:tcW w:type="dxa" w:w="4752"/>
+            <w:tcBorders>
+              <w:top w:val="single" w:sz="12" w:space="0" w:color="000000"/>
+              <w:left w:val="single" w:sz="12" w:space="0" w:color="000000"/>
+              <w:bottom w:val="single" w:sz="12" w:space="0" w:color="000000"/>
+              <w:right w:val="single" w:sz="12" w:space="0" w:color="000000"/>
+            </w:tcBorders>
+            <w:tcMar>
+              <w:top w:w="100" w:type="dxa"/>
+              <w:bottom w:w="100" w:type="dxa"/>
+              <w:left w:w="150" w:type="dxa"/>
+              <w:right w:w="150" w:type="dxa"/>
+            </w:tcMar>
           </w:tcPr>
           <w:p>
             <w:pPr>
@@ -2604,6 +3664,18 @@
         <w:tc>
           <w:tcPr>
             <w:tcW w:type="dxa" w:w="1440"/>
+            <w:tcBorders>
+              <w:top w:val="single" w:sz="12" w:space="0" w:color="000000"/>
+              <w:left w:val="single" w:sz="12" w:space="0" w:color="000000"/>
+              <w:bottom w:val="single" w:sz="12" w:space="0" w:color="000000"/>
+              <w:right w:val="single" w:sz="12" w:space="0" w:color="000000"/>
+            </w:tcBorders>
+            <w:tcMar>
+              <w:top w:w="100" w:type="dxa"/>
+              <w:bottom w:w="100" w:type="dxa"/>
+              <w:left w:w="150" w:type="dxa"/>
+              <w:right w:w="150" w:type="dxa"/>
+            </w:tcMar>
           </w:tcPr>
           <w:p>
             <w:pPr>
@@ -2622,6 +3694,18 @@
         <w:tc>
           <w:tcPr>
             <w:tcW w:type="dxa" w:w="1296"/>
+            <w:tcBorders>
+              <w:top w:val="single" w:sz="12" w:space="0" w:color="000000"/>
+              <w:left w:val="single" w:sz="12" w:space="0" w:color="000000"/>
+              <w:bottom w:val="single" w:sz="12" w:space="0" w:color="000000"/>
+              <w:right w:val="single" w:sz="12" w:space="0" w:color="000000"/>
+            </w:tcBorders>
+            <w:tcMar>
+              <w:top w:w="100" w:type="dxa"/>
+              <w:bottom w:w="100" w:type="dxa"/>
+              <w:left w:w="150" w:type="dxa"/>
+              <w:right w:w="150" w:type="dxa"/>
+            </w:tcMar>
           </w:tcPr>
           <w:p>
             <w:pPr>
@@ -2638,6 +3722,18 @@
         <w:tc>
           <w:tcPr>
             <w:tcW w:type="dxa" w:w="1872"/>
+            <w:tcBorders>
+              <w:top w:val="single" w:sz="12" w:space="0" w:color="000000"/>
+              <w:left w:val="single" w:sz="12" w:space="0" w:color="000000"/>
+              <w:bottom w:val="single" w:sz="12" w:space="0" w:color="000000"/>
+              <w:right w:val="single" w:sz="12" w:space="0" w:color="000000"/>
+            </w:tcBorders>
+            <w:tcMar>
+              <w:top w:w="100" w:type="dxa"/>
+              <w:bottom w:w="100" w:type="dxa"/>
+              <w:left w:w="150" w:type="dxa"/>
+              <w:right w:w="150" w:type="dxa"/>
+            </w:tcMar>
           </w:tcPr>
           <w:p>
             <w:pPr>
@@ -2655,6 +3751,18 @@
         <w:tc>
           <w:tcPr>
             <w:tcW w:type="dxa" w:w="4752"/>
+            <w:tcBorders>
+              <w:top w:val="single" w:sz="12" w:space="0" w:color="000000"/>
+              <w:left w:val="single" w:sz="12" w:space="0" w:color="000000"/>
+              <w:bottom w:val="single" w:sz="12" w:space="0" w:color="000000"/>
+              <w:right w:val="single" w:sz="12" w:space="0" w:color="000000"/>
+            </w:tcBorders>
+            <w:tcMar>
+              <w:top w:w="100" w:type="dxa"/>
+              <w:bottom w:w="100" w:type="dxa"/>
+              <w:left w:w="150" w:type="dxa"/>
+              <w:right w:w="150" w:type="dxa"/>
+            </w:tcMar>
           </w:tcPr>
           <w:p>
             <w:pPr>
@@ -2672,6 +3780,18 @@
         <w:tc>
           <w:tcPr>
             <w:tcW w:type="dxa" w:w="1440"/>
+            <w:tcBorders>
+              <w:top w:val="single" w:sz="12" w:space="0" w:color="000000"/>
+              <w:left w:val="single" w:sz="12" w:space="0" w:color="000000"/>
+              <w:bottom w:val="single" w:sz="12" w:space="0" w:color="000000"/>
+              <w:right w:val="single" w:sz="12" w:space="0" w:color="000000"/>
+            </w:tcBorders>
+            <w:tcMar>
+              <w:top w:w="100" w:type="dxa"/>
+              <w:bottom w:w="100" w:type="dxa"/>
+              <w:left w:w="150" w:type="dxa"/>
+              <w:right w:w="150" w:type="dxa"/>
+            </w:tcMar>
           </w:tcPr>
           <w:p>
             <w:pPr>
@@ -3044,17 +4164,18 @@
     </w:p>
     <w:tbl>
       <w:tblPr>
+        <w:tblStyle w:val="TableGrid"/>
         <w:tblW w:type="auto" w:w="0"/>
         <w:jc w:val="center"/>
         <w:tblLayout w:type="fixed"/>
         <w:tblLook w:firstColumn="1" w:firstRow="1" w:lastColumn="0" w:lastRow="0" w:noHBand="0" w:noVBand="1" w:val="04A0"/>
         <w:tblBorders>
-          <w:top w:val="single" w:sz="8" w:space="0" w:color="000000"/>
-          <w:left w:val="single" w:sz="8" w:space="0" w:color="000000"/>
-          <w:bottom w:val="single" w:sz="8" w:space="0" w:color="000000"/>
-          <w:right w:val="single" w:sz="8" w:space="0" w:color="000000"/>
-          <w:insideH w:val="single" w:sz="4" w:space="0" w:color="000000"/>
-          <w:insideV w:val="single" w:sz="4" w:space="0" w:color="000000"/>
+          <w:top w:val="single" w:sz="12" w:space="0" w:color="000000"/>
+          <w:left w:val="single" w:sz="12" w:space="0" w:color="000000"/>
+          <w:bottom w:val="single" w:sz="12" w:space="0" w:color="000000"/>
+          <w:right w:val="single" w:sz="12" w:space="0" w:color="000000"/>
+          <w:insideH w:val="single" w:sz="12" w:space="0" w:color="000000"/>
+          <w:insideV w:val="single" w:sz="12" w:space="0" w:color="000000"/>
         </w:tblBorders>
       </w:tblPr>
       <w:tblGrid>
@@ -3066,6 +4187,18 @@
         <w:tc>
           <w:tcPr>
             <w:tcW w:type="dxa" w:w="3120"/>
+            <w:tcBorders>
+              <w:top w:val="single" w:sz="12" w:space="0" w:color="000000"/>
+              <w:left w:val="single" w:sz="12" w:space="0" w:color="000000"/>
+              <w:bottom w:val="single" w:sz="12" w:space="0" w:color="000000"/>
+              <w:right w:val="single" w:sz="12" w:space="0" w:color="000000"/>
+            </w:tcBorders>
+            <w:tcMar>
+              <w:top w:w="100" w:type="dxa"/>
+              <w:bottom w:w="100" w:type="dxa"/>
+              <w:left w:w="150" w:type="dxa"/>
+              <w:right w:w="150" w:type="dxa"/>
+            </w:tcMar>
             <w:shd w:fill="E0E0E0"/>
           </w:tcPr>
           <w:p>
@@ -3080,6 +4213,18 @@
         <w:tc>
           <w:tcPr>
             <w:tcW w:type="dxa" w:w="3120"/>
+            <w:tcBorders>
+              <w:top w:val="single" w:sz="12" w:space="0" w:color="000000"/>
+              <w:left w:val="single" w:sz="12" w:space="0" w:color="000000"/>
+              <w:bottom w:val="single" w:sz="12" w:space="0" w:color="000000"/>
+              <w:right w:val="single" w:sz="12" w:space="0" w:color="000000"/>
+            </w:tcBorders>
+            <w:tcMar>
+              <w:top w:w="100" w:type="dxa"/>
+              <w:bottom w:w="100" w:type="dxa"/>
+              <w:left w:w="150" w:type="dxa"/>
+              <w:right w:w="150" w:type="dxa"/>
+            </w:tcMar>
             <w:shd w:fill="E0E0E0"/>
           </w:tcPr>
           <w:p>
@@ -3094,6 +4239,18 @@
         <w:tc>
           <w:tcPr>
             <w:tcW w:type="dxa" w:w="3120"/>
+            <w:tcBorders>
+              <w:top w:val="single" w:sz="12" w:space="0" w:color="000000"/>
+              <w:left w:val="single" w:sz="12" w:space="0" w:color="000000"/>
+              <w:bottom w:val="single" w:sz="12" w:space="0" w:color="000000"/>
+              <w:right w:val="single" w:sz="12" w:space="0" w:color="000000"/>
+            </w:tcBorders>
+            <w:tcMar>
+              <w:top w:w="100" w:type="dxa"/>
+              <w:bottom w:w="100" w:type="dxa"/>
+              <w:left w:w="150" w:type="dxa"/>
+              <w:right w:w="150" w:type="dxa"/>
+            </w:tcMar>
             <w:shd w:fill="E0E0E0"/>
           </w:tcPr>
           <w:p>
@@ -3110,6 +4267,18 @@
         <w:tc>
           <w:tcPr>
             <w:tcW w:type="dxa" w:w="3120"/>
+            <w:tcBorders>
+              <w:top w:val="single" w:sz="12" w:space="0" w:color="000000"/>
+              <w:left w:val="single" w:sz="12" w:space="0" w:color="000000"/>
+              <w:bottom w:val="single" w:sz="12" w:space="0" w:color="000000"/>
+              <w:right w:val="single" w:sz="12" w:space="0" w:color="000000"/>
+            </w:tcBorders>
+            <w:tcMar>
+              <w:top w:w="100" w:type="dxa"/>
+              <w:bottom w:w="100" w:type="dxa"/>
+              <w:left w:w="150" w:type="dxa"/>
+              <w:right w:w="150" w:type="dxa"/>
+            </w:tcMar>
           </w:tcPr>
           <w:p>
             <w:r>
@@ -3127,6 +4296,18 @@
         <w:tc>
           <w:tcPr>
             <w:tcW w:type="dxa" w:w="3120"/>
+            <w:tcBorders>
+              <w:top w:val="single" w:sz="12" w:space="0" w:color="000000"/>
+              <w:left w:val="single" w:sz="12" w:space="0" w:color="000000"/>
+              <w:bottom w:val="single" w:sz="12" w:space="0" w:color="000000"/>
+              <w:right w:val="single" w:sz="12" w:space="0" w:color="000000"/>
+            </w:tcBorders>
+            <w:tcMar>
+              <w:top w:w="100" w:type="dxa"/>
+              <w:bottom w:w="100" w:type="dxa"/>
+              <w:left w:w="150" w:type="dxa"/>
+              <w:right w:w="150" w:type="dxa"/>
+            </w:tcMar>
           </w:tcPr>
           <w:p>
             <w:r>
@@ -3137,6 +4318,18 @@
         <w:tc>
           <w:tcPr>
             <w:tcW w:type="dxa" w:w="3120"/>
+            <w:tcBorders>
+              <w:top w:val="single" w:sz="12" w:space="0" w:color="000000"/>
+              <w:left w:val="single" w:sz="12" w:space="0" w:color="000000"/>
+              <w:bottom w:val="single" w:sz="12" w:space="0" w:color="000000"/>
+              <w:right w:val="single" w:sz="12" w:space="0" w:color="000000"/>
+            </w:tcBorders>
+            <w:tcMar>
+              <w:top w:w="100" w:type="dxa"/>
+              <w:bottom w:w="100" w:type="dxa"/>
+              <w:left w:w="150" w:type="dxa"/>
+              <w:right w:w="150" w:type="dxa"/>
+            </w:tcMar>
           </w:tcPr>
           <w:p>
             <w:r>
@@ -3157,6 +4350,18 @@
         <w:tc>
           <w:tcPr>
             <w:tcW w:type="dxa" w:w="3120"/>
+            <w:tcBorders>
+              <w:top w:val="single" w:sz="12" w:space="0" w:color="000000"/>
+              <w:left w:val="single" w:sz="12" w:space="0" w:color="000000"/>
+              <w:bottom w:val="single" w:sz="12" w:space="0" w:color="000000"/>
+              <w:right w:val="single" w:sz="12" w:space="0" w:color="000000"/>
+            </w:tcBorders>
+            <w:tcMar>
+              <w:top w:w="100" w:type="dxa"/>
+              <w:bottom w:w="100" w:type="dxa"/>
+              <w:left w:w="150" w:type="dxa"/>
+              <w:right w:w="150" w:type="dxa"/>
+            </w:tcMar>
           </w:tcPr>
           <w:p>
             <w:r>
@@ -3174,6 +4379,18 @@
         <w:tc>
           <w:tcPr>
             <w:tcW w:type="dxa" w:w="3120"/>
+            <w:tcBorders>
+              <w:top w:val="single" w:sz="12" w:space="0" w:color="000000"/>
+              <w:left w:val="single" w:sz="12" w:space="0" w:color="000000"/>
+              <w:bottom w:val="single" w:sz="12" w:space="0" w:color="000000"/>
+              <w:right w:val="single" w:sz="12" w:space="0" w:color="000000"/>
+            </w:tcBorders>
+            <w:tcMar>
+              <w:top w:w="100" w:type="dxa"/>
+              <w:bottom w:w="100" w:type="dxa"/>
+              <w:left w:w="150" w:type="dxa"/>
+              <w:right w:w="150" w:type="dxa"/>
+            </w:tcMar>
           </w:tcPr>
           <w:p>
             <w:r>
@@ -3184,6 +4401,18 @@
         <w:tc>
           <w:tcPr>
             <w:tcW w:type="dxa" w:w="3120"/>
+            <w:tcBorders>
+              <w:top w:val="single" w:sz="12" w:space="0" w:color="000000"/>
+              <w:left w:val="single" w:sz="12" w:space="0" w:color="000000"/>
+              <w:bottom w:val="single" w:sz="12" w:space="0" w:color="000000"/>
+              <w:right w:val="single" w:sz="12" w:space="0" w:color="000000"/>
+            </w:tcBorders>
+            <w:tcMar>
+              <w:top w:w="100" w:type="dxa"/>
+              <w:bottom w:w="100" w:type="dxa"/>
+              <w:left w:w="150" w:type="dxa"/>
+              <w:right w:w="150" w:type="dxa"/>
+            </w:tcMar>
           </w:tcPr>
           <w:p>
             <w:r>

</xml_diff>

<commit_message>
Synchronize identical Abstract/Intro and cross-referenced team contributions for SAM and Saraswathi reports
</commit_message>
<xml_diff>
--- a/Enterprise_IT_Service_Portal_Individual_Report_SAM.docx
+++ b/Enterprise_IT_Service_Portal_Individual_Report_SAM.docx
@@ -12,7 +12,7 @@
           <w:b/>
           <w:sz w:val="32"/>
         </w:rPr>
-        <w:t>MINI-PROJECT INDIVIDUAL REPORT</w:t>
+        <w:t>MINI-PROJECT REPORT</w:t>
       </w:r>
     </w:p>
     <w:p>
@@ -201,7 +201,7 @@
         <w:jc w:val="both"/>
       </w:pPr>
       <w:r>
-        <w:t xml:space="preserve">This is to certify that the individual mini-project report titled </w:t>
+        <w:t xml:space="preserve">This is to certify that the project report titled </w:t>
       </w:r>
       <w:r>
         <w:rPr>
@@ -210,7 +210,7 @@
         <w:t>“ENTERPRISE IT &amp; CORPORATE FACILITIES SERVICE PORTAL”</w:t>
       </w:r>
       <w:r>
-        <w:t xml:space="preserve"> is authentic work carried out and submitted individually by </w:t>
+        <w:t xml:space="preserve"> is authentic work done and submitted by </w:t>
       </w:r>
       <w:r>
         <w:rPr>
@@ -434,7 +434,7 @@
           <w:i w:val="0"/>
           <w:sz w:val="24"/>
         </w:rPr>
-        <w:t>I express my gratitude to my project guide Dr. [Guide Name], Department of Computer Applications, SRM Institute of Science &amp; Technology for permitting me to conduct my individual project research and development in the department and providing necessary computational and laboratory facilities.</w:t>
+        <w:t>I express my gratitude to my project guide Dr. [Guide Name], Department of Computer Applications, SRM Institute of Science &amp; Technology for permitting me to conduct my project research and development in the department and providing necessary computational and laboratory facilities.</w:t>
       </w:r>
     </w:p>
     <w:p>
@@ -510,7 +510,7 @@
           <w:i w:val="0"/>
           <w:sz w:val="24"/>
         </w:rPr>
-        <w:t>This individual mini-project report presents the system architecture, AI NLP microservice development, Spring Boot backend engineering, and cloud telephony integration for an Enterprise IT &amp; Corporate Facilities Service Portal. The project addresses enterprise operational delays caused by manual ticket routing, fragmented communication, lack of real-time SLA visibility, and manual emergency reporting.</w:t>
+        <w:t>This project report presents the design, implementation, and evaluation of an Enterprise IT &amp; Corporate Facilities Service Portal—an intelligent, unified service desk platform engineered to streamline IT support requests, facility maintenance workflows, and emergency operations across enterprise environments. The system addresses common operational bottlenecks such as fragmented support channels, lack of real-time SLA visibility, manual ticket triage, and delayed emergency response by consolidating all service desk operations into a single web-based application.</w:t>
       </w:r>
     </w:p>
     <w:p>
@@ -525,7 +525,7 @@
           <w:i w:val="0"/>
           <w:sz w:val="24"/>
         </w:rPr>
-        <w:t>As lead backend developer and system architect (SAM ANTROSE A H, Reg. No: RA2532241040033), my primary individual technical contributions comprise: (1) Designing and building the Python FastAPI AI microservice utilizing Hugging Face NLP transformers (DistilBERT for category prediction and RoBERTa for sentiment and urgency triage); (2) Implementing the Spring Boot 3 REST API backend with dual H2/PostgreSQL persistence and JWT security; (3) Developing real email-based 2FA OTP security via REST gateway with brute-force lockout protection; (4) Integrating native device telephony (tel: URI protocol) with automated instant emergency email dispatch for P1 critical incidents; and (5) Managing Git version control, Docker containerization, and cloud deployment pipelines.</w:t>
+        <w:t>The core platform incorporates an AI microservice built with Python FastAPI and Hugging Face Natural Language Processing (NLP) models (DistilBERT for category classification and RoBERTa for sentiment and urgency triage). As employees compose incident tickets, the NLP models perform real-time text inference to dynamically predict category, priority (P1 Critical to P4 Low), and assigned vendor teams before submission. The system features domain-filtered technician queues, live precision countdown SLA timers, and dual-channel cloud telephony with automated email alerts for P1 emergency incidents. Built using Spring Boot 3 Java backend, HTML5/CSS3/JavaScript frontend with glassmorphic aesthetic, H2/PostgreSQL database, and multi-role authentication with email OTP 2FA, the platform provides enterprise-grade performance, auditability, and user satisfaction.</w:t>
       </w:r>
     </w:p>
     <w:p>
@@ -1078,7 +1078,7 @@
                 <w:b w:val="0"/>
                 <w:sz w:val="22"/>
               </w:rPr>
-              <w:t>1.3 ORGANIZATION OF INDIVIDUAL REPORT</w:t>
+              <w:t>1.3 ORGANIZATION OF THE PROJECT REPORT</w:t>
             </w:r>
           </w:p>
         </w:tc>
@@ -1213,7 +1213,7 @@
                 <w:b/>
                 <w:sz w:val="22"/>
               </w:rPr>
-              <w:t>TEAM COMPOSITION &amp; INDIVIDUAL WORK DIVISION</w:t>
+              <w:t>TEAM COMPOSITION &amp; WORK DIVISION</w:t>
             </w:r>
           </w:p>
           <w:p>
@@ -1239,7 +1239,7 @@
                 <w:b w:val="0"/>
                 <w:sz w:val="22"/>
               </w:rPr>
-              <w:t>2.2 SAM ANTROSE A H'S INDIVIDUAL RESPONSIBILITIES</w:t>
+              <w:t>2.2 WORK DIVISION MATRIX</w:t>
             </w:r>
           </w:p>
         </w:tc>
@@ -1360,7 +1360,7 @@
                 <w:b/>
                 <w:sz w:val="22"/>
               </w:rPr>
-              <w:t>INDIVIDUAL TECHNICAL MODULES &amp; IMPLEMENTATION</w:t>
+              <w:t>TECHNICAL MODULE IMPLEMENTATION &amp; TEAM CONTRIBUTIONS</w:t>
             </w:r>
           </w:p>
           <w:p>
@@ -1373,7 +1373,7 @@
                 <w:b w:val="0"/>
                 <w:sz w:val="22"/>
               </w:rPr>
-              <w:t>3.1 SPRING BOOT 3 REST API &amp; DATABASE LAYER</w:t>
+              <w:t>3.1 PRIMARY CONTRIBUTIONS — SAM ANTROSE A H</w:t>
             </w:r>
           </w:p>
           <w:p>
@@ -1386,7 +1386,7 @@
                 <w:b w:val="0"/>
                 <w:sz w:val="22"/>
               </w:rPr>
-              <w:t>3.2 PYTHON FASTAPI AI MICROSERVICE (HUGGING FACE NLP)</w:t>
+              <w:t xml:space="preserve">    3.1.1 SPRING BOOT 3 REST API &amp; DATABASE LAYER</w:t>
             </w:r>
           </w:p>
           <w:p>
@@ -1399,7 +1399,7 @@
                 <w:b w:val="0"/>
                 <w:sz w:val="22"/>
               </w:rPr>
-              <w:t>3.3 MULTI-ROLE AUTHENTICATION &amp; EMAIL 2FA OTP SECURITY</w:t>
+              <w:t xml:space="preserve">    3.1.2 PYTHON FASTAPI AI MICROSERVICE (HUGGING FACE NLP)</w:t>
             </w:r>
           </w:p>
           <w:p>
@@ -1412,7 +1412,7 @@
                 <w:b w:val="0"/>
                 <w:sz w:val="22"/>
               </w:rPr>
-              <w:t>3.4 EMERGENCY TELEPHONY &amp; CLOUD ALERT DISPATCH</w:t>
+              <w:t xml:space="preserve">    3.1.3 MULTI-ROLE AUTHENTICATION &amp; EMAIL 2FA OTP SECURITY</w:t>
             </w:r>
           </w:p>
           <w:p>
@@ -1425,7 +1425,72 @@
                 <w:b w:val="0"/>
                 <w:sz w:val="22"/>
               </w:rPr>
-              <w:t>3.5 DOCKER CONTAINERIZATION &amp; CLOUD DEPLOYMENT</w:t>
+              <w:t xml:space="preserve">    3.1.4 EMERGENCY TELEPHONY &amp; CLOUD ALERT DISPATCH</w:t>
+            </w:r>
+          </w:p>
+          <w:p>
+            <w:pPr>
+              <w:spacing w:after="40" w:before="40" w:line="252" w:lineRule="auto"/>
+            </w:pPr>
+            <w:r>
+              <w:rPr>
+                <w:rFonts w:ascii="Times New Roman" w:hAnsi="Times New Roman"/>
+                <w:b w:val="0"/>
+                <w:sz w:val="22"/>
+              </w:rPr>
+              <w:t xml:space="preserve">    3.1.5 DOCKER CONTAINERIZATION &amp; CLOUD DEPLOYMENT</w:t>
+            </w:r>
+          </w:p>
+          <w:p>
+            <w:pPr>
+              <w:spacing w:after="40" w:before="40" w:line="252" w:lineRule="auto"/>
+            </w:pPr>
+            <w:r>
+              <w:rPr>
+                <w:rFonts w:ascii="Times New Roman" w:hAnsi="Times New Roman"/>
+                <w:b w:val="0"/>
+                <w:sz w:val="22"/>
+              </w:rPr>
+              <w:t>3.2 TEAMMATE CONTRIBUTIONS — SARASWATHI S</w:t>
+            </w:r>
+          </w:p>
+          <w:p>
+            <w:pPr>
+              <w:spacing w:after="40" w:before="40" w:line="252" w:lineRule="auto"/>
+            </w:pPr>
+            <w:r>
+              <w:rPr>
+                <w:rFonts w:ascii="Times New Roman" w:hAnsi="Times New Roman"/>
+                <w:b w:val="0"/>
+                <w:sz w:val="22"/>
+              </w:rPr>
+              <w:t xml:space="preserve">    3.2.1 GLASSMORPHIC DESIGN SYSTEM &amp; THEME ENGINE</w:t>
+            </w:r>
+          </w:p>
+          <w:p>
+            <w:pPr>
+              <w:spacing w:after="40" w:before="40" w:line="252" w:lineRule="auto"/>
+            </w:pPr>
+            <w:r>
+              <w:rPr>
+                <w:rFonts w:ascii="Times New Roman" w:hAnsi="Times New Roman"/>
+                <w:b w:val="0"/>
+                <w:sz w:val="22"/>
+              </w:rPr>
+              <w:t xml:space="preserve">    3.2.2 TECHNICIAN WORK QUEUE &amp; SLA COUNTDOWN TIMERS</w:t>
+            </w:r>
+          </w:p>
+          <w:p>
+            <w:pPr>
+              <w:spacing w:after="40" w:before="40" w:line="252" w:lineRule="auto"/>
+            </w:pPr>
+            <w:r>
+              <w:rPr>
+                <w:rFonts w:ascii="Times New Roman" w:hAnsi="Times New Roman"/>
+                <w:b w:val="0"/>
+                <w:sz w:val="22"/>
+              </w:rPr>
+              <w:t xml:space="preserve">    3.2.3 KNOWLEDGE BASE DEFLECTION &amp; CSAT RATING MODAL</w:t>
             </w:r>
           </w:p>
         </w:tc>
@@ -1454,6 +1519,20 @@
               <w:rPr>
                 <w:rFonts w:ascii="Times New Roman" w:hAnsi="Times New Roman"/>
                 <w:b/>
+                <w:sz w:val="22"/>
+              </w:rPr>
+              <w:t>5</w:t>
+            </w:r>
+          </w:p>
+          <w:p>
+            <w:pPr>
+              <w:spacing w:after="40" w:before="40" w:line="252" w:lineRule="auto"/>
+              <w:jc w:val="center"/>
+            </w:pPr>
+            <w:r>
+              <w:rPr>
+                <w:rFonts w:ascii="Times New Roman" w:hAnsi="Times New Roman"/>
+                <w:b w:val="0"/>
                 <w:sz w:val="22"/>
               </w:rPr>
               <w:t>5</w:t>
@@ -1527,6 +1606,62 @@
                 <w:sz w:val="22"/>
               </w:rPr>
               <w:t>9</w:t>
+            </w:r>
+          </w:p>
+          <w:p>
+            <w:pPr>
+              <w:spacing w:after="40" w:before="40" w:line="252" w:lineRule="auto"/>
+              <w:jc w:val="center"/>
+            </w:pPr>
+            <w:r>
+              <w:rPr>
+                <w:rFonts w:ascii="Times New Roman" w:hAnsi="Times New Roman"/>
+                <w:b w:val="0"/>
+                <w:sz w:val="22"/>
+              </w:rPr>
+              <w:t>9</w:t>
+            </w:r>
+          </w:p>
+          <w:p>
+            <w:pPr>
+              <w:spacing w:after="40" w:before="40" w:line="252" w:lineRule="auto"/>
+              <w:jc w:val="center"/>
+            </w:pPr>
+            <w:r>
+              <w:rPr>
+                <w:rFonts w:ascii="Times New Roman" w:hAnsi="Times New Roman"/>
+                <w:b w:val="0"/>
+                <w:sz w:val="22"/>
+              </w:rPr>
+              <w:t>9</w:t>
+            </w:r>
+          </w:p>
+          <w:p>
+            <w:pPr>
+              <w:spacing w:after="40" w:before="40" w:line="252" w:lineRule="auto"/>
+              <w:jc w:val="center"/>
+            </w:pPr>
+            <w:r>
+              <w:rPr>
+                <w:rFonts w:ascii="Times New Roman" w:hAnsi="Times New Roman"/>
+                <w:b w:val="0"/>
+                <w:sz w:val="22"/>
+              </w:rPr>
+              <w:t>10</w:t>
+            </w:r>
+          </w:p>
+          <w:p>
+            <w:pPr>
+              <w:spacing w:after="40" w:before="40" w:line="252" w:lineRule="auto"/>
+              <w:jc w:val="center"/>
+            </w:pPr>
+            <w:r>
+              <w:rPr>
+                <w:rFonts w:ascii="Times New Roman" w:hAnsi="Times New Roman"/>
+                <w:b w:val="0"/>
+                <w:sz w:val="22"/>
+              </w:rPr>
+              <w:t>10</w:t>
             </w:r>
           </w:p>
         </w:tc>
@@ -1684,48 +1819,6 @@
                 <w:b/>
                 <w:sz w:val="22"/>
               </w:rPr>
-              <w:t>10</w:t>
-            </w:r>
-          </w:p>
-          <w:p>
-            <w:pPr>
-              <w:spacing w:after="40" w:before="40" w:line="252" w:lineRule="auto"/>
-              <w:jc w:val="center"/>
-            </w:pPr>
-            <w:r>
-              <w:rPr>
-                <w:rFonts w:ascii="Times New Roman" w:hAnsi="Times New Roman"/>
-                <w:b w:val="0"/>
-                <w:sz w:val="22"/>
-              </w:rPr>
-              <w:t>10</w:t>
-            </w:r>
-          </w:p>
-          <w:p>
-            <w:pPr>
-              <w:spacing w:after="40" w:before="40" w:line="252" w:lineRule="auto"/>
-              <w:jc w:val="center"/>
-            </w:pPr>
-            <w:r>
-              <w:rPr>
-                <w:rFonts w:ascii="Times New Roman" w:hAnsi="Times New Roman"/>
-                <w:b w:val="0"/>
-                <w:sz w:val="22"/>
-              </w:rPr>
-              <w:t>11</w:t>
-            </w:r>
-          </w:p>
-          <w:p>
-            <w:pPr>
-              <w:spacing w:after="40" w:before="40" w:line="252" w:lineRule="auto"/>
-              <w:jc w:val="center"/>
-            </w:pPr>
-            <w:r>
-              <w:rPr>
-                <w:rFonts w:ascii="Times New Roman" w:hAnsi="Times New Roman"/>
-                <w:b w:val="0"/>
-                <w:sz w:val="22"/>
-              </w:rPr>
               <w:t>11</w:t>
             </w:r>
           </w:p>
@@ -1755,6 +1848,48 @@
                 <w:sz w:val="22"/>
               </w:rPr>
               <w:t>12</w:t>
+            </w:r>
+          </w:p>
+          <w:p>
+            <w:pPr>
+              <w:spacing w:after="40" w:before="40" w:line="252" w:lineRule="auto"/>
+              <w:jc w:val="center"/>
+            </w:pPr>
+            <w:r>
+              <w:rPr>
+                <w:rFonts w:ascii="Times New Roman" w:hAnsi="Times New Roman"/>
+                <w:b w:val="0"/>
+                <w:sz w:val="22"/>
+              </w:rPr>
+              <w:t>12</w:t>
+            </w:r>
+          </w:p>
+          <w:p>
+            <w:pPr>
+              <w:spacing w:after="40" w:before="40" w:line="252" w:lineRule="auto"/>
+              <w:jc w:val="center"/>
+            </w:pPr>
+            <w:r>
+              <w:rPr>
+                <w:rFonts w:ascii="Times New Roman" w:hAnsi="Times New Roman"/>
+                <w:b w:val="0"/>
+                <w:sz w:val="22"/>
+              </w:rPr>
+              <w:t>12</w:t>
+            </w:r>
+          </w:p>
+          <w:p>
+            <w:pPr>
+              <w:spacing w:after="40" w:before="40" w:line="252" w:lineRule="auto"/>
+              <w:jc w:val="center"/>
+            </w:pPr>
+            <w:r>
+              <w:rPr>
+                <w:rFonts w:ascii="Times New Roman" w:hAnsi="Times New Roman"/>
+                <w:b w:val="0"/>
+                <w:sz w:val="22"/>
+              </w:rPr>
+              <w:t>13</w:t>
             </w:r>
           </w:p>
         </w:tc>
@@ -1886,180 +2021,6 @@
                 <w:b/>
                 <w:sz w:val="22"/>
               </w:rPr>
-              <w:t>13</w:t>
-            </w:r>
-          </w:p>
-          <w:p>
-            <w:pPr>
-              <w:spacing w:after="40" w:before="40" w:line="252" w:lineRule="auto"/>
-              <w:jc w:val="center"/>
-            </w:pPr>
-            <w:r>
-              <w:rPr>
-                <w:rFonts w:ascii="Times New Roman" w:hAnsi="Times New Roman"/>
-                <w:b w:val="0"/>
-                <w:sz w:val="22"/>
-              </w:rPr>
-              <w:t>13</w:t>
-            </w:r>
-          </w:p>
-          <w:p>
-            <w:pPr>
-              <w:spacing w:after="40" w:before="40" w:line="252" w:lineRule="auto"/>
-              <w:jc w:val="center"/>
-            </w:pPr>
-            <w:r>
-              <w:rPr>
-                <w:rFonts w:ascii="Times New Roman" w:hAnsi="Times New Roman"/>
-                <w:b w:val="0"/>
-                <w:sz w:val="22"/>
-              </w:rPr>
-              <w:t>13</w:t>
-            </w:r>
-          </w:p>
-          <w:p>
-            <w:pPr>
-              <w:spacing w:after="40" w:before="40" w:line="252" w:lineRule="auto"/>
-              <w:jc w:val="center"/>
-            </w:pPr>
-            <w:r>
-              <w:rPr>
-                <w:rFonts w:ascii="Times New Roman" w:hAnsi="Times New Roman"/>
-                <w:b w:val="0"/>
-                <w:sz w:val="22"/>
-              </w:rPr>
-              <w:t>13</w:t>
-            </w:r>
-          </w:p>
-        </w:tc>
-      </w:tr>
-      <w:tr>
-        <w:tc>
-          <w:tcPr>
-            <w:tcW w:type="dxa" w:w="3120"/>
-            <w:tcBorders>
-              <w:top w:val="single" w:sz="12" w:space="0" w:color="000000"/>
-              <w:left w:val="single" w:sz="12" w:space="0" w:color="000000"/>
-              <w:bottom w:val="single" w:sz="12" w:space="0" w:color="000000"/>
-              <w:right w:val="single" w:sz="12" w:space="0" w:color="000000"/>
-            </w:tcBorders>
-            <w:tcMar>
-              <w:top w:w="100" w:type="dxa"/>
-              <w:bottom w:w="100" w:type="dxa"/>
-              <w:left w:w="150" w:type="dxa"/>
-              <w:right w:w="150" w:type="dxa"/>
-            </w:tcMar>
-          </w:tcPr>
-          <w:p>
-            <w:pPr>
-              <w:jc w:val="center"/>
-            </w:pPr>
-            <w:r>
-              <w:rPr>
-                <w:rFonts w:ascii="Times New Roman" w:hAnsi="Times New Roman"/>
-                <w:b/>
-                <w:sz w:val="22"/>
-              </w:rPr>
-              <w:t>6</w:t>
-            </w:r>
-          </w:p>
-        </w:tc>
-        <w:tc>
-          <w:tcPr>
-            <w:tcW w:type="dxa" w:w="3120"/>
-            <w:tcBorders>
-              <w:top w:val="single" w:sz="12" w:space="0" w:color="000000"/>
-              <w:left w:val="single" w:sz="12" w:space="0" w:color="000000"/>
-              <w:bottom w:val="single" w:sz="12" w:space="0" w:color="000000"/>
-              <w:right w:val="single" w:sz="12" w:space="0" w:color="000000"/>
-            </w:tcBorders>
-            <w:tcMar>
-              <w:top w:w="100" w:type="dxa"/>
-              <w:bottom w:w="100" w:type="dxa"/>
-              <w:left w:w="150" w:type="dxa"/>
-              <w:right w:w="150" w:type="dxa"/>
-            </w:tcMar>
-          </w:tcPr>
-          <w:p>
-            <w:pPr>
-              <w:spacing w:after="40" w:before="40" w:line="252" w:lineRule="auto"/>
-            </w:pPr>
-            <w:r>
-              <w:rPr>
-                <w:rFonts w:ascii="Times New Roman" w:hAnsi="Times New Roman"/>
-                <w:b/>
-                <w:sz w:val="22"/>
-              </w:rPr>
-              <w:t>TESTING &amp; INDIVIDUAL MODULE VALIDATION</w:t>
-            </w:r>
-          </w:p>
-          <w:p>
-            <w:pPr>
-              <w:spacing w:after="40" w:before="40" w:line="252" w:lineRule="auto"/>
-            </w:pPr>
-            <w:r>
-              <w:rPr>
-                <w:rFonts w:ascii="Times New Roman" w:hAnsi="Times New Roman"/>
-                <w:b w:val="0"/>
-                <w:sz w:val="22"/>
-              </w:rPr>
-              <w:t>6.1 UNIT TESTING</w:t>
-            </w:r>
-          </w:p>
-          <w:p>
-            <w:pPr>
-              <w:spacing w:after="40" w:before="40" w:line="252" w:lineRule="auto"/>
-            </w:pPr>
-            <w:r>
-              <w:rPr>
-                <w:rFonts w:ascii="Times New Roman" w:hAnsi="Times New Roman"/>
-                <w:b w:val="0"/>
-                <w:sz w:val="22"/>
-              </w:rPr>
-              <w:t>6.2 INTEGRATION TESTING</w:t>
-            </w:r>
-          </w:p>
-          <w:p>
-            <w:pPr>
-              <w:spacing w:after="40" w:before="40" w:line="252" w:lineRule="auto"/>
-            </w:pPr>
-            <w:r>
-              <w:rPr>
-                <w:rFonts w:ascii="Times New Roman" w:hAnsi="Times New Roman"/>
-                <w:b w:val="0"/>
-                <w:sz w:val="22"/>
-              </w:rPr>
-              <w:t>6.3 SECURITY &amp; FALLBACK TESTING</w:t>
-            </w:r>
-          </w:p>
-        </w:tc>
-        <w:tc>
-          <w:tcPr>
-            <w:tcW w:type="dxa" w:w="3120"/>
-            <w:tcBorders>
-              <w:top w:val="single" w:sz="12" w:space="0" w:color="000000"/>
-              <w:left w:val="single" w:sz="12" w:space="0" w:color="000000"/>
-              <w:bottom w:val="single" w:sz="12" w:space="0" w:color="000000"/>
-              <w:right w:val="single" w:sz="12" w:space="0" w:color="000000"/>
-            </w:tcBorders>
-            <w:tcMar>
-              <w:top w:w="100" w:type="dxa"/>
-              <w:bottom w:w="100" w:type="dxa"/>
-              <w:left w:w="150" w:type="dxa"/>
-              <w:right w:w="150" w:type="dxa"/>
-            </w:tcMar>
-          </w:tcPr>
-          <w:p>
-            <w:pPr>
-              <w:spacing w:after="40" w:before="40" w:line="252" w:lineRule="auto"/>
-              <w:jc w:val="center"/>
-            </w:pPr>
-            <w:r>
-              <w:rPr>
-                <w:rFonts w:ascii="Times New Roman" w:hAnsi="Times New Roman"/>
-                <w:b/>
-                <w:sz w:val="22"/>
-              </w:rPr>
               <w:t>14</w:t>
             </w:r>
           </w:p>
@@ -2134,7 +2095,7 @@
                 <w:b/>
                 <w:sz w:val="22"/>
               </w:rPr>
-              <w:t>7</w:t>
+              <w:t>6</w:t>
             </w:r>
           </w:p>
         </w:tc>
@@ -2164,7 +2125,46 @@
                 <w:b/>
                 <w:sz w:val="22"/>
               </w:rPr>
-              <w:t>CONCLUSION &amp; LEARNING OUTCOMES</w:t>
+              <w:t>TESTING &amp; MODULE VALIDATION</w:t>
+            </w:r>
+          </w:p>
+          <w:p>
+            <w:pPr>
+              <w:spacing w:after="40" w:before="40" w:line="252" w:lineRule="auto"/>
+            </w:pPr>
+            <w:r>
+              <w:rPr>
+                <w:rFonts w:ascii="Times New Roman" w:hAnsi="Times New Roman"/>
+                <w:b w:val="0"/>
+                <w:sz w:val="22"/>
+              </w:rPr>
+              <w:t>6.1 UNIT TESTING</w:t>
+            </w:r>
+          </w:p>
+          <w:p>
+            <w:pPr>
+              <w:spacing w:after="40" w:before="40" w:line="252" w:lineRule="auto"/>
+            </w:pPr>
+            <w:r>
+              <w:rPr>
+                <w:rFonts w:ascii="Times New Roman" w:hAnsi="Times New Roman"/>
+                <w:b w:val="0"/>
+                <w:sz w:val="22"/>
+              </w:rPr>
+              <w:t>6.2 INTEGRATION TESTING</w:t>
+            </w:r>
+          </w:p>
+          <w:p>
+            <w:pPr>
+              <w:spacing w:after="40" w:before="40" w:line="252" w:lineRule="auto"/>
+            </w:pPr>
+            <w:r>
+              <w:rPr>
+                <w:rFonts w:ascii="Times New Roman" w:hAnsi="Times New Roman"/>
+                <w:b w:val="0"/>
+                <w:sz w:val="22"/>
+              </w:rPr>
+              <w:t>6.3 SECURITY &amp; FALLBACK TESTING</w:t>
             </w:r>
           </w:p>
         </w:tc>
@@ -2196,6 +2196,141 @@
                 <w:sz w:val="22"/>
               </w:rPr>
               <w:t>15</w:t>
+            </w:r>
+          </w:p>
+          <w:p>
+            <w:pPr>
+              <w:spacing w:after="40" w:before="40" w:line="252" w:lineRule="auto"/>
+              <w:jc w:val="center"/>
+            </w:pPr>
+            <w:r>
+              <w:rPr>
+                <w:rFonts w:ascii="Times New Roman" w:hAnsi="Times New Roman"/>
+                <w:b w:val="0"/>
+                <w:sz w:val="22"/>
+              </w:rPr>
+              <w:t>15</w:t>
+            </w:r>
+          </w:p>
+          <w:p>
+            <w:pPr>
+              <w:spacing w:after="40" w:before="40" w:line="252" w:lineRule="auto"/>
+              <w:jc w:val="center"/>
+            </w:pPr>
+            <w:r>
+              <w:rPr>
+                <w:rFonts w:ascii="Times New Roman" w:hAnsi="Times New Roman"/>
+                <w:b w:val="0"/>
+                <w:sz w:val="22"/>
+              </w:rPr>
+              <w:t>15</w:t>
+            </w:r>
+          </w:p>
+          <w:p>
+            <w:pPr>
+              <w:spacing w:after="40" w:before="40" w:line="252" w:lineRule="auto"/>
+              <w:jc w:val="center"/>
+            </w:pPr>
+            <w:r>
+              <w:rPr>
+                <w:rFonts w:ascii="Times New Roman" w:hAnsi="Times New Roman"/>
+                <w:b w:val="0"/>
+                <w:sz w:val="22"/>
+              </w:rPr>
+              <w:t>15</w:t>
+            </w:r>
+          </w:p>
+        </w:tc>
+      </w:tr>
+      <w:tr>
+        <w:tc>
+          <w:tcPr>
+            <w:tcW w:type="dxa" w:w="3120"/>
+            <w:tcBorders>
+              <w:top w:val="single" w:sz="12" w:space="0" w:color="000000"/>
+              <w:left w:val="single" w:sz="12" w:space="0" w:color="000000"/>
+              <w:bottom w:val="single" w:sz="12" w:space="0" w:color="000000"/>
+              <w:right w:val="single" w:sz="12" w:space="0" w:color="000000"/>
+            </w:tcBorders>
+            <w:tcMar>
+              <w:top w:w="100" w:type="dxa"/>
+              <w:bottom w:w="100" w:type="dxa"/>
+              <w:left w:w="150" w:type="dxa"/>
+              <w:right w:w="150" w:type="dxa"/>
+            </w:tcMar>
+          </w:tcPr>
+          <w:p>
+            <w:pPr>
+              <w:jc w:val="center"/>
+            </w:pPr>
+            <w:r>
+              <w:rPr>
+                <w:rFonts w:ascii="Times New Roman" w:hAnsi="Times New Roman"/>
+                <w:b/>
+                <w:sz w:val="22"/>
+              </w:rPr>
+              <w:t>7</w:t>
+            </w:r>
+          </w:p>
+        </w:tc>
+        <w:tc>
+          <w:tcPr>
+            <w:tcW w:type="dxa" w:w="3120"/>
+            <w:tcBorders>
+              <w:top w:val="single" w:sz="12" w:space="0" w:color="000000"/>
+              <w:left w:val="single" w:sz="12" w:space="0" w:color="000000"/>
+              <w:bottom w:val="single" w:sz="12" w:space="0" w:color="000000"/>
+              <w:right w:val="single" w:sz="12" w:space="0" w:color="000000"/>
+            </w:tcBorders>
+            <w:tcMar>
+              <w:top w:w="100" w:type="dxa"/>
+              <w:bottom w:w="100" w:type="dxa"/>
+              <w:left w:w="150" w:type="dxa"/>
+              <w:right w:w="150" w:type="dxa"/>
+            </w:tcMar>
+          </w:tcPr>
+          <w:p>
+            <w:pPr>
+              <w:spacing w:after="40" w:before="40" w:line="252" w:lineRule="auto"/>
+            </w:pPr>
+            <w:r>
+              <w:rPr>
+                <w:rFonts w:ascii="Times New Roman" w:hAnsi="Times New Roman"/>
+                <w:b/>
+                <w:sz w:val="22"/>
+              </w:rPr>
+              <w:t>CONCLUSION &amp; FUTURE SCOPE</w:t>
+            </w:r>
+          </w:p>
+        </w:tc>
+        <w:tc>
+          <w:tcPr>
+            <w:tcW w:type="dxa" w:w="3120"/>
+            <w:tcBorders>
+              <w:top w:val="single" w:sz="12" w:space="0" w:color="000000"/>
+              <w:left w:val="single" w:sz="12" w:space="0" w:color="000000"/>
+              <w:bottom w:val="single" w:sz="12" w:space="0" w:color="000000"/>
+              <w:right w:val="single" w:sz="12" w:space="0" w:color="000000"/>
+            </w:tcBorders>
+            <w:tcMar>
+              <w:top w:w="100" w:type="dxa"/>
+              <w:bottom w:w="100" w:type="dxa"/>
+              <w:left w:w="150" w:type="dxa"/>
+              <w:right w:w="150" w:type="dxa"/>
+            </w:tcMar>
+          </w:tcPr>
+          <w:p>
+            <w:pPr>
+              <w:spacing w:after="40" w:before="40" w:line="252" w:lineRule="auto"/>
+              <w:jc w:val="center"/>
+            </w:pPr>
+            <w:r>
+              <w:rPr>
+                <w:rFonts w:ascii="Times New Roman" w:hAnsi="Times New Roman"/>
+                <w:b/>
+                <w:sz w:val="22"/>
+              </w:rPr>
+              <w:t>16</w:t>
             </w:r>
           </w:p>
         </w:tc>
@@ -2272,7 +2407,7 @@
                 <w:rFonts w:ascii="Times New Roman" w:hAnsi="Times New Roman"/>
                 <w:b/>
               </w:rPr>
-              <w:t>16</w:t>
+              <w:t>17</w:t>
             </w:r>
           </w:p>
         </w:tc>
@@ -2349,7 +2484,7 @@
                 <w:rFonts w:ascii="Times New Roman" w:hAnsi="Times New Roman"/>
                 <w:b/>
               </w:rPr>
-              <w:t>20</w:t>
+              <w:t>21</w:t>
             </w:r>
           </w:p>
         </w:tc>
@@ -2613,7 +2748,7 @@
                 <w:rFonts w:ascii="Times New Roman" w:hAnsi="Times New Roman"/>
                 <w:b/>
               </w:rPr>
-              <w:t>INDIVIDUAL WORK DIVISION MATRIX</w:t>
+              <w:t>WORK DIVISION &amp; MODULE ALLOCATION MATRIX</w:t>
             </w:r>
           </w:p>
         </w:tc>
@@ -3164,7 +3299,7 @@
                 <w:rFonts w:ascii="Times New Roman" w:hAnsi="Times New Roman"/>
                 <w:b/>
               </w:rPr>
-              <w:t>4.1</w:t>
+              <w:t>3.5</w:t>
             </w:r>
           </w:p>
         </w:tc>
@@ -3193,7 +3328,7 @@
                 <w:rFonts w:ascii="Times New Roman" w:hAnsi="Times New Roman"/>
                 <w:b/>
               </w:rPr>
-              <w:t>OVERALL SYSTEM ARCHITECTURE DIAGRAM</w:t>
+              <w:t>GLASSMORPHIC UI &amp; SLA TIMER COMPONENTS</w:t>
             </w:r>
           </w:p>
         </w:tc>
@@ -3221,7 +3356,7 @@
               <w:rPr>
                 <w:rFonts w:ascii="Times New Roman" w:hAnsi="Times New Roman"/>
               </w:rPr>
-              <w:t>10</w:t>
+              <w:t>9</w:t>
             </w:r>
           </w:p>
         </w:tc>
@@ -3280,7 +3415,7 @@
                 <w:rFonts w:ascii="Times New Roman" w:hAnsi="Times New Roman"/>
                 <w:b/>
               </w:rPr>
-              <w:t>4.2</w:t>
+              <w:t>4.1</w:t>
             </w:r>
           </w:p>
         </w:tc>
@@ -3309,7 +3444,7 @@
                 <w:rFonts w:ascii="Times New Roman" w:hAnsi="Times New Roman"/>
                 <w:b/>
               </w:rPr>
-              <w:t>DFD LEVEL 0 (CONTEXT DIAGRAM)</w:t>
+              <w:t>OVERALL SYSTEM ARCHITECTURE DIAGRAM</w:t>
             </w:r>
           </w:p>
         </w:tc>
@@ -3396,7 +3531,7 @@
                 <w:rFonts w:ascii="Times New Roman" w:hAnsi="Times New Roman"/>
                 <w:b/>
               </w:rPr>
-              <w:t>4.3</w:t>
+              <w:t>4.2</w:t>
             </w:r>
           </w:p>
         </w:tc>
@@ -3425,7 +3560,7 @@
                 <w:rFonts w:ascii="Times New Roman" w:hAnsi="Times New Roman"/>
                 <w:b/>
               </w:rPr>
-              <w:t>DFD LEVEL 1 (SERVICE DESK PROCESSES)</w:t>
+              <w:t>DFD LEVEL 0 (CONTEXT DIAGRAM)</w:t>
             </w:r>
           </w:p>
         </w:tc>
@@ -3453,7 +3588,7 @@
               <w:rPr>
                 <w:rFonts w:ascii="Times New Roman" w:hAnsi="Times New Roman"/>
               </w:rPr>
-              <w:t>11</w:t>
+              <w:t>12</w:t>
             </w:r>
           </w:p>
         </w:tc>
@@ -3512,7 +3647,7 @@
                 <w:rFonts w:ascii="Times New Roman" w:hAnsi="Times New Roman"/>
                 <w:b/>
               </w:rPr>
-              <w:t>4.4</w:t>
+              <w:t>4.3</w:t>
             </w:r>
           </w:p>
         </w:tc>
@@ -3541,7 +3676,7 @@
                 <w:rFonts w:ascii="Times New Roman" w:hAnsi="Times New Roman"/>
                 <w:b/>
               </w:rPr>
-              <w:t>DFD LEVEL 2 (AI TRIAGE &amp; SLA ENGINE)</w:t>
+              <w:t>DFD LEVEL 1 (SERVICE DESK PROCESSES)</w:t>
             </w:r>
           </w:p>
         </w:tc>
@@ -3628,7 +3763,7 @@
                 <w:rFonts w:ascii="Times New Roman" w:hAnsi="Times New Roman"/>
                 <w:b/>
               </w:rPr>
-              <w:t>5.1</w:t>
+              <w:t>4.4</w:t>
             </w:r>
           </w:p>
         </w:tc>
@@ -3657,7 +3792,7 @@
                 <w:rFonts w:ascii="Times New Roman" w:hAnsi="Times New Roman"/>
                 <w:b/>
               </w:rPr>
-              <w:t>AUTHENTICATION &amp; 2FA VERIFICATION SCREEN</w:t>
+              <w:t>DFD LEVEL 2 (AI TRIAGE &amp; SLA ENGINE)</w:t>
             </w:r>
           </w:p>
         </w:tc>
@@ -3744,6 +3879,122 @@
                 <w:rFonts w:ascii="Times New Roman" w:hAnsi="Times New Roman"/>
                 <w:b/>
               </w:rPr>
+              <w:t>5.1</w:t>
+            </w:r>
+          </w:p>
+        </w:tc>
+        <w:tc>
+          <w:tcPr>
+            <w:tcW w:type="dxa" w:w="4752"/>
+            <w:tcBorders>
+              <w:top w:val="single" w:sz="12" w:space="0" w:color="000000"/>
+              <w:left w:val="single" w:sz="12" w:space="0" w:color="000000"/>
+              <w:bottom w:val="single" w:sz="12" w:space="0" w:color="000000"/>
+              <w:right w:val="single" w:sz="12" w:space="0" w:color="000000"/>
+            </w:tcBorders>
+            <w:tcMar>
+              <w:top w:w="100" w:type="dxa"/>
+              <w:bottom w:w="100" w:type="dxa"/>
+              <w:left w:w="150" w:type="dxa"/>
+              <w:right w:w="150" w:type="dxa"/>
+            </w:tcMar>
+          </w:tcPr>
+          <w:p>
+            <w:pPr>
+              <w:jc w:val="center"/>
+            </w:pPr>
+            <w:r>
+              <w:rPr>
+                <w:rFonts w:ascii="Times New Roman" w:hAnsi="Times New Roman"/>
+                <w:b/>
+              </w:rPr>
+              <w:t>AUTHENTICATION &amp; 2FA VERIFICATION SCREEN</w:t>
+            </w:r>
+          </w:p>
+        </w:tc>
+        <w:tc>
+          <w:tcPr>
+            <w:tcW w:type="dxa" w:w="1440"/>
+            <w:tcBorders>
+              <w:top w:val="single" w:sz="12" w:space="0" w:color="000000"/>
+              <w:left w:val="single" w:sz="12" w:space="0" w:color="000000"/>
+              <w:bottom w:val="single" w:sz="12" w:space="0" w:color="000000"/>
+              <w:right w:val="single" w:sz="12" w:space="0" w:color="000000"/>
+            </w:tcBorders>
+            <w:tcMar>
+              <w:top w:w="100" w:type="dxa"/>
+              <w:bottom w:w="100" w:type="dxa"/>
+              <w:left w:w="150" w:type="dxa"/>
+              <w:right w:w="150" w:type="dxa"/>
+            </w:tcMar>
+          </w:tcPr>
+          <w:p>
+            <w:pPr>
+              <w:jc w:val="center"/>
+            </w:pPr>
+            <w:r>
+              <w:rPr>
+                <w:rFonts w:ascii="Times New Roman" w:hAnsi="Times New Roman"/>
+              </w:rPr>
+              <w:t>14</w:t>
+            </w:r>
+          </w:p>
+        </w:tc>
+      </w:tr>
+      <w:tr>
+        <w:tc>
+          <w:tcPr>
+            <w:tcW w:type="dxa" w:w="1296"/>
+            <w:tcBorders>
+              <w:top w:val="single" w:sz="12" w:space="0" w:color="000000"/>
+              <w:left w:val="single" w:sz="12" w:space="0" w:color="000000"/>
+              <w:bottom w:val="single" w:sz="12" w:space="0" w:color="000000"/>
+              <w:right w:val="single" w:sz="12" w:space="0" w:color="000000"/>
+            </w:tcBorders>
+            <w:tcMar>
+              <w:top w:w="100" w:type="dxa"/>
+              <w:bottom w:w="100" w:type="dxa"/>
+              <w:left w:w="150" w:type="dxa"/>
+              <w:right w:w="150" w:type="dxa"/>
+            </w:tcMar>
+          </w:tcPr>
+          <w:p>
+            <w:pPr>
+              <w:jc w:val="center"/>
+            </w:pPr>
+            <w:r>
+              <w:rPr>
+                <w:rFonts w:ascii="Times New Roman" w:hAnsi="Times New Roman"/>
+              </w:rPr>
+              <w:t>12</w:t>
+            </w:r>
+          </w:p>
+        </w:tc>
+        <w:tc>
+          <w:tcPr>
+            <w:tcW w:type="dxa" w:w="1872"/>
+            <w:tcBorders>
+              <w:top w:val="single" w:sz="12" w:space="0" w:color="000000"/>
+              <w:left w:val="single" w:sz="12" w:space="0" w:color="000000"/>
+              <w:bottom w:val="single" w:sz="12" w:space="0" w:color="000000"/>
+              <w:right w:val="single" w:sz="12" w:space="0" w:color="000000"/>
+            </w:tcBorders>
+            <w:tcMar>
+              <w:top w:w="100" w:type="dxa"/>
+              <w:bottom w:w="100" w:type="dxa"/>
+              <w:left w:w="150" w:type="dxa"/>
+              <w:right w:w="150" w:type="dxa"/>
+            </w:tcMar>
+          </w:tcPr>
+          <w:p>
+            <w:pPr>
+              <w:jc w:val="center"/>
+            </w:pPr>
+            <w:r>
+              <w:rPr>
+                <w:rFonts w:ascii="Times New Roman" w:hAnsi="Times New Roman"/>
+                <w:b/>
+              </w:rPr>
               <w:t>5.2</w:t>
             </w:r>
           </w:p>
@@ -3801,7 +4052,7 @@
               <w:rPr>
                 <w:rFonts w:ascii="Times New Roman" w:hAnsi="Times New Roman"/>
               </w:rPr>
-              <w:t>13</w:t>
+              <w:t>14</w:t>
             </w:r>
           </w:p>
         </w:tc>
@@ -3869,7 +4120,7 @@
           <w:i w:val="0"/>
           <w:sz w:val="24"/>
         </w:rPr>
-        <w:t>The Enterprise IT &amp; Corporate Facilities Service Portal is a unified web application engineered to automate service management across IT operations, facility maintenance, and emergency response. Modern organizations face significant inefficiency when operating fragmented service desks, manual ticket triage, unmonitored SLA breaches, and slow emergency notifications.</w:t>
+        <w:t>The Enterprise IT &amp; Corporate Facilities Service Portal is a unified web application engineered to automate service management across IT operations, facility maintenance, and corporate safety operations. Modern enterprise employees often struggle with unintuitive helpdesk tools, lack of SLA visibility, manual ticket routing, and tedious ticket submission forms.</w:t>
       </w:r>
     </w:p>
     <w:p>
@@ -3884,7 +4135,7 @@
           <w:i w:val="0"/>
           <w:sz w:val="24"/>
         </w:rPr>
-        <w:t>This project implements a multi-role service management ecosystem powered by artificial intelligence and cloud telephony. It features real-time ticket categorization, priority scoring, automated technician assignment, live countdown SLA timers, email 2FA authentication, and emergency voice dispatching.</w:t>
+        <w:t>This project delivers a responsive, modern glassmorphic web interface supporting role-based access for Employees, Technicians, and System Administrators. It features real-time ticket categorization, priority scoring, automated technician assignment, live countdown SLA timers, email 2FA authentication, and emergency voice dispatching.</w:t>
       </w:r>
     </w:p>
     <w:p>
@@ -3989,7 +4240,7 @@
           <w:b/>
           <w:sz w:val="28"/>
         </w:rPr>
-        <w:t>1.3 ORGANIZATION OF INDIVIDUAL REPORT</w:t>
+        <w:t>1.3 ORGANIZATION OF THE PROJECT REPORT</w:t>
       </w:r>
     </w:p>
     <w:p>
@@ -4004,7 +4255,7 @@
           <w:i w:val="0"/>
           <w:sz w:val="24"/>
         </w:rPr>
-        <w:t>In accordance with department guidelines, this report details my individual contributions and technical modules:</w:t>
+        <w:t>This report is organized into the following chapters:</w:t>
       </w:r>
     </w:p>
     <w:p>
@@ -4019,7 +4270,7 @@
           <w:i w:val="0"/>
           <w:sz w:val="24"/>
         </w:rPr>
-        <w:t>• Chapter 2 details the team composition and individual work division matrix.</w:t>
+        <w:t>• Chapter 1 introduces the project background, problem statement, and report organization.</w:t>
       </w:r>
     </w:p>
     <w:p>
@@ -4034,7 +4285,7 @@
           <w:i w:val="0"/>
           <w:sz w:val="24"/>
         </w:rPr>
-        <w:t>• Chapter 3 presents SAM ANTROSE A H's core technical modules (Spring Boot backend, Python AI microservice, 2FA security, cloud telephony, and deployment).</w:t>
+        <w:t>• Chapter 2 details the team composition, role allocation, and individual work division matrix.</w:t>
       </w:r>
     </w:p>
     <w:p>
@@ -4049,7 +4300,7 @@
           <w:i w:val="0"/>
           <w:sz w:val="24"/>
         </w:rPr>
-        <w:t>• Chapter 4 details the system architecture and Data Flow Diagrams.</w:t>
+        <w:t>• Chapter 3 presents technical module implementation with cross-referenced teammate contributions.</w:t>
       </w:r>
     </w:p>
     <w:p>
@@ -4064,7 +4315,7 @@
           <w:i w:val="0"/>
           <w:sz w:val="24"/>
         </w:rPr>
-        <w:t>• Chapter 5 illustrates the user interface input/output screens.</w:t>
+        <w:t>• Chapter 4 details system architecture and Data Flow Diagrams (Levels 0, 1, and 2).</w:t>
       </w:r>
     </w:p>
     <w:p>
@@ -4079,7 +4330,7 @@
           <w:i w:val="0"/>
           <w:sz w:val="24"/>
         </w:rPr>
-        <w:t>• Chapter 6 covers module testing, verification, and code coverage.</w:t>
+        <w:t>• Chapter 5 illustrates user interface input and output screens.</w:t>
       </w:r>
     </w:p>
     <w:p>
@@ -4094,7 +4345,22 @@
           <w:i w:val="0"/>
           <w:sz w:val="24"/>
         </w:rPr>
-        <w:t>• Chapter 7 concludes with key achievements and individual learning outcomes.</w:t>
+        <w:t>• Chapter 6 covers quality assurance, unit testing, integration testing, and verification results.</w:t>
+      </w:r>
+    </w:p>
+    <w:p>
+      <w:pPr>
+        <w:spacing w:after="120" w:line="276" w:lineRule="auto"/>
+        <w:jc w:val="both"/>
+      </w:pPr>
+      <w:r>
+        <w:rPr>
+          <w:rFonts w:ascii="Times New Roman" w:hAnsi="Times New Roman"/>
+          <w:b w:val="0"/>
+          <w:i w:val="0"/>
+          <w:sz w:val="24"/>
+        </w:rPr>
+        <w:t>• Chapter 7 concludes the report with key deliverables and future scope.</w:t>
       </w:r>
     </w:p>
     <w:p>
@@ -4129,7 +4395,7 @@
           <w:b/>
           <w:sz w:val="32"/>
         </w:rPr>
-        <w:t>TEAM COMPOSITION &amp; INDIVIDUAL WORK DIVISION</w:t>
+        <w:t>TEAM COMPOSITION &amp; WORK DIVISION</w:t>
       </w:r>
     </w:p>
     <w:p>
@@ -4159,7 +4425,7 @@
           <w:i w:val="0"/>
           <w:sz w:val="24"/>
         </w:rPr>
-        <w:t>The project was carried out by a 2-member development team with clear division of technical responsibilities:</w:t>
+        <w:t>The project was implemented by a 2-member development team with clear division of technical responsibilities:</w:t>
       </w:r>
     </w:p>
     <w:tbl>
@@ -4442,7 +4708,7 @@
           <w:b/>
           <w:sz w:val="28"/>
         </w:rPr>
-        <w:t>2.2 SAM ANTROSE A H'S INDIVIDUAL RESPONSIBILITIES</w:t>
+        <w:t>2.2 WORK DIVISION MATRIX</w:t>
       </w:r>
     </w:p>
     <w:p>
@@ -4457,7 +4723,7 @@
           <w:i w:val="0"/>
           <w:sz w:val="24"/>
         </w:rPr>
-        <w:t>As Lead Backend &amp; AI Architect, my individual technical responsibilities were strictly defined as follows:</w:t>
+        <w:t>The overall system development was divided into decoupled backend microservices and frontend user experience layers:</w:t>
       </w:r>
     </w:p>
     <w:p>
@@ -4472,7 +4738,7 @@
           <w:i w:val="0"/>
           <w:sz w:val="24"/>
         </w:rPr>
-        <w:t>1. Python FastAPI AI Triage Service: Engineered the backend NLP pipeline executing DistilBERT (category) and RoBERTa (sentiment/urgency) inference.</w:t>
+        <w:t>1. Sam Antrose A H (Reg. No: RA2532241040033): Spearheaded Spring Boot 3 REST controllers, JPA entity persistence, Python FastAPI NLP inference backend, email 2FA OTP gateway, native telephony URI handlers, and Render.com deployment.</w:t>
       </w:r>
     </w:p>
     <w:p>
@@ -4487,52 +4753,7 @@
           <w:i w:val="0"/>
           <w:sz w:val="24"/>
         </w:rPr>
-        <w:t>2. Spring Boot 3 Java Backend: Architected the REST controllers, JPA entity repositories, JWT token processing, and database profile configurations.</w:t>
-      </w:r>
-    </w:p>
-    <w:p>
-      <w:pPr>
-        <w:spacing w:after="120" w:line="276" w:lineRule="auto"/>
-        <w:jc w:val="both"/>
-      </w:pPr>
-      <w:r>
-        <w:rPr>
-          <w:rFonts w:ascii="Times New Roman" w:hAnsi="Times New Roman"/>
-          <w:b w:val="0"/>
-          <w:i w:val="0"/>
-          <w:sz w:val="24"/>
-        </w:rPr>
-        <w:t>3. Two-Factor Authentication (2FA) Engine: Built the email OTP dispatch handler using FormSubmit REST API alongside account lockout logic.</w:t>
-      </w:r>
-    </w:p>
-    <w:p>
-      <w:pPr>
-        <w:spacing w:after="120" w:line="276" w:lineRule="auto"/>
-        <w:jc w:val="both"/>
-      </w:pPr>
-      <w:r>
-        <w:rPr>
-          <w:rFonts w:ascii="Times New Roman" w:hAnsi="Times New Roman"/>
-          <w:b w:val="0"/>
-          <w:i w:val="0"/>
-          <w:sz w:val="24"/>
-        </w:rPr>
-        <w:t>4. Cloud Telephony Integration: Configured native mobile dialer URI handlers (tel: protocol) synced with automated instant emergency email dispatch.</w:t>
-      </w:r>
-    </w:p>
-    <w:p>
-      <w:pPr>
-        <w:spacing w:after="120" w:line="276" w:lineRule="auto"/>
-        <w:jc w:val="both"/>
-      </w:pPr>
-      <w:r>
-        <w:rPr>
-          <w:rFonts w:ascii="Times New Roman" w:hAnsi="Times New Roman"/>
-          <w:b w:val="0"/>
-          <w:i w:val="0"/>
-          <w:sz w:val="24"/>
-        </w:rPr>
-        <w:t>5. DevOps &amp; Cloud Infrastructure: Configured GitHub version control, Docker multi-stage build files, and Render.com cloud deployment.</w:t>
+        <w:t>2. Saraswathi S (Reg. No: RA2532241040036): Spearheaded glassmorphic CSS design system, responsive layout grids, SLA countdown timer components, Knowledge Base self-service deflection engine, ITAM/CAB dialogs, and QA testing.</w:t>
       </w:r>
     </w:p>
     <w:p>
@@ -4567,7 +4788,7 @@
           <w:b/>
           <w:sz w:val="32"/>
         </w:rPr>
-        <w:t>INDIVIDUAL TECHNICAL MODULES &amp; IMPLEMENTATION</w:t>
+        <w:t>TECHNICAL MODULE IMPLEMENTATION &amp; TEAM CONTRIBUTIONS</w:t>
       </w:r>
     </w:p>
     <w:p>
@@ -4582,7 +4803,7 @@
           <w:b/>
           <w:sz w:val="28"/>
         </w:rPr>
-        <w:t>3.1 SPRING BOOT 3 REST API &amp; DATABASE LAYER</w:t>
+        <w:t>3.1 PRIMARY CONTRIBUTIONS — SAM ANTROSE A H</w:t>
       </w:r>
     </w:p>
     <w:p>
@@ -4597,7 +4818,7 @@
           <w:i w:val="0"/>
           <w:sz w:val="24"/>
         </w:rPr>
-        <w:t>I developed the core Spring Boot 3 backend application (com.enterprise.portal). Key backend components engineered individually include:</w:t>
+        <w:t>As Lead Backend &amp; AI Architect, my primary technical modules designed and implemented comprise:</w:t>
       </w:r>
     </w:p>
     <w:p>
@@ -4612,7 +4833,7 @@
           <w:i w:val="0"/>
           <w:sz w:val="24"/>
         </w:rPr>
-        <w:t>• EnterprisePortalApplication.java: Configured with SpringBootServletInitializer to support both standalone JAR execution and Tomcat 10 WTP deployment.</w:t>
+        <w:t>3.1.1 Spring Boot 3 REST API &amp; Database Layer: Developed com.enterprise.portal architecture, SecurityConfig filter chain with JWT authentication, AuthController, TicketController, AssetController, KbArticleController, and application.yml supporting H2 and PostgreSQL.</w:t>
       </w:r>
     </w:p>
     <w:p>
@@ -4627,7 +4848,7 @@
           <w:i w:val="0"/>
           <w:sz w:val="24"/>
         </w:rPr>
-        <w:t>• SecurityConfig.java: Implemented Spring Security filter chain with stateless JWT authentication, CORS configuration, and password BCrypt encoding.</w:t>
+        <w:t>3.1.2 Python FastAPI AI Microservice (Hugging Face NLP): Engineered server.py microservice executing DistilBERT category classification and RoBERTa sentiment/urgency evaluation with heuristic fallback logic.</w:t>
       </w:r>
     </w:p>
     <w:p>
@@ -4642,7 +4863,7 @@
           <w:i w:val="0"/>
           <w:sz w:val="24"/>
         </w:rPr>
-        <w:t>• REST Controllers: Built AuthController, TicketController, AssetController, KbArticleController, ChangeRequestController, and AuditLogController.</w:t>
+        <w:t>3.1.3 Multi-Role Authentication &amp; Email 2FA OTP Security: Built 6-digit OTP code dispatch engine via FormSubmit REST API alongside 15-minute brute-force lockout protection.</w:t>
       </w:r>
     </w:p>
     <w:p>
@@ -4657,22 +4878,7 @@
           <w:i w:val="0"/>
           <w:sz w:val="24"/>
         </w:rPr>
-        <w:t>• Database Profiles: Configured application.yml supporting zero-config H2 embedded database for local dev and PostgreSQL for production.</w:t>
-      </w:r>
-    </w:p>
-    <w:p>
-      <w:pPr>
-        <w:keepNext/>
-        <w:spacing w:before="240" w:after="120"/>
-        <w:jc w:val="left"/>
-      </w:pPr>
-      <w:r>
-        <w:rPr>
-          <w:rFonts w:ascii="Times New Roman" w:hAnsi="Times New Roman"/>
-          <w:b/>
-          <w:sz w:val="28"/>
-        </w:rPr>
-        <w:t>3.2 PYTHON FASTAPI AI MICROSERVICE (HUGGING FACE NLP)</w:t>
+        <w:t>3.1.4 Emergency Telephony &amp; Cloud Alert Dispatch: Configured native mobile dialer integration (tel: protocol) paired with automated instant emergency email alerts to samantrose7@gmail.com.</w:t>
       </w:r>
     </w:p>
     <w:p>
@@ -4687,7 +4893,22 @@
           <w:i w:val="0"/>
           <w:sz w:val="24"/>
         </w:rPr>
-        <w:t>I designed and implemented the standalone Python FastAPI AI microservice (server.py) that performs real-time NLP inference on incident descriptions:</w:t>
+        <w:t>3.1.5 Docker Containerization &amp; Cloud Deployment: Configured multi-stage Docker builds and continuous deployment pipelines connecting GitHub to Render.com.</w:t>
+      </w:r>
+    </w:p>
+    <w:p>
+      <w:pPr>
+        <w:keepNext/>
+        <w:spacing w:before="360" w:after="120"/>
+        <w:jc w:val="left"/>
+      </w:pPr>
+      <w:r>
+        <w:rPr>
+          <w:rFonts w:ascii="Times New Roman" w:hAnsi="Times New Roman"/>
+          <w:b/>
+          <w:sz w:val="28"/>
+        </w:rPr>
+        <w:t>3.2 TEAMMATE CONTRIBUTIONS — SARASWATHI S</w:t>
       </w:r>
     </w:p>
     <w:p>
@@ -4702,7 +4923,7 @@
           <w:i w:val="0"/>
           <w:sz w:val="24"/>
         </w:rPr>
-        <w:t>• Category Classifier: DistilBERT model (distilbert-base-uncased) trained to classify requests into Hardware, Software, Facilities, or Network.</w:t>
+        <w:t>To deliver a complete end-to-end portal, my teammate Saraswathi S (Reg. No: RA2532241040036) engineered the frontend user interface and quality assurance layers:</w:t>
       </w:r>
     </w:p>
     <w:p>
@@ -4717,7 +4938,7 @@
           <w:i w:val="0"/>
           <w:sz w:val="24"/>
         </w:rPr>
-        <w:t>• Urgency Analyzer: RoBERTa model (twitter-roberta-base-sentiment) analyzing text tone to output priority scores (P1 Critical through P4 Low).</w:t>
+        <w:t>3.2.1 Glassmorphic Design System &amp; Theme Engine: Built styles.css featuring 40+ CSS custom properties, backdrop blur effects, responsive grid cards, and Light/Dark mode switcher.</w:t>
       </w:r>
     </w:p>
     <w:p>
@@ -4732,22 +4953,7 @@
           <w:i w:val="0"/>
           <w:sz w:val="24"/>
         </w:rPr>
-        <w:t>• Frontend Fallback: Programmed keyword heuristic fallback logic ensuring 100% system availability even when offline.</w:t>
-      </w:r>
-    </w:p>
-    <w:p>
-      <w:pPr>
-        <w:keepNext/>
-        <w:spacing w:before="240" w:after="120"/>
-        <w:jc w:val="left"/>
-      </w:pPr>
-      <w:r>
-        <w:rPr>
-          <w:rFonts w:ascii="Times New Roman" w:hAnsi="Times New Roman"/>
-          <w:b/>
-          <w:sz w:val="28"/>
-        </w:rPr>
-        <w:t>3.3 MULTI-ROLE AUTHENTICATION &amp; EMAIL 2FA OTP SECURITY</w:t>
+        <w:t>3.2.2 Technician Work Queue &amp; SLA Countdown Timers: Built domain-filtered work queues for Hardware/Software technicians with live HH:MM:SS SLA countdown timers updating every second.</w:t>
       </w:r>
     </w:p>
     <w:p>
@@ -4762,157 +4968,7 @@
           <w:i w:val="0"/>
           <w:sz w:val="24"/>
         </w:rPr>
-        <w:t>I built the multi-role security engine supporting System Admin, Employee, Hardware Tech, and Software Tech accounts:</w:t>
-      </w:r>
-    </w:p>
-    <w:p>
-      <w:pPr>
-        <w:spacing w:after="120" w:line="276" w:lineRule="auto"/>
-        <w:jc w:val="both"/>
-      </w:pPr>
-      <w:r>
-        <w:rPr>
-          <w:rFonts w:ascii="Times New Roman" w:hAnsi="Times New Roman"/>
-          <w:b w:val="0"/>
-          <w:i w:val="0"/>
-          <w:sz w:val="24"/>
-        </w:rPr>
-        <w:t>• 2FA Email Dispatch: Generated random 6-digit OTP codes sent to the user's real email inbox via FormSubmit REST API.</w:t>
-      </w:r>
-    </w:p>
-    <w:p>
-      <w:pPr>
-        <w:spacing w:after="120" w:line="276" w:lineRule="auto"/>
-        <w:jc w:val="both"/>
-      </w:pPr>
-      <w:r>
-        <w:rPr>
-          <w:rFonts w:ascii="Times New Roman" w:hAnsi="Times New Roman"/>
-          <w:b w:val="0"/>
-          <w:i w:val="0"/>
-          <w:sz w:val="24"/>
-        </w:rPr>
-        <w:t>• Account Lockout: Enforced security policy automatically locking accounts for 15 minutes after 5 failed login attempts.</w:t>
-      </w:r>
-    </w:p>
-    <w:p>
-      <w:pPr>
-        <w:keepNext/>
-        <w:spacing w:before="240" w:after="120"/>
-        <w:jc w:val="left"/>
-      </w:pPr>
-      <w:r>
-        <w:rPr>
-          <w:rFonts w:ascii="Times New Roman" w:hAnsi="Times New Roman"/>
-          <w:b/>
-          <w:sz w:val="28"/>
-        </w:rPr>
-        <w:t>3.4 EMERGENCY TELEPHONY &amp; CLOUD ALERT DISPATCH</w:t>
-      </w:r>
-    </w:p>
-    <w:p>
-      <w:pPr>
-        <w:spacing w:after="120" w:line="276" w:lineRule="auto"/>
-        <w:jc w:val="both"/>
-      </w:pPr>
-      <w:r>
-        <w:rPr>
-          <w:rFonts w:ascii="Times New Roman" w:hAnsi="Times New Roman"/>
-          <w:b w:val="0"/>
-          <w:i w:val="0"/>
-          <w:sz w:val="24"/>
-        </w:rPr>
-        <w:t>I integrated a dual-channel emergency response system for P1 critical incidents:</w:t>
-      </w:r>
-    </w:p>
-    <w:p>
-      <w:pPr>
-        <w:spacing w:after="120" w:line="276" w:lineRule="auto"/>
-        <w:jc w:val="both"/>
-      </w:pPr>
-      <w:r>
-        <w:rPr>
-          <w:rFonts w:ascii="Times New Roman" w:hAnsi="Times New Roman"/>
-          <w:b w:val="0"/>
-          <w:i w:val="0"/>
-          <w:sz w:val="24"/>
-        </w:rPr>
-        <w:t>1. Invokes the device's native voice dialer via tel: protocol targeting emergency contact (+91 9944467393).</w:t>
-      </w:r>
-    </w:p>
-    <w:p>
-      <w:pPr>
-        <w:spacing w:after="120" w:line="276" w:lineRule="auto"/>
-        <w:jc w:val="both"/>
-      </w:pPr>
-      <w:r>
-        <w:rPr>
-          <w:rFonts w:ascii="Times New Roman" w:hAnsi="Times New Roman"/>
-          <w:b w:val="0"/>
-          <w:i w:val="0"/>
-          <w:sz w:val="24"/>
-        </w:rPr>
-        <w:t>2. Simultaneously dispatches an automated priority alert email to the System Administrator (samantrose7@gmail.com).</w:t>
-      </w:r>
-    </w:p>
-    <w:p>
-      <w:pPr>
-        <w:keepNext/>
-        <w:spacing w:before="240" w:after="120"/>
-        <w:jc w:val="left"/>
-      </w:pPr>
-      <w:r>
-        <w:rPr>
-          <w:rFonts w:ascii="Times New Roman" w:hAnsi="Times New Roman"/>
-          <w:b/>
-          <w:sz w:val="28"/>
-        </w:rPr>
-        <w:t>3.5 DOCKER CONTAINERIZATION &amp; CLOUD DEPLOYMENT</w:t>
-      </w:r>
-    </w:p>
-    <w:p>
-      <w:pPr>
-        <w:spacing w:after="120" w:line="276" w:lineRule="auto"/>
-        <w:jc w:val="both"/>
-      </w:pPr>
-      <w:r>
-        <w:rPr>
-          <w:rFonts w:ascii="Times New Roman" w:hAnsi="Times New Roman"/>
-          <w:b w:val="0"/>
-          <w:i w:val="0"/>
-          <w:sz w:val="24"/>
-        </w:rPr>
-        <w:t>I established the continuous deployment pipeline:</w:t>
-      </w:r>
-    </w:p>
-    <w:p>
-      <w:pPr>
-        <w:spacing w:after="120" w:line="276" w:lineRule="auto"/>
-        <w:jc w:val="both"/>
-      </w:pPr>
-      <w:r>
-        <w:rPr>
-          <w:rFonts w:ascii="Times New Roman" w:hAnsi="Times New Roman"/>
-          <w:b w:val="0"/>
-          <w:i w:val="0"/>
-          <w:sz w:val="24"/>
-        </w:rPr>
-        <w:t>• Dockerfile: Multi-stage Docker build containerizing JDK 17 runtime and Maven dependencies.</w:t>
-      </w:r>
-    </w:p>
-    <w:p>
-      <w:pPr>
-        <w:spacing w:after="120" w:line="276" w:lineRule="auto"/>
-        <w:jc w:val="both"/>
-      </w:pPr>
-      <w:r>
-        <w:rPr>
-          <w:rFonts w:ascii="Times New Roman" w:hAnsi="Times New Roman"/>
-          <w:b w:val="0"/>
-          <w:i w:val="0"/>
-          <w:sz w:val="24"/>
-        </w:rPr>
-        <w:t>• GitHub &amp; Render.com: Connected GitHub repository (SamAntrose/enterprise-service-portal) to Render.com for automated cloud deployments.</w:t>
+        <w:t>3.2.3 Knowledge Base Deflection &amp; CSAT Rating Modal: Developed interactive self-service solution suggestions before ticket creation, asset linking dropdowns, and 5-star CSAT customer feedback dialogs.</w:t>
       </w:r>
     </w:p>
     <w:p>
@@ -5192,7 +5248,7 @@
           <w:b/>
           <w:sz w:val="32"/>
         </w:rPr>
-        <w:t>TESTING &amp; INDIVIDUAL MODULE VALIDATION</w:t>
+        <w:t>TESTING &amp; MODULE VALIDATION</w:t>
       </w:r>
     </w:p>
     <w:p>
@@ -5267,7 +5323,7 @@
           <w:b/>
           <w:sz w:val="32"/>
         </w:rPr>
-        <w:t>CONCLUSION &amp; LEARNING OUTCOMES</w:t>
+        <w:t>CONCLUSION &amp; FUTURE SCOPE</w:t>
       </w:r>
     </w:p>
     <w:p>
@@ -5282,7 +5338,7 @@
           <w:i w:val="0"/>
           <w:sz w:val="24"/>
         </w:rPr>
-        <w:t>The Enterprise IT &amp; Corporate Facilities Service Portal successfully demonstrates an AI-enabled, cloud-ready service desk platform. Through this project, I gained extensive experience in architecting Spring Boot REST APIs, building Hugging Face NLP inference microservices in Python FastAPI, implementing real email 2FA authentication, and managing cloud deployment pipelines.</w:t>
+        <w:t>The Enterprise IT &amp; Corporate Facilities Service Portal successfully demonstrates an AI-enabled, cloud-ready service desk platform. Through collaborative engineering, the platform reduces resolution times, eliminates manual ticket routing delays, and provides operational transparency for enterprise IT and facility operations.</w:t>
       </w:r>
     </w:p>
     <w:p>

</xml_diff>

<commit_message>
Update Acknowledgement with exact SRM department faculty names and candidate signature block
</commit_message>
<xml_diff>
--- a/Enterprise_IT_Service_Portal_Individual_Report_SAM.docx
+++ b/Enterprise_IT_Service_Portal_Individual_Report_SAM.docx
@@ -122,7 +122,7 @@
           <w:b/>
           <w:sz w:val="26"/>
         </w:rPr>
-        <w:t>[Guide Name with Full Qualifications]</w:t>
+        <w:t>Dr. J. ANITHA RUTH, M.S., Ph.D.</w:t>
       </w:r>
     </w:p>
     <w:p>
@@ -298,7 +298,7 @@
               <w:spacing w:before="600"/>
             </w:pPr>
             <w:r>
-              <w:t>Name of the Guide with Maximum Qualification</w:t>
+              <w:t>Dr. J. ANITHA RUTH, M.S., Ph.D.</w:t>
             </w:r>
           </w:p>
         </w:tc>
@@ -312,7 +312,7 @@
               <w:jc w:val="right"/>
             </w:pPr>
             <w:r>
-              <w:t>Name HoD with Qualification</w:t>
+              <w:t>Dr. J. ANITHA RUTH, M.S., Ph.D.</w:t>
             </w:r>
           </w:p>
         </w:tc>
@@ -404,7 +404,7 @@
           <w:i w:val="0"/>
           <w:sz w:val="24"/>
         </w:rPr>
-        <w:t>First and foremost, I would like to thank with a deep sense of gratitude, the management of SRM Institute of Science &amp; Technology for their constant support and endorsement.</w:t>
+        <w:t>I express my deepest sense of gratitude and sincere thanks to the Management and Dean, Faculty of Liberal Arts and Business Studies, SRM Institute of Science and Technology, Vadapalani, for providing the necessary facilities, academic environment, and infrastructure throughout the course of this project.</w:t>
       </w:r>
     </w:p>
     <w:p>
@@ -419,7 +419,7 @@
           <w:i w:val="0"/>
           <w:sz w:val="24"/>
         </w:rPr>
-        <w:t>I wish to express my sincere gratitude to the Dean, Dr. [Dean Name], Faculty of Liberal Arts and Business Studies for his constant support and encouragement.</w:t>
+        <w:t>I wish to express my profound gratitude and heartfelt thanks to the Head of the Department, Dr. J. ANITHA RUTH, M.C.A., M.Phil., M.S., Ph.D., Department of Computer Applications (MCA), for her constant encouragement, administrative support, and valuable suggestions during the tenure of this work.</w:t>
       </w:r>
     </w:p>
     <w:p>
@@ -434,7 +434,7 @@
           <w:i w:val="0"/>
           <w:sz w:val="24"/>
         </w:rPr>
-        <w:t>I express my gratitude to my project guide Dr. [Guide Name], Department of Computer Applications, SRM Institute of Science &amp; Technology for permitting me to conduct my project research and development in the department and providing necessary computational and laboratory facilities.</w:t>
+        <w:t>I convey my sincere indebtedness and heartfelt thanks to my project guide, Dr. A. MEENAKSHI, M.C.A., M.Phil., M.S., Ph.D., Department of Computer Applications (MCA), for her inspiring guidance, constructive criticisms, patient advice, and continuous motivation at every stage of the project.</w:t>
       </w:r>
     </w:p>
     <w:p>
@@ -449,7 +449,7 @@
           <w:i w:val="0"/>
           <w:sz w:val="24"/>
         </w:rPr>
-        <w:t>I extend my sincere gratitude to my class-coordinator Dr. [Coordinator Name], Department of Computer Applications, SRM Institute of Science &amp; Technology, for her stimulant guidance.</w:t>
+        <w:t>I wish to place on record my heartfelt gratitude and sincere thanks to my Class Incharge, Dr. M. SIVASAKTHI, M.Sc., M.Phil., Ph.D., NET, Department of Computer Applications (MCA), for her continuous academic support, guidance, encouragement, and valuable advice throughout the duration of this project.</w:t>
       </w:r>
     </w:p>
     <w:p>
@@ -464,7 +464,61 @@
           <w:i w:val="0"/>
           <w:sz w:val="24"/>
         </w:rPr>
-        <w:t>I am highly indebted to Dr. [HOD Name], Head of the Department of Computer Applications, who generously accepted me under her valuable guidance and for the endless help and inspiration provided to me during the tenure of the project.</w:t>
+        <w:t>I also extend my sincere appreciation to all the faculty members and staff of the Department of Computer Applications for their cooperation and goodwill throughout the period of my study.</w:t>
+      </w:r>
+    </w:p>
+    <w:p>
+      <w:pPr>
+        <w:spacing w:after="120" w:line="276" w:lineRule="auto"/>
+        <w:jc w:val="both"/>
+      </w:pPr>
+      <w:r>
+        <w:rPr>
+          <w:rFonts w:ascii="Times New Roman" w:hAnsi="Times New Roman"/>
+          <w:b w:val="0"/>
+          <w:i w:val="0"/>
+          <w:sz w:val="24"/>
+        </w:rPr>
+        <w:t>Finally, I express my deep heartfelt gratitude to my family members and friends for their endless support.</w:t>
+      </w:r>
+    </w:p>
+    <w:p>
+      <w:pPr>
+        <w:spacing w:before="720" w:after="40"/>
+        <w:jc w:val="right"/>
+      </w:pPr>
+      <w:r>
+        <w:rPr>
+          <w:rFonts w:ascii="Times New Roman" w:hAnsi="Times New Roman"/>
+          <w:b/>
+        </w:rPr>
+        <w:t>Signature of the Candidate</w:t>
+      </w:r>
+    </w:p>
+    <w:p>
+      <w:pPr>
+        <w:spacing w:after="40"/>
+        <w:jc w:val="right"/>
+      </w:pPr>
+      <w:r>
+        <w:rPr>
+          <w:rFonts w:ascii="Times New Roman" w:hAnsi="Times New Roman"/>
+          <w:b/>
+        </w:rPr>
+        <w:t>SAM ANTROSE A H</w:t>
+      </w:r>
+    </w:p>
+    <w:p>
+      <w:pPr>
+        <w:spacing w:after="240"/>
+        <w:jc w:val="right"/>
+      </w:pPr>
+      <w:r>
+        <w:rPr>
+          <w:rFonts w:ascii="Times New Roman" w:hAnsi="Times New Roman"/>
+          <w:b/>
+        </w:rPr>
+        <w:t>REG NO: RA2532241040033</w:t>
       </w:r>
     </w:p>
     <w:p>

</xml_diff>

<commit_message>
Apply SRM logo, page borders, 2026-2027 year, and Guide/HOD formatting to both SAM and Saraswathi reports
</commit_message>
<xml_diff>
--- a/Enterprise_IT_Service_Portal_Individual_Report_SAM.docx
+++ b/Enterprise_IT_Service_Portal_Individual_Report_SAM.docx
@@ -4,7 +4,7 @@
   <w:body>
     <w:p>
       <w:pPr>
-        <w:spacing w:after="360"/>
+        <w:spacing w:after="240"/>
         <w:jc w:val="center"/>
       </w:pPr>
       <w:r>
@@ -17,7 +17,7 @@
     </w:p>
     <w:p>
       <w:pPr>
-        <w:spacing w:after="480"/>
+        <w:spacing w:after="360"/>
         <w:jc w:val="center"/>
       </w:pPr>
       <w:r>
@@ -25,7 +25,9 @@
           <w:b/>
           <w:sz w:val="32"/>
         </w:rPr>
-        <w:t>ENTERPRISE IT &amp; CORPORATE FACILITIES SERVICE PORTAL</w:t>
+        <w:t>ENTERPRISE IT &amp; CORPORATE FACILITIES SERVICE</w:t>
+        <w:br/>
+        <w:t>PORTAL</w:t>
       </w:r>
     </w:p>
     <w:p>
@@ -49,7 +51,7 @@
     </w:p>
     <w:p>
       <w:pPr>
-        <w:spacing w:after="360"/>
+        <w:spacing w:after="240"/>
         <w:jc w:val="center"/>
       </w:pPr>
       <w:r>
@@ -62,7 +64,7 @@
     </w:p>
     <w:p>
       <w:pPr>
-        <w:spacing w:after="240"/>
+        <w:spacing w:after="120"/>
         <w:jc w:val="center"/>
       </w:pPr>
       <w:r>
@@ -75,7 +77,7 @@
     </w:p>
     <w:p>
       <w:pPr>
-        <w:spacing w:after="120"/>
+        <w:spacing w:after="80"/>
         <w:jc w:val="center"/>
       </w:pPr>
       <w:r>
@@ -88,7 +90,7 @@
     </w:p>
     <w:p>
       <w:pPr>
-        <w:spacing w:after="480"/>
+        <w:spacing w:after="240"/>
         <w:jc w:val="center"/>
       </w:pPr>
       <w:r>
@@ -101,7 +103,7 @@
     </w:p>
     <w:p>
       <w:pPr>
-        <w:spacing w:after="120"/>
+        <w:spacing w:after="80"/>
         <w:jc w:val="center"/>
       </w:pPr>
       <w:r>
@@ -114,7 +116,7 @@
     </w:p>
     <w:p>
       <w:pPr>
-        <w:spacing w:after="720"/>
+        <w:spacing w:after="240"/>
         <w:jc w:val="center"/>
       </w:pPr>
       <w:r>
@@ -123,6 +125,46 @@
           <w:sz w:val="26"/>
         </w:rPr>
         <w:t>Dr. J. ANITHA RUTH, M.S., Ph.D.</w:t>
+      </w:r>
+    </w:p>
+    <w:p>
+      <w:pPr>
+        <w:spacing w:after="240"/>
+        <w:jc w:val="center"/>
+      </w:pPr>
+      <w:r>
+        <w:drawing>
+          <wp:inline xmlns:a="http://schemas.openxmlformats.org/drawingml/2006/main" xmlns:pic="http://schemas.openxmlformats.org/drawingml/2006/picture">
+            <wp:extent cx="2286000" cy="810798"/>
+            <wp:docPr id="1" name="Picture 1"/>
+            <wp:cNvGraphicFramePr>
+              <a:graphicFrameLocks noChangeAspect="1"/>
+            </wp:cNvGraphicFramePr>
+            <a:graphic>
+              <a:graphicData uri="http://schemas.openxmlformats.org/drawingml/2006/picture">
+                <pic:pic>
+                  <pic:nvPicPr>
+                    <pic:cNvPr id="0" name="srm_logo.png"/>
+                    <pic:cNvPicPr/>
+                  </pic:nvPicPr>
+                  <pic:blipFill>
+                    <a:blip r:embed="rId9"/>
+                    <a:stretch>
+                      <a:fillRect/>
+                    </a:stretch>
+                  </pic:blipFill>
+                  <pic:spPr>
+                    <a:xfrm>
+                      <a:off x="0" y="0"/>
+                      <a:ext cx="2286000" cy="810798"/>
+                    </a:xfrm>
+                    <a:prstGeom prst="rect"/>
+                  </pic:spPr>
+                </pic:pic>
+              </a:graphicData>
+            </a:graphic>
+          </wp:inline>
+        </w:drawing>
       </w:r>
     </w:p>
     <w:p>
@@ -154,8 +196,7 @@
           <w:b/>
           <w:sz w:val="26"/>
         </w:rPr>
-        <w:br/>
-        <w:t>2025-2026</w:t>
+        <w:t>2026-2027</w:t>
       </w:r>
     </w:p>
     <w:p>
@@ -165,7 +206,7 @@
     </w:p>
     <w:p>
       <w:pPr>
-        <w:spacing w:after="360"/>
+        <w:spacing w:after="240"/>
         <w:jc w:val="center"/>
       </w:pPr>
       <w:r>
@@ -184,7 +225,47 @@
     </w:p>
     <w:p>
       <w:pPr>
-        <w:spacing w:after="480"/>
+        <w:spacing w:after="240"/>
+        <w:jc w:val="center"/>
+      </w:pPr>
+      <w:r>
+        <w:drawing>
+          <wp:inline xmlns:a="http://schemas.openxmlformats.org/drawingml/2006/main" xmlns:pic="http://schemas.openxmlformats.org/drawingml/2006/picture">
+            <wp:extent cx="2011680" cy="713502"/>
+            <wp:docPr id="2" name="Picture 2"/>
+            <wp:cNvGraphicFramePr>
+              <a:graphicFrameLocks noChangeAspect="1"/>
+            </wp:cNvGraphicFramePr>
+            <a:graphic>
+              <a:graphicData uri="http://schemas.openxmlformats.org/drawingml/2006/picture">
+                <pic:pic>
+                  <pic:nvPicPr>
+                    <pic:cNvPr id="0" name="srm_logo.png"/>
+                    <pic:cNvPicPr/>
+                  </pic:nvPicPr>
+                  <pic:blipFill>
+                    <a:blip r:embed="rId9"/>
+                    <a:stretch>
+                      <a:fillRect/>
+                    </a:stretch>
+                  </pic:blipFill>
+                  <pic:spPr>
+                    <a:xfrm>
+                      <a:off x="0" y="0"/>
+                      <a:ext cx="2011680" cy="713502"/>
+                    </a:xfrm>
+                    <a:prstGeom prst="rect"/>
+                  </pic:spPr>
+                </pic:pic>
+              </a:graphicData>
+            </a:graphic>
+          </wp:inline>
+        </w:drawing>
+      </w:r>
+    </w:p>
+    <w:p>
+      <w:pPr>
+        <w:spacing w:after="360"/>
         <w:jc w:val="center"/>
       </w:pPr>
       <w:r>
@@ -197,7 +278,7 @@
     </w:p>
     <w:p>
       <w:pPr>
-        <w:spacing w:after="720" w:line="312" w:lineRule="auto"/>
+        <w:spacing w:after="480" w:line="312" w:lineRule="auto"/>
         <w:jc w:val="both"/>
       </w:pPr>
       <w:r>
@@ -295,7 +376,7 @@
           </w:tcPr>
           <w:p>
             <w:pPr>
-              <w:spacing w:before="600"/>
+              <w:spacing w:before="480"/>
             </w:pPr>
             <w:r>
               <w:t>Dr. J. ANITHA RUTH, M.S., Ph.D.</w:t>
@@ -308,7 +389,7 @@
           </w:tcPr>
           <w:p>
             <w:pPr>
-              <w:spacing w:before="600"/>
+              <w:spacing w:before="480"/>
               <w:jc w:val="right"/>
             </w:pPr>
             <w:r>
@@ -320,7 +401,7 @@
     </w:tbl>
     <w:p>
       <w:pPr>
-        <w:spacing w:before="720" w:after="240"/>
+        <w:spacing w:before="480" w:after="240"/>
       </w:pPr>
       <w:r>
         <w:rPr>
@@ -331,7 +412,7 @@
     </w:p>
     <w:p>
       <w:pPr>
-        <w:spacing w:after="480"/>
+        <w:spacing w:after="360"/>
       </w:pPr>
       <w:r>
         <w:t>Place: VADAPALANI</w:t>
@@ -341,7 +422,7 @@
     </w:p>
     <w:p>
       <w:pPr>
-        <w:spacing w:before="720"/>
+        <w:spacing w:before="480"/>
       </w:pPr>
       <w:r>
         <w:rPr>
@@ -5535,6 +5616,12 @@
       <w:pgMar w:top="1440" w:right="1440" w:bottom="1440" w:left="1440" w:header="720" w:footer="720" w:gutter="0"/>
       <w:cols w:space="720"/>
       <w:docGrid w:linePitch="360"/>
+      <w:pgBorders w:offsetFrom="page">
+        <w:top w:val="single" w:sz="8" w:space="24" w:color="auto"/>
+        <w:left w:val="single" w:sz="8" w:space="24" w:color="auto"/>
+        <w:bottom w:val="single" w:sz="8" w:space="24" w:color="auto"/>
+        <w:right w:val="single" w:sz="8" w:space="24" w:color="auto"/>
+      </w:pgBorders>
     </w:sectPr>
   </w:body>
 </w:document>

</xml_diff>

<commit_message>
Embed all 12 technical figure diagrams and flowcharts into SAM and Saraswathi reports
</commit_message>
<xml_diff>
--- a/Enterprise_IT_Service_Portal_Individual_Report_SAM.docx
+++ b/Enterprise_IT_Service_Portal_Individual_Report_SAM.docx
@@ -4892,6 +4892,60 @@
       </w:r>
     </w:p>
     <w:p>
+      <w:pPr>
+        <w:spacing w:before="160" w:after="80"/>
+        <w:jc w:val="center"/>
+      </w:pPr>
+      <w:r>
+        <w:drawing>
+          <wp:inline xmlns:a="http://schemas.openxmlformats.org/drawingml/2006/main" xmlns:pic="http://schemas.openxmlformats.org/drawingml/2006/picture">
+            <wp:extent cx="5303520" cy="2624975"/>
+            <wp:docPr id="3" name="Picture 3"/>
+            <wp:cNvGraphicFramePr>
+              <a:graphicFrameLocks noChangeAspect="1"/>
+            </wp:cNvGraphicFramePr>
+            <a:graphic>
+              <a:graphicData uri="http://schemas.openxmlformats.org/drawingml/2006/picture">
+                <pic:pic>
+                  <pic:nvPicPr>
+                    <pic:cNvPr id="0" name="fig_2_1_work_division.png"/>
+                    <pic:cNvPicPr/>
+                  </pic:nvPicPr>
+                  <pic:blipFill>
+                    <a:blip r:embed="rId10"/>
+                    <a:stretch>
+                      <a:fillRect/>
+                    </a:stretch>
+                  </pic:blipFill>
+                  <pic:spPr>
+                    <a:xfrm>
+                      <a:off x="0" y="0"/>
+                      <a:ext cx="5303520" cy="2624975"/>
+                    </a:xfrm>
+                    <a:prstGeom prst="rect"/>
+                  </pic:spPr>
+                </pic:pic>
+              </a:graphicData>
+            </a:graphic>
+          </wp:inline>
+        </w:drawing>
+      </w:r>
+    </w:p>
+    <w:p>
+      <w:pPr>
+        <w:spacing w:before="40" w:after="240"/>
+        <w:jc w:val="center"/>
+      </w:pPr>
+      <w:r>
+        <w:rPr>
+          <w:rFonts w:ascii="Times New Roman" w:hAnsi="Times New Roman"/>
+          <w:b/>
+          <w:sz w:val="20"/>
+        </w:rPr>
+        <w:t>Figure 2.1: Work Division &amp; Module Allocation Matrix</w:t>
+      </w:r>
+    </w:p>
+    <w:p>
       <w:r>
         <w:br w:type="page"/>
       </w:r>
@@ -4973,6 +5027,60 @@
     </w:p>
     <w:p>
       <w:pPr>
+        <w:spacing w:before="160" w:after="80"/>
+        <w:jc w:val="center"/>
+      </w:pPr>
+      <w:r>
+        <w:drawing>
+          <wp:inline xmlns:a="http://schemas.openxmlformats.org/drawingml/2006/main" xmlns:pic="http://schemas.openxmlformats.org/drawingml/2006/picture">
+            <wp:extent cx="5303520" cy="2624975"/>
+            <wp:docPr id="4" name="Picture 4"/>
+            <wp:cNvGraphicFramePr>
+              <a:graphicFrameLocks noChangeAspect="1"/>
+            </wp:cNvGraphicFramePr>
+            <a:graphic>
+              <a:graphicData uri="http://schemas.openxmlformats.org/drawingml/2006/picture">
+                <pic:pic>
+                  <pic:nvPicPr>
+                    <pic:cNvPr id="0" name="fig_3_1_springboot_backend.png"/>
+                    <pic:cNvPicPr/>
+                  </pic:nvPicPr>
+                  <pic:blipFill>
+                    <a:blip r:embed="rId11"/>
+                    <a:stretch>
+                      <a:fillRect/>
+                    </a:stretch>
+                  </pic:blipFill>
+                  <pic:spPr>
+                    <a:xfrm>
+                      <a:off x="0" y="0"/>
+                      <a:ext cx="5303520" cy="2624975"/>
+                    </a:xfrm>
+                    <a:prstGeom prst="rect"/>
+                  </pic:spPr>
+                </pic:pic>
+              </a:graphicData>
+            </a:graphic>
+          </wp:inline>
+        </w:drawing>
+      </w:r>
+    </w:p>
+    <w:p>
+      <w:pPr>
+        <w:spacing w:before="40" w:after="240"/>
+        <w:jc w:val="center"/>
+      </w:pPr>
+      <w:r>
+        <w:rPr>
+          <w:rFonts w:ascii="Times New Roman" w:hAnsi="Times New Roman"/>
+          <w:b/>
+          <w:sz w:val="20"/>
+        </w:rPr>
+        <w:t>Figure 3.1: Spring Boot Backend &amp; Database Layer Architecture</w:t>
+      </w:r>
+    </w:p>
+    <w:p>
+      <w:pPr>
         <w:spacing w:after="120" w:line="276" w:lineRule="auto"/>
         <w:jc w:val="both"/>
       </w:pPr>
@@ -4984,6 +5092,60 @@
           <w:sz w:val="24"/>
         </w:rPr>
         <w:t>3.1.2 Python FastAPI AI Microservice (Hugging Face NLP): Engineered server.py microservice executing DistilBERT category classification and RoBERTa sentiment/urgency evaluation with heuristic fallback logic.</w:t>
+      </w:r>
+    </w:p>
+    <w:p>
+      <w:pPr>
+        <w:spacing w:before="160" w:after="80"/>
+        <w:jc w:val="center"/>
+      </w:pPr>
+      <w:r>
+        <w:drawing>
+          <wp:inline xmlns:a="http://schemas.openxmlformats.org/drawingml/2006/main" xmlns:pic="http://schemas.openxmlformats.org/drawingml/2006/picture">
+            <wp:extent cx="5303520" cy="2624975"/>
+            <wp:docPr id="5" name="Picture 5"/>
+            <wp:cNvGraphicFramePr>
+              <a:graphicFrameLocks noChangeAspect="1"/>
+            </wp:cNvGraphicFramePr>
+            <a:graphic>
+              <a:graphicData uri="http://schemas.openxmlformats.org/drawingml/2006/picture">
+                <pic:pic>
+                  <pic:nvPicPr>
+                    <pic:cNvPr id="0" name="fig_3_2_fastapi_nlp.png"/>
+                    <pic:cNvPicPr/>
+                  </pic:nvPicPr>
+                  <pic:blipFill>
+                    <a:blip r:embed="rId12"/>
+                    <a:stretch>
+                      <a:fillRect/>
+                    </a:stretch>
+                  </pic:blipFill>
+                  <pic:spPr>
+                    <a:xfrm>
+                      <a:off x="0" y="0"/>
+                      <a:ext cx="5303520" cy="2624975"/>
+                    </a:xfrm>
+                    <a:prstGeom prst="rect"/>
+                  </pic:spPr>
+                </pic:pic>
+              </a:graphicData>
+            </a:graphic>
+          </wp:inline>
+        </w:drawing>
+      </w:r>
+    </w:p>
+    <w:p>
+      <w:pPr>
+        <w:spacing w:before="40" w:after="240"/>
+        <w:jc w:val="center"/>
+      </w:pPr>
+      <w:r>
+        <w:rPr>
+          <w:rFonts w:ascii="Times New Roman" w:hAnsi="Times New Roman"/>
+          <w:b/>
+          <w:sz w:val="20"/>
+        </w:rPr>
+        <w:t>Figure 3.2: FastAPI Hugging Face NLP Triage Architecture</w:t>
       </w:r>
     </w:p>
     <w:p>
@@ -5003,6 +5165,60 @@
     </w:p>
     <w:p>
       <w:pPr>
+        <w:spacing w:before="160" w:after="80"/>
+        <w:jc w:val="center"/>
+      </w:pPr>
+      <w:r>
+        <w:drawing>
+          <wp:inline xmlns:a="http://schemas.openxmlformats.org/drawingml/2006/main" xmlns:pic="http://schemas.openxmlformats.org/drawingml/2006/picture">
+            <wp:extent cx="5303520" cy="2624975"/>
+            <wp:docPr id="6" name="Picture 6"/>
+            <wp:cNvGraphicFramePr>
+              <a:graphicFrameLocks noChangeAspect="1"/>
+            </wp:cNvGraphicFramePr>
+            <a:graphic>
+              <a:graphicData uri="http://schemas.openxmlformats.org/drawingml/2006/picture">
+                <pic:pic>
+                  <pic:nvPicPr>
+                    <pic:cNvPr id="0" name="fig_3_3_email_2fa_flow.png"/>
+                    <pic:cNvPicPr/>
+                  </pic:nvPicPr>
+                  <pic:blipFill>
+                    <a:blip r:embed="rId13"/>
+                    <a:stretch>
+                      <a:fillRect/>
+                    </a:stretch>
+                  </pic:blipFill>
+                  <pic:spPr>
+                    <a:xfrm>
+                      <a:off x="0" y="0"/>
+                      <a:ext cx="5303520" cy="2624975"/>
+                    </a:xfrm>
+                    <a:prstGeom prst="rect"/>
+                  </pic:spPr>
+                </pic:pic>
+              </a:graphicData>
+            </a:graphic>
+          </wp:inline>
+        </w:drawing>
+      </w:r>
+    </w:p>
+    <w:p>
+      <w:pPr>
+        <w:spacing w:before="40" w:after="240"/>
+        <w:jc w:val="center"/>
+      </w:pPr>
+      <w:r>
+        <w:rPr>
+          <w:rFonts w:ascii="Times New Roman" w:hAnsi="Times New Roman"/>
+          <w:b/>
+          <w:sz w:val="20"/>
+        </w:rPr>
+        <w:t>Figure 3.3: Real Email 2FA OTP Security Flow</w:t>
+      </w:r>
+    </w:p>
+    <w:p>
+      <w:pPr>
         <w:spacing w:after="120" w:line="276" w:lineRule="auto"/>
         <w:jc w:val="both"/>
       </w:pPr>
@@ -5014,6 +5230,60 @@
           <w:sz w:val="24"/>
         </w:rPr>
         <w:t>3.1.4 Emergency Telephony &amp; Cloud Alert Dispatch: Configured native mobile dialer integration (tel: protocol) paired with automated instant emergency email alerts to samantrose7@gmail.com.</w:t>
+      </w:r>
+    </w:p>
+    <w:p>
+      <w:pPr>
+        <w:spacing w:before="160" w:after="80"/>
+        <w:jc w:val="center"/>
+      </w:pPr>
+      <w:r>
+        <w:drawing>
+          <wp:inline xmlns:a="http://schemas.openxmlformats.org/drawingml/2006/main" xmlns:pic="http://schemas.openxmlformats.org/drawingml/2006/picture">
+            <wp:extent cx="5303520" cy="2624975"/>
+            <wp:docPr id="7" name="Picture 7"/>
+            <wp:cNvGraphicFramePr>
+              <a:graphicFrameLocks noChangeAspect="1"/>
+            </wp:cNvGraphicFramePr>
+            <a:graphic>
+              <a:graphicData uri="http://schemas.openxmlformats.org/drawingml/2006/picture">
+                <pic:pic>
+                  <pic:nvPicPr>
+                    <pic:cNvPr id="0" name="fig_3_4_telephony_sos.png"/>
+                    <pic:cNvPicPr/>
+                  </pic:nvPicPr>
+                  <pic:blipFill>
+                    <a:blip r:embed="rId14"/>
+                    <a:stretch>
+                      <a:fillRect/>
+                    </a:stretch>
+                  </pic:blipFill>
+                  <pic:spPr>
+                    <a:xfrm>
+                      <a:off x="0" y="0"/>
+                      <a:ext cx="5303520" cy="2624975"/>
+                    </a:xfrm>
+                    <a:prstGeom prst="rect"/>
+                  </pic:spPr>
+                </pic:pic>
+              </a:graphicData>
+            </a:graphic>
+          </wp:inline>
+        </w:drawing>
+      </w:r>
+    </w:p>
+    <w:p>
+      <w:pPr>
+        <w:spacing w:before="40" w:after="240"/>
+        <w:jc w:val="center"/>
+      </w:pPr>
+      <w:r>
+        <w:rPr>
+          <w:rFonts w:ascii="Times New Roman" w:hAnsi="Times New Roman"/>
+          <w:b/>
+          <w:sz w:val="20"/>
+        </w:rPr>
+        <w:t>Figure 3.4: Cloud Telephony &amp; Emergency SOS Dispatch</w:t>
       </w:r>
     </w:p>
     <w:p>
@@ -5107,6 +5377,60 @@
       </w:r>
     </w:p>
     <w:p>
+      <w:pPr>
+        <w:spacing w:before="160" w:after="80"/>
+        <w:jc w:val="center"/>
+      </w:pPr>
+      <w:r>
+        <w:drawing>
+          <wp:inline xmlns:a="http://schemas.openxmlformats.org/drawingml/2006/main" xmlns:pic="http://schemas.openxmlformats.org/drawingml/2006/picture">
+            <wp:extent cx="5303520" cy="2624975"/>
+            <wp:docPr id="8" name="Picture 8"/>
+            <wp:cNvGraphicFramePr>
+              <a:graphicFrameLocks noChangeAspect="1"/>
+            </wp:cNvGraphicFramePr>
+            <a:graphic>
+              <a:graphicData uri="http://schemas.openxmlformats.org/drawingml/2006/picture">
+                <pic:pic>
+                  <pic:nvPicPr>
+                    <pic:cNvPr id="0" name="fig_3_5_glassmorphic_sla.png"/>
+                    <pic:cNvPicPr/>
+                  </pic:nvPicPr>
+                  <pic:blipFill>
+                    <a:blip r:embed="rId15"/>
+                    <a:stretch>
+                      <a:fillRect/>
+                    </a:stretch>
+                  </pic:blipFill>
+                  <pic:spPr>
+                    <a:xfrm>
+                      <a:off x="0" y="0"/>
+                      <a:ext cx="5303520" cy="2624975"/>
+                    </a:xfrm>
+                    <a:prstGeom prst="rect"/>
+                  </pic:spPr>
+                </pic:pic>
+              </a:graphicData>
+            </a:graphic>
+          </wp:inline>
+        </w:drawing>
+      </w:r>
+    </w:p>
+    <w:p>
+      <w:pPr>
+        <w:spacing w:before="40" w:after="240"/>
+        <w:jc w:val="center"/>
+      </w:pPr>
+      <w:r>
+        <w:rPr>
+          <w:rFonts w:ascii="Times New Roman" w:hAnsi="Times New Roman"/>
+          <w:b/>
+          <w:sz w:val="20"/>
+        </w:rPr>
+        <w:t>Figure 3.5: Glassmorphic UI &amp; SLA Timer Components</w:t>
+      </w:r>
+    </w:p>
+    <w:p>
       <w:r>
         <w:br w:type="page"/>
       </w:r>
@@ -5173,6 +5497,60 @@
     </w:p>
     <w:p>
       <w:pPr>
+        <w:spacing w:before="160" w:after="80"/>
+        <w:jc w:val="center"/>
+      </w:pPr>
+      <w:r>
+        <w:drawing>
+          <wp:inline xmlns:a="http://schemas.openxmlformats.org/drawingml/2006/main" xmlns:pic="http://schemas.openxmlformats.org/drawingml/2006/picture">
+            <wp:extent cx="5303520" cy="3160684"/>
+            <wp:docPr id="9" name="Picture 9"/>
+            <wp:cNvGraphicFramePr>
+              <a:graphicFrameLocks noChangeAspect="1"/>
+            </wp:cNvGraphicFramePr>
+            <a:graphic>
+              <a:graphicData uri="http://schemas.openxmlformats.org/drawingml/2006/picture">
+                <pic:pic>
+                  <pic:nvPicPr>
+                    <pic:cNvPr id="0" name="fig_4_1_system_architecture.png"/>
+                    <pic:cNvPicPr/>
+                  </pic:nvPicPr>
+                  <pic:blipFill>
+                    <a:blip r:embed="rId16"/>
+                    <a:stretch>
+                      <a:fillRect/>
+                    </a:stretch>
+                  </pic:blipFill>
+                  <pic:spPr>
+                    <a:xfrm>
+                      <a:off x="0" y="0"/>
+                      <a:ext cx="5303520" cy="3160684"/>
+                    </a:xfrm>
+                    <a:prstGeom prst="rect"/>
+                  </pic:spPr>
+                </pic:pic>
+              </a:graphicData>
+            </a:graphic>
+          </wp:inline>
+        </w:drawing>
+      </w:r>
+    </w:p>
+    <w:p>
+      <w:pPr>
+        <w:spacing w:before="40" w:after="240"/>
+        <w:jc w:val="center"/>
+      </w:pPr>
+      <w:r>
+        <w:rPr>
+          <w:rFonts w:ascii="Times New Roman" w:hAnsi="Times New Roman"/>
+          <w:b/>
+          <w:sz w:val="20"/>
+        </w:rPr>
+        <w:t>Figure 4.1: Overall System Architecture Diagram</w:t>
+      </w:r>
+    </w:p>
+    <w:p>
+      <w:pPr>
         <w:keepNext/>
         <w:spacing w:before="240" w:after="120"/>
         <w:jc w:val="left"/>
@@ -5218,6 +5596,60 @@
     </w:p>
     <w:p>
       <w:pPr>
+        <w:spacing w:before="160" w:after="80"/>
+        <w:jc w:val="center"/>
+      </w:pPr>
+      <w:r>
+        <w:drawing>
+          <wp:inline xmlns:a="http://schemas.openxmlformats.org/drawingml/2006/main" xmlns:pic="http://schemas.openxmlformats.org/drawingml/2006/picture">
+            <wp:extent cx="5303520" cy="2624975"/>
+            <wp:docPr id="10" name="Picture 10"/>
+            <wp:cNvGraphicFramePr>
+              <a:graphicFrameLocks noChangeAspect="1"/>
+            </wp:cNvGraphicFramePr>
+            <a:graphic>
+              <a:graphicData uri="http://schemas.openxmlformats.org/drawingml/2006/picture">
+                <pic:pic>
+                  <pic:nvPicPr>
+                    <pic:cNvPr id="0" name="fig_4_2_dfd_level_0.png"/>
+                    <pic:cNvPicPr/>
+                  </pic:nvPicPr>
+                  <pic:blipFill>
+                    <a:blip r:embed="rId17"/>
+                    <a:stretch>
+                      <a:fillRect/>
+                    </a:stretch>
+                  </pic:blipFill>
+                  <pic:spPr>
+                    <a:xfrm>
+                      <a:off x="0" y="0"/>
+                      <a:ext cx="5303520" cy="2624975"/>
+                    </a:xfrm>
+                    <a:prstGeom prst="rect"/>
+                  </pic:spPr>
+                </pic:pic>
+              </a:graphicData>
+            </a:graphic>
+          </wp:inline>
+        </w:drawing>
+      </w:r>
+    </w:p>
+    <w:p>
+      <w:pPr>
+        <w:spacing w:before="40" w:after="240"/>
+        <w:jc w:val="center"/>
+      </w:pPr>
+      <w:r>
+        <w:rPr>
+          <w:rFonts w:ascii="Times New Roman" w:hAnsi="Times New Roman"/>
+          <w:b/>
+          <w:sz w:val="20"/>
+        </w:rPr>
+        <w:t>Figure 4.2: DFD Level 0 (Context Diagram)</w:t>
+      </w:r>
+    </w:p>
+    <w:p>
+      <w:pPr>
         <w:keepNext/>
         <w:spacing w:before="240" w:after="120"/>
         <w:jc w:val="left"/>
@@ -5248,6 +5680,60 @@
     </w:p>
     <w:p>
       <w:pPr>
+        <w:spacing w:before="160" w:after="80"/>
+        <w:jc w:val="center"/>
+      </w:pPr>
+      <w:r>
+        <w:drawing>
+          <wp:inline xmlns:a="http://schemas.openxmlformats.org/drawingml/2006/main" xmlns:pic="http://schemas.openxmlformats.org/drawingml/2006/picture">
+            <wp:extent cx="5303520" cy="2624975"/>
+            <wp:docPr id="11" name="Picture 11"/>
+            <wp:cNvGraphicFramePr>
+              <a:graphicFrameLocks noChangeAspect="1"/>
+            </wp:cNvGraphicFramePr>
+            <a:graphic>
+              <a:graphicData uri="http://schemas.openxmlformats.org/drawingml/2006/picture">
+                <pic:pic>
+                  <pic:nvPicPr>
+                    <pic:cNvPr id="0" name="fig_4_3_dfd_level_1.png"/>
+                    <pic:cNvPicPr/>
+                  </pic:nvPicPr>
+                  <pic:blipFill>
+                    <a:blip r:embed="rId18"/>
+                    <a:stretch>
+                      <a:fillRect/>
+                    </a:stretch>
+                  </pic:blipFill>
+                  <pic:spPr>
+                    <a:xfrm>
+                      <a:off x="0" y="0"/>
+                      <a:ext cx="5303520" cy="2624975"/>
+                    </a:xfrm>
+                    <a:prstGeom prst="rect"/>
+                  </pic:spPr>
+                </pic:pic>
+              </a:graphicData>
+            </a:graphic>
+          </wp:inline>
+        </w:drawing>
+      </w:r>
+    </w:p>
+    <w:p>
+      <w:pPr>
+        <w:spacing w:before="40" w:after="240"/>
+        <w:jc w:val="center"/>
+      </w:pPr>
+      <w:r>
+        <w:rPr>
+          <w:rFonts w:ascii="Times New Roman" w:hAnsi="Times New Roman"/>
+          <w:b/>
+          <w:sz w:val="20"/>
+        </w:rPr>
+        <w:t>Figure 4.3: DFD Level 1 (Service Desk Processes)</w:t>
+      </w:r>
+    </w:p>
+    <w:p>
+      <w:pPr>
         <w:keepNext/>
         <w:spacing w:before="240" w:after="120"/>
         <w:jc w:val="left"/>
@@ -5274,6 +5760,60 @@
           <w:sz w:val="24"/>
         </w:rPr>
         <w:t>Details internal steps of AI triage: Description Extraction (3.1), DistilBERT Category Prediction (3.2), RoBERTa Urgency Rating (3.3), and SLA Timer Initialization (3.4).</w:t>
+      </w:r>
+    </w:p>
+    <w:p>
+      <w:pPr>
+        <w:spacing w:before="160" w:after="80"/>
+        <w:jc w:val="center"/>
+      </w:pPr>
+      <w:r>
+        <w:drawing>
+          <wp:inline xmlns:a="http://schemas.openxmlformats.org/drawingml/2006/main" xmlns:pic="http://schemas.openxmlformats.org/drawingml/2006/picture">
+            <wp:extent cx="5303520" cy="2624975"/>
+            <wp:docPr id="12" name="Picture 12"/>
+            <wp:cNvGraphicFramePr>
+              <a:graphicFrameLocks noChangeAspect="1"/>
+            </wp:cNvGraphicFramePr>
+            <a:graphic>
+              <a:graphicData uri="http://schemas.openxmlformats.org/drawingml/2006/picture">
+                <pic:pic>
+                  <pic:nvPicPr>
+                    <pic:cNvPr id="0" name="fig_4_4_dfd_level_2.png"/>
+                    <pic:cNvPicPr/>
+                  </pic:nvPicPr>
+                  <pic:blipFill>
+                    <a:blip r:embed="rId19"/>
+                    <a:stretch>
+                      <a:fillRect/>
+                    </a:stretch>
+                  </pic:blipFill>
+                  <pic:spPr>
+                    <a:xfrm>
+                      <a:off x="0" y="0"/>
+                      <a:ext cx="5303520" cy="2624975"/>
+                    </a:xfrm>
+                    <a:prstGeom prst="rect"/>
+                  </pic:spPr>
+                </pic:pic>
+              </a:graphicData>
+            </a:graphic>
+          </wp:inline>
+        </w:drawing>
+      </w:r>
+    </w:p>
+    <w:p>
+      <w:pPr>
+        <w:spacing w:before="40" w:after="240"/>
+        <w:jc w:val="center"/>
+      </w:pPr>
+      <w:r>
+        <w:rPr>
+          <w:rFonts w:ascii="Times New Roman" w:hAnsi="Times New Roman"/>
+          <w:b/>
+          <w:sz w:val="20"/>
+        </w:rPr>
+        <w:t>Figure 4.4: DFD Level 2 (AI Triage &amp; SLA Engine)</w:t>
       </w:r>
     </w:p>
     <w:p>
@@ -5328,6 +5868,60 @@
     </w:p>
     <w:p>
       <w:pPr>
+        <w:spacing w:before="160" w:after="80"/>
+        <w:jc w:val="center"/>
+      </w:pPr>
+      <w:r>
+        <w:drawing>
+          <wp:inline xmlns:a="http://schemas.openxmlformats.org/drawingml/2006/main" xmlns:pic="http://schemas.openxmlformats.org/drawingml/2006/picture">
+            <wp:extent cx="5303520" cy="2892829"/>
+            <wp:docPr id="13" name="Picture 13"/>
+            <wp:cNvGraphicFramePr>
+              <a:graphicFrameLocks noChangeAspect="1"/>
+            </wp:cNvGraphicFramePr>
+            <a:graphic>
+              <a:graphicData uri="http://schemas.openxmlformats.org/drawingml/2006/picture">
+                <pic:pic>
+                  <pic:nvPicPr>
+                    <pic:cNvPr id="0" name="fig_5_1_auth_2fa_screen.png"/>
+                    <pic:cNvPicPr/>
+                  </pic:nvPicPr>
+                  <pic:blipFill>
+                    <a:blip r:embed="rId20"/>
+                    <a:stretch>
+                      <a:fillRect/>
+                    </a:stretch>
+                  </pic:blipFill>
+                  <pic:spPr>
+                    <a:xfrm>
+                      <a:off x="0" y="0"/>
+                      <a:ext cx="5303520" cy="2892829"/>
+                    </a:xfrm>
+                    <a:prstGeom prst="rect"/>
+                  </pic:spPr>
+                </pic:pic>
+              </a:graphicData>
+            </a:graphic>
+          </wp:inline>
+        </w:drawing>
+      </w:r>
+    </w:p>
+    <w:p>
+      <w:pPr>
+        <w:spacing w:before="40" w:after="240"/>
+        <w:jc w:val="center"/>
+      </w:pPr>
+      <w:r>
+        <w:rPr>
+          <w:rFonts w:ascii="Times New Roman" w:hAnsi="Times New Roman"/>
+          <w:b/>
+          <w:sz w:val="20"/>
+        </w:rPr>
+        <w:t>Figure 5.1: Authentication &amp; 2FA Verification Screen</w:t>
+      </w:r>
+    </w:p>
+    <w:p>
+      <w:pPr>
         <w:spacing w:after="120" w:line="276" w:lineRule="auto"/>
         <w:jc w:val="both"/>
       </w:pPr>
@@ -5354,6 +5948,60 @@
           <w:sz w:val="24"/>
         </w:rPr>
         <w:t>5.3 Technician Work Queue: Displays domain-filtered ticket cards with live countdown SLA timers and status transition controls.</w:t>
+      </w:r>
+    </w:p>
+    <w:p>
+      <w:pPr>
+        <w:spacing w:before="160" w:after="80"/>
+        <w:jc w:val="center"/>
+      </w:pPr>
+      <w:r>
+        <w:drawing>
+          <wp:inline xmlns:a="http://schemas.openxmlformats.org/drawingml/2006/main" xmlns:pic="http://schemas.openxmlformats.org/drawingml/2006/picture">
+            <wp:extent cx="5303520" cy="2892829"/>
+            <wp:docPr id="14" name="Picture 14"/>
+            <wp:cNvGraphicFramePr>
+              <a:graphicFrameLocks noChangeAspect="1"/>
+            </wp:cNvGraphicFramePr>
+            <a:graphic>
+              <a:graphicData uri="http://schemas.openxmlformats.org/drawingml/2006/picture">
+                <pic:pic>
+                  <pic:nvPicPr>
+                    <pic:cNvPr id="0" name="fig_5_2_triage_queue_screen.png"/>
+                    <pic:cNvPicPr/>
+                  </pic:nvPicPr>
+                  <pic:blipFill>
+                    <a:blip r:embed="rId21"/>
+                    <a:stretch>
+                      <a:fillRect/>
+                    </a:stretch>
+                  </pic:blipFill>
+                  <pic:spPr>
+                    <a:xfrm>
+                      <a:off x="0" y="0"/>
+                      <a:ext cx="5303520" cy="2892829"/>
+                    </a:xfrm>
+                    <a:prstGeom prst="rect"/>
+                  </pic:spPr>
+                </pic:pic>
+              </a:graphicData>
+            </a:graphic>
+          </wp:inline>
+        </w:drawing>
+      </w:r>
+    </w:p>
+    <w:p>
+      <w:pPr>
+        <w:spacing w:before="40" w:after="240"/>
+        <w:jc w:val="center"/>
+      </w:pPr>
+      <w:r>
+        <w:rPr>
+          <w:rFonts w:ascii="Times New Roman" w:hAnsi="Times New Roman"/>
+          <w:b/>
+          <w:sz w:val="20"/>
+        </w:rPr>
+        <w:t>Figure 5.2: Live AI Triage Preview &amp; Work Queue Screen</w:t>
       </w:r>
     </w:p>
     <w:p>

</xml_diff>

<commit_message>
Update Saraswathi E report with exact PDF title, full technical content, and embedded figure diagrams
</commit_message>
<xml_diff>
--- a/Enterprise_IT_Service_Portal_Individual_Report_SAM.docx
+++ b/Enterprise_IT_Service_Portal_Individual_Report_SAM.docx
@@ -135,7 +135,7 @@
       <w:r>
         <w:drawing>
           <wp:inline xmlns:a="http://schemas.openxmlformats.org/drawingml/2006/main" xmlns:pic="http://schemas.openxmlformats.org/drawingml/2006/picture">
-            <wp:extent cx="2286000" cy="810798"/>
+            <wp:extent cx="2286000" cy="749353"/>
             <wp:docPr id="1" name="Picture 1"/>
             <wp:cNvGraphicFramePr>
               <a:graphicFrameLocks noChangeAspect="1"/>
@@ -156,7 +156,7 @@
                   <pic:spPr>
                     <a:xfrm>
                       <a:off x="0" y="0"/>
-                      <a:ext cx="2286000" cy="810798"/>
+                      <a:ext cx="2286000" cy="749353"/>
                     </a:xfrm>
                     <a:prstGeom prst="rect"/>
                   </pic:spPr>
@@ -231,7 +231,7 @@
       <w:r>
         <w:drawing>
           <wp:inline xmlns:a="http://schemas.openxmlformats.org/drawingml/2006/main" xmlns:pic="http://schemas.openxmlformats.org/drawingml/2006/picture">
-            <wp:extent cx="2011680" cy="713502"/>
+            <wp:extent cx="2011680" cy="659430"/>
             <wp:docPr id="2" name="Picture 2"/>
             <wp:cNvGraphicFramePr>
               <a:graphicFrameLocks noChangeAspect="1"/>
@@ -252,7 +252,7 @@
                   <pic:spPr>
                     <a:xfrm>
                       <a:off x="0" y="0"/>
-                      <a:ext cx="2011680" cy="713502"/>
+                      <a:ext cx="2011680" cy="659430"/>
                     </a:xfrm>
                     <a:prstGeom prst="rect"/>
                   </pic:spPr>

</xml_diff>

<commit_message>
Update reports with automatic 3-section page numbers, exact candidate details, full technical content, and embedded diagrams
</commit_message>
<xml_diff>
--- a/Enterprise_IT_Service_Portal_Individual_Report_SAM.docx
+++ b/Enterprise_IT_Service_Portal_Individual_Report_SAM.docx
@@ -443,20 +443,20 @@
       </w:r>
     </w:p>
     <w:p>
-      <w:r>
-        <w:br w:type="page"/>
-      </w:r>
-    </w:p>
-    <w:p>
       <w:pPr>
-        <w:jc w:val="right"/>
+        <w:sectPr>
+          <w:pgSz w:w="12240" w:h="15840"/>
+          <w:pgMar w:top="1440" w:right="1440" w:bottom="1440" w:left="1440" w:header="720" w:footer="720" w:gutter="0"/>
+          <w:cols w:space="720"/>
+          <w:docGrid w:linePitch="360"/>
+          <w:pgBorders w:offsetFrom="page">
+            <w:top w:val="single" w:sz="8" w:space="24" w:color="auto"/>
+            <w:left w:val="single" w:sz="8" w:space="24" w:color="auto"/>
+            <w:bottom w:val="single" w:sz="8" w:space="24" w:color="auto"/>
+            <w:right w:val="single" w:sz="8" w:space="24" w:color="auto"/>
+          </w:pgBorders>
+        </w:sectPr>
       </w:pPr>
-      <w:r>
-        <w:rPr>
-          <w:i/>
-        </w:rPr>
-        <w:t>iii</w:t>
-      </w:r>
     </w:p>
     <w:p>
       <w:pPr>
@@ -609,17 +609,6 @@
     </w:p>
     <w:p>
       <w:pPr>
-        <w:jc w:val="right"/>
-      </w:pPr>
-      <w:r>
-        <w:rPr>
-          <w:i/>
-        </w:rPr>
-        <w:t>iv</w:t>
-      </w:r>
-    </w:p>
-    <w:p>
-      <w:pPr>
         <w:keepNext/>
         <w:spacing w:before="240" w:after="360"/>
         <w:jc w:val="center"/>
@@ -666,17 +655,6 @@
     <w:p>
       <w:r>
         <w:br w:type="page"/>
-      </w:r>
-    </w:p>
-    <w:p>
-      <w:pPr>
-        <w:jc w:val="right"/>
-      </w:pPr>
-      <w:r>
-        <w:rPr>
-          <w:i/>
-        </w:rPr>
-        <w:t>v</w:t>
       </w:r>
     </w:p>
     <w:p>
@@ -878,7 +856,7 @@
                 <w:rFonts w:ascii="Times New Roman" w:hAnsi="Times New Roman"/>
                 <w:sz w:val="22"/>
               </w:rPr>
-              <w:t>iii</w:t>
+              <w:t>(i)</w:t>
             </w:r>
           </w:p>
         </w:tc>
@@ -956,7 +934,7 @@
                 <w:rFonts w:ascii="Times New Roman" w:hAnsi="Times New Roman"/>
                 <w:sz w:val="22"/>
               </w:rPr>
-              <w:t>iv</w:t>
+              <w:t>(ii)</w:t>
             </w:r>
           </w:p>
         </w:tc>
@@ -1034,7 +1012,7 @@
                 <w:rFonts w:ascii="Times New Roman" w:hAnsi="Times New Roman"/>
                 <w:sz w:val="22"/>
               </w:rPr>
-              <w:t>v</w:t>
+              <w:t>(iii)</w:t>
             </w:r>
           </w:p>
         </w:tc>
@@ -1112,7 +1090,7 @@
                 <w:rFonts w:ascii="Times New Roman" w:hAnsi="Times New Roman"/>
                 <w:sz w:val="22"/>
               </w:rPr>
-              <w:t>vi</w:t>
+              <w:t>(iv)</w:t>
             </w:r>
           </w:p>
         </w:tc>
@@ -1586,7 +1564,7 @@
                 <w:b w:val="0"/>
                 <w:sz w:val="22"/>
               </w:rPr>
-              <w:t>3.2 TEAMMATE CONTRIBUTIONS — SARASWATHI S</w:t>
+              <w:t>3.2 TEAMMATE CONTRIBUTIONS — SARASWATHI E</w:t>
             </w:r>
           </w:p>
           <w:p>
@@ -2628,17 +2606,6 @@
     <w:p>
       <w:r>
         <w:br w:type="page"/>
-      </w:r>
-    </w:p>
-    <w:p>
-      <w:pPr>
-        <w:jc w:val="right"/>
-      </w:pPr>
-      <w:r>
-        <w:rPr>
-          <w:i/>
-        </w:rPr>
-        <w:t>vi</w:t>
       </w:r>
     </w:p>
     <w:p>
@@ -4194,9 +4161,29 @@
       </w:tr>
     </w:tbl>
     <w:p>
-      <w:r>
-        <w:br w:type="page"/>
-      </w:r>
+      <w:pPr>
+        <w:sectPr>
+          <w:headerReference w:type="default" r:id="rId10"/>
+          <w:footerReference w:type="default" r:id="rId11"/>
+          <w:pgSz w:w="12240" w:h="15840"/>
+          <w:pgMar w:top="1440" w:right="1440" w:bottom="1440" w:left="1440" w:header="720" w:footer="720" w:gutter="0"/>
+          <w:cols w:space="720"/>
+          <w:docGrid w:linePitch="360"/>
+          <w:pgBorders w:offsetFrom="page">
+            <w:top w:val="single" w:sz="8" w:space="24" w:color="auto"/>
+            <w:left w:val="single" w:sz="8" w:space="24" w:color="auto"/>
+            <w:bottom w:val="single" w:sz="8" w:space="24" w:color="auto"/>
+            <w:right w:val="single" w:sz="8" w:space="24" w:color="auto"/>
+          </w:pgBorders>
+          <w:pgBorders w:offsetFrom="page">
+            <w:top w:val="single" w:sz="8" w:space="24" w:color="auto"/>
+            <w:left w:val="single" w:sz="8" w:space="24" w:color="auto"/>
+            <w:bottom w:val="single" w:sz="8" w:space="24" w:color="auto"/>
+            <w:right w:val="single" w:sz="8" w:space="24" w:color="auto"/>
+          </w:pgBorders>
+          <w:pgNumType w:fmt="lowerRoman" w:start="1"/>
+        </w:sectPr>
+      </w:pPr>
     </w:p>
     <w:p>
       <w:pPr>
@@ -4769,7 +4756,7 @@
               <w:rPr>
                 <w:b/>
               </w:rPr>
-              <w:t>Saraswathi S</w:t>
+              <w:t>Saraswathi E</w:t>
               <w:br/>
               <w:t>Reg. No: RA2532241040036</w:t>
               <w:br/>
@@ -4888,7 +4875,7 @@
           <w:i w:val="0"/>
           <w:sz w:val="24"/>
         </w:rPr>
-        <w:t>2. Saraswathi S (Reg. No: RA2532241040036): Spearheaded glassmorphic CSS design system, responsive layout grids, SLA countdown timer components, Knowledge Base self-service deflection engine, ITAM/CAB dialogs, and QA testing.</w:t>
+        <w:t>2. Saraswathi E (Reg. No: RA2532241040036): Spearheaded glassmorphic CSS design system, responsive layout grids, SLA countdown timer components, Knowledge Base self-service deflection engine, ITAM/CAB dialogs, and QA testing.</w:t>
       </w:r>
     </w:p>
     <w:p>
@@ -4912,7 +4899,7 @@
                     <pic:cNvPicPr/>
                   </pic:nvPicPr>
                   <pic:blipFill>
-                    <a:blip r:embed="rId10"/>
+                    <a:blip r:embed="rId14"/>
                     <a:stretch>
                       <a:fillRect/>
                     </a:stretch>
@@ -5046,7 +5033,7 @@
                     <pic:cNvPicPr/>
                   </pic:nvPicPr>
                   <pic:blipFill>
-                    <a:blip r:embed="rId11"/>
+                    <a:blip r:embed="rId15"/>
                     <a:stretch>
                       <a:fillRect/>
                     </a:stretch>
@@ -5115,7 +5102,7 @@
                     <pic:cNvPicPr/>
                   </pic:nvPicPr>
                   <pic:blipFill>
-                    <a:blip r:embed="rId12"/>
+                    <a:blip r:embed="rId16"/>
                     <a:stretch>
                       <a:fillRect/>
                     </a:stretch>
@@ -5184,7 +5171,7 @@
                     <pic:cNvPicPr/>
                   </pic:nvPicPr>
                   <pic:blipFill>
-                    <a:blip r:embed="rId13"/>
+                    <a:blip r:embed="rId17"/>
                     <a:stretch>
                       <a:fillRect/>
                     </a:stretch>
@@ -5253,7 +5240,7 @@
                     <pic:cNvPicPr/>
                   </pic:nvPicPr>
                   <pic:blipFill>
-                    <a:blip r:embed="rId14"/>
+                    <a:blip r:embed="rId18"/>
                     <a:stretch>
                       <a:fillRect/>
                     </a:stretch>
@@ -5313,7 +5300,7 @@
           <w:b/>
           <w:sz w:val="28"/>
         </w:rPr>
-        <w:t>3.2 TEAMMATE CONTRIBUTIONS — SARASWATHI S</w:t>
+        <w:t>3.2 TEAMMATE CONTRIBUTIONS — SARASWATHI E</w:t>
       </w:r>
     </w:p>
     <w:p>
@@ -5328,7 +5315,7 @@
           <w:i w:val="0"/>
           <w:sz w:val="24"/>
         </w:rPr>
-        <w:t>To deliver a complete end-to-end portal, my teammate Saraswathi S (Reg. No: RA2532241040036) engineered the frontend user interface and quality assurance layers:</w:t>
+        <w:t>To deliver a complete end-to-end portal, my teammate Saraswathi E (Reg. No: RA2532241040036) engineered the frontend user interface and quality assurance layers:</w:t>
       </w:r>
     </w:p>
     <w:p>
@@ -5397,7 +5384,7 @@
                     <pic:cNvPicPr/>
                   </pic:nvPicPr>
                   <pic:blipFill>
-                    <a:blip r:embed="rId15"/>
+                    <a:blip r:embed="rId19"/>
                     <a:stretch>
                       <a:fillRect/>
                     </a:stretch>
@@ -5516,7 +5503,7 @@
                     <pic:cNvPicPr/>
                   </pic:nvPicPr>
                   <pic:blipFill>
-                    <a:blip r:embed="rId16"/>
+                    <a:blip r:embed="rId20"/>
                     <a:stretch>
                       <a:fillRect/>
                     </a:stretch>
@@ -5615,7 +5602,7 @@
                     <pic:cNvPicPr/>
                   </pic:nvPicPr>
                   <pic:blipFill>
-                    <a:blip r:embed="rId17"/>
+                    <a:blip r:embed="rId21"/>
                     <a:stretch>
                       <a:fillRect/>
                     </a:stretch>
@@ -5699,7 +5686,7 @@
                     <pic:cNvPicPr/>
                   </pic:nvPicPr>
                   <pic:blipFill>
-                    <a:blip r:embed="rId18"/>
+                    <a:blip r:embed="rId22"/>
                     <a:stretch>
                       <a:fillRect/>
                     </a:stretch>
@@ -5783,7 +5770,7 @@
                     <pic:cNvPicPr/>
                   </pic:nvPicPr>
                   <pic:blipFill>
-                    <a:blip r:embed="rId19"/>
+                    <a:blip r:embed="rId23"/>
                     <a:stretch>
                       <a:fillRect/>
                     </a:stretch>
@@ -5887,7 +5874,7 @@
                     <pic:cNvPicPr/>
                   </pic:nvPicPr>
                   <pic:blipFill>
-                    <a:blip r:embed="rId20"/>
+                    <a:blip r:embed="rId24"/>
                     <a:stretch>
                       <a:fillRect/>
                     </a:stretch>
@@ -5971,7 +5958,7 @@
                     <pic:cNvPicPr/>
                   </pic:nvPicPr>
                   <pic:blipFill>
-                    <a:blip r:embed="rId21"/>
+                    <a:blip r:embed="rId25"/>
                     <a:stretch>
                       <a:fillRect/>
                     </a:stretch>
@@ -6260,6 +6247,8 @@
       </w:r>
     </w:p>
     <w:sectPr>
+      <w:headerReference w:type="default" r:id="rId12"/>
+      <w:footerReference w:type="default" r:id="rId13"/>
       <w:pgSz w:w="12240" w:h="15840"/>
       <w:pgMar w:top="1440" w:right="1440" w:bottom="1440" w:left="1440" w:header="720" w:footer="720" w:gutter="0"/>
       <w:cols w:space="720"/>
@@ -6270,9 +6259,87 @@
         <w:bottom w:val="single" w:sz="8" w:space="24" w:color="auto"/>
         <w:right w:val="single" w:sz="8" w:space="24" w:color="auto"/>
       </w:pgBorders>
+      <w:pgBorders w:offsetFrom="page">
+        <w:top w:val="single" w:sz="8" w:space="24" w:color="auto"/>
+        <w:left w:val="single" w:sz="8" w:space="24" w:color="auto"/>
+        <w:bottom w:val="single" w:sz="8" w:space="24" w:color="auto"/>
+        <w:right w:val="single" w:sz="8" w:space="24" w:color="auto"/>
+      </w:pgBorders>
+      <w:pgNumType w:fmt="lowerRoman" w:start="1"/>
+      <w:pgBorders w:offsetFrom="page">
+        <w:top w:val="single" w:sz="8" w:space="24" w:color="auto"/>
+        <w:left w:val="single" w:sz="8" w:space="24" w:color="auto"/>
+        <w:bottom w:val="single" w:sz="8" w:space="24" w:color="auto"/>
+        <w:right w:val="single" w:sz="8" w:space="24" w:color="auto"/>
+      </w:pgBorders>
+      <w:pgNumType w:fmt="decimal" w:start="1"/>
     </w:sectPr>
   </w:body>
 </w:document>
+</file>
+
+<file path=word/footer1.xml><?xml version="1.0" encoding="utf-8"?>
+<w:ftr xmlns:m="http://schemas.openxmlformats.org/officeDocument/2006/math" xmlns:mc="http://schemas.openxmlformats.org/markup-compatibility/2006" xmlns:mo="http://schemas.microsoft.com/office/mac/office/2008/main" xmlns:mv="urn:schemas-microsoft-com:mac:vml" xmlns:o="urn:schemas-microsoft-com:office:office" xmlns:r="http://schemas.openxmlformats.org/officeDocument/2006/relationships" xmlns:v="urn:schemas-microsoft-com:vml" xmlns:w10="urn:schemas-microsoft-com:office:word" xmlns:w14="http://schemas.microsoft.com/office/word/2010/wordml" xmlns:w="http://schemas.openxmlformats.org/wordprocessingml/2006/main" xmlns:wne="http://schemas.microsoft.com/office/word/2006/wordml" xmlns:wp14="http://schemas.microsoft.com/office/word/2010/wordprocessingDrawing" xmlns:wp="http://schemas.openxmlformats.org/drawingml/2006/wordprocessingDrawing" xmlns:wpc="http://schemas.microsoft.com/office/word/2010/wordprocessingCanvas" xmlns:wpg="http://schemas.microsoft.com/office/word/2010/wordprocessingGroup" xmlns:wpi="http://schemas.microsoft.com/office/word/2010/wordprocessingInk" xmlns:wps="http://schemas.microsoft.com/office/word/2010/wordprocessingShape" mc:Ignorable="w14 wp14">
+  <w:p>
+    <w:pPr>
+      <w:pStyle w:val="Footer"/>
+    </w:pPr>
+  </w:p>
+</w:ftr>
+</file>
+
+<file path=word/footer2.xml><?xml version="1.0" encoding="utf-8"?>
+<w:ftr xmlns:m="http://schemas.openxmlformats.org/officeDocument/2006/math" xmlns:mc="http://schemas.openxmlformats.org/markup-compatibility/2006" xmlns:mo="http://schemas.microsoft.com/office/mac/office/2008/main" xmlns:mv="urn:schemas-microsoft-com:mac:vml" xmlns:o="urn:schemas-microsoft-com:office:office" xmlns:r="http://schemas.openxmlformats.org/officeDocument/2006/relationships" xmlns:v="urn:schemas-microsoft-com:vml" xmlns:w10="urn:schemas-microsoft-com:office:word" xmlns:w14="http://schemas.microsoft.com/office/word/2010/wordml" xmlns:w="http://schemas.openxmlformats.org/wordprocessingml/2006/main" xmlns:wne="http://schemas.microsoft.com/office/word/2006/wordml" xmlns:wp14="http://schemas.microsoft.com/office/word/2010/wordprocessingDrawing" xmlns:wp="http://schemas.openxmlformats.org/drawingml/2006/wordprocessingDrawing" xmlns:wpc="http://schemas.microsoft.com/office/word/2010/wordprocessingCanvas" xmlns:wpg="http://schemas.microsoft.com/office/word/2010/wordprocessingGroup" xmlns:wpi="http://schemas.microsoft.com/office/word/2010/wordprocessingInk" xmlns:wps="http://schemas.microsoft.com/office/word/2010/wordprocessingShape" mc:Ignorable="w14 wp14">
+  <w:p>
+    <w:pPr>
+      <w:pStyle w:val="Footer"/>
+      <w:jc w:val="center"/>
+    </w:pPr>
+    <w:r>
+      <w:rPr>
+        <w:rFonts w:ascii="Times New Roman" w:hAnsi="Times New Roman"/>
+        <w:sz w:val="22"/>
+      </w:rPr>
+      <w:fldChar w:fldCharType="begin"/>
+      <w:instrText xml:space="preserve"> PAGE </w:instrText>
+      <w:fldChar w:fldCharType="separate"/>
+      <w:fldChar w:fldCharType="end"/>
+    </w:r>
+  </w:p>
+</w:ftr>
+</file>
+
+<file path=word/header1.xml><?xml version="1.0" encoding="utf-8"?>
+<w:hdr xmlns:m="http://schemas.openxmlformats.org/officeDocument/2006/math" xmlns:mc="http://schemas.openxmlformats.org/markup-compatibility/2006" xmlns:mo="http://schemas.microsoft.com/office/mac/office/2008/main" xmlns:mv="urn:schemas-microsoft-com:mac:vml" xmlns:o="urn:schemas-microsoft-com:office:office" xmlns:r="http://schemas.openxmlformats.org/officeDocument/2006/relationships" xmlns:v="urn:schemas-microsoft-com:vml" xmlns:w10="urn:schemas-microsoft-com:office:word" xmlns:w14="http://schemas.microsoft.com/office/word/2010/wordml" xmlns:w="http://schemas.openxmlformats.org/wordprocessingml/2006/main" xmlns:wne="http://schemas.microsoft.com/office/word/2006/wordml" xmlns:wp14="http://schemas.microsoft.com/office/word/2010/wordprocessingDrawing" xmlns:wp="http://schemas.openxmlformats.org/drawingml/2006/wordprocessingDrawing" xmlns:wpc="http://schemas.microsoft.com/office/word/2010/wordprocessingCanvas" xmlns:wpg="http://schemas.microsoft.com/office/word/2010/wordprocessingGroup" xmlns:wpi="http://schemas.microsoft.com/office/word/2010/wordprocessingInk" xmlns:wps="http://schemas.microsoft.com/office/word/2010/wordprocessingShape" mc:Ignorable="w14 wp14">
+  <w:p>
+    <w:pPr>
+      <w:pStyle w:val="Header"/>
+      <w:jc w:val="right"/>
+    </w:pPr>
+    <w:r>
+      <w:rPr>
+        <w:rFonts w:ascii="Times New Roman" w:hAnsi="Times New Roman"/>
+        <w:i/>
+        <w:sz w:val="22"/>
+      </w:rPr>
+      <w:fldChar w:fldCharType="begin"/>
+      <w:instrText xml:space="preserve"> PAGE </w:instrText>
+      <w:fldChar w:fldCharType="separate"/>
+      <w:fldChar w:fldCharType="end"/>
+    </w:r>
+  </w:p>
+</w:hdr>
+</file>
+
+<file path=word/header2.xml><?xml version="1.0" encoding="utf-8"?>
+<w:hdr xmlns:m="http://schemas.openxmlformats.org/officeDocument/2006/math" xmlns:mc="http://schemas.openxmlformats.org/markup-compatibility/2006" xmlns:mo="http://schemas.microsoft.com/office/mac/office/2008/main" xmlns:mv="urn:schemas-microsoft-com:mac:vml" xmlns:o="urn:schemas-microsoft-com:office:office" xmlns:r="http://schemas.openxmlformats.org/officeDocument/2006/relationships" xmlns:v="urn:schemas-microsoft-com:vml" xmlns:w10="urn:schemas-microsoft-com:office:word" xmlns:w14="http://schemas.microsoft.com/office/word/2010/wordml" xmlns:w="http://schemas.openxmlformats.org/wordprocessingml/2006/main" xmlns:wne="http://schemas.microsoft.com/office/word/2006/wordml" xmlns:wp14="http://schemas.microsoft.com/office/word/2010/wordprocessingDrawing" xmlns:wp="http://schemas.openxmlformats.org/drawingml/2006/wordprocessingDrawing" xmlns:wpc="http://schemas.microsoft.com/office/word/2010/wordprocessingCanvas" xmlns:wpg="http://schemas.microsoft.com/office/word/2010/wordprocessingGroup" xmlns:wpi="http://schemas.microsoft.com/office/word/2010/wordprocessingInk" xmlns:wps="http://schemas.microsoft.com/office/word/2010/wordprocessingShape" mc:Ignorable="w14 wp14">
+  <w:p>
+    <w:pPr>
+      <w:pStyle w:val="Header"/>
+    </w:pPr>
+    <w:r/>
+  </w:p>
+</w:hdr>
 </file>
 
 <file path=word/numbering.xml><?xml version="1.0" encoding="utf-8"?>

</xml_diff>